<commit_message>
Start wrking on introduction of Rmarkdown
</commit_message>
<xml_diff>
--- a/mydocuments/Revision3/Sikolia_Thesis_Revision_3.docx
+++ b/mydocuments/Revision3/Sikolia_Thesis_Revision_3.docx
@@ -157,7 +157,7 @@
           <w:sz w:val="48"/>
           <w:szCs w:val="48"/>
         </w:rPr>
-        <w:t>Facial Recognition in Kenya Using Deep Learning Techniques</w:t>
+        <w:t>Examining The Effect of Padding on Facial Recognition Using Convolution Neural Networks</w:t>
       </w:r>
     </w:p>
     <w:p>
@@ -190,21 +190,7 @@
         <w:rPr>
           <w:rFonts w:ascii="Times New Roman" w:hAnsi="Times New Roman" w:cs="Times New Roman"/>
         </w:rPr>
-        <w:t xml:space="preserve">Wycliffe </w:t>
-      </w:r>
-      <w:proofErr w:type="spellStart"/>
-      <w:r>
-        <w:rPr>
-          <w:rFonts w:ascii="Times New Roman" w:hAnsi="Times New Roman" w:cs="Times New Roman"/>
-        </w:rPr>
-        <w:t>Atswenje</w:t>
-      </w:r>
-      <w:proofErr w:type="spellEnd"/>
-      <w:r>
-        <w:rPr>
-          <w:rFonts w:ascii="Times New Roman" w:hAnsi="Times New Roman" w:cs="Times New Roman"/>
-        </w:rPr>
-        <w:t xml:space="preserve"> Sikolia</w:t>
+        <w:t>Wycliffe Atswenje Sikolia</w:t>
       </w:r>
     </w:p>
     <w:p>
@@ -237,7 +223,19 @@
         <w:rPr>
           <w:rFonts w:ascii="Times New Roman" w:hAnsi="Times New Roman" w:cs="Times New Roman"/>
         </w:rPr>
-        <w:t>A research proposal submitted in partial fulfillment of the requirements for the award of a Post Graduate Diploma in Applied Statistics of Jomo Kenyatta University of Agriculture and Technology.</w:t>
+        <w:t xml:space="preserve">A </w:t>
+      </w:r>
+      <w:r>
+        <w:rPr>
+          <w:rFonts w:ascii="Times New Roman" w:hAnsi="Times New Roman" w:cs="Times New Roman"/>
+        </w:rPr>
+        <w:t xml:space="preserve">Research Proposal Submitted in Partial Fulfillment of The Requirements for The Award of a </w:t>
+      </w:r>
+      <w:r>
+        <w:rPr>
+          <w:rFonts w:ascii="Times New Roman" w:hAnsi="Times New Roman" w:cs="Times New Roman"/>
+        </w:rPr>
+        <w:t>Post Graduate Diploma in Applied Statistics of Jomo Kenyatta University of Agriculture and Technology.</w:t>
       </w:r>
     </w:p>
     <w:p>
@@ -290,7 +288,7 @@
           <w:rFonts w:ascii="Times New Roman" w:hAnsi="Times New Roman" w:cs="Times New Roman"/>
         </w:rPr>
       </w:pPr>
-      <w:bookmarkStart w:id="0" w:name="_Toc177409469"/>
+      <w:bookmarkStart w:id="0" w:name="_Toc178527527"/>
       <w:r>
         <w:rPr>
           <w:rFonts w:ascii="Times New Roman" w:hAnsi="Times New Roman" w:cs="Times New Roman"/>
@@ -347,21 +345,7 @@
         <w:rPr>
           <w:rFonts w:ascii="Times New Roman" w:hAnsi="Times New Roman" w:cs="Times New Roman"/>
         </w:rPr>
-        <w:t xml:space="preserve">Wycliffe </w:t>
-      </w:r>
-      <w:proofErr w:type="spellStart"/>
-      <w:r>
-        <w:rPr>
-          <w:rFonts w:ascii="Times New Roman" w:hAnsi="Times New Roman" w:cs="Times New Roman"/>
-        </w:rPr>
-        <w:t>Atswenje</w:t>
-      </w:r>
-      <w:proofErr w:type="spellEnd"/>
-      <w:r>
-        <w:rPr>
-          <w:rFonts w:ascii="Times New Roman" w:hAnsi="Times New Roman" w:cs="Times New Roman"/>
-        </w:rPr>
-        <w:t xml:space="preserve"> Sikolia</w:t>
+        <w:t>Wycliffe Atswenje Sikolia</w:t>
       </w:r>
     </w:p>
     <w:p>
@@ -598,7 +582,7 @@
           <w:rFonts w:ascii="Times New Roman" w:hAnsi="Times New Roman" w:cs="Times New Roman"/>
         </w:rPr>
       </w:pPr>
-      <w:bookmarkStart w:id="1" w:name="_Toc177409470"/>
+      <w:bookmarkStart w:id="1" w:name="_Toc178527528"/>
       <w:r>
         <w:rPr>
           <w:rFonts w:ascii="Times New Roman" w:hAnsi="Times New Roman" w:cs="Times New Roman"/>
@@ -748,7 +732,7 @@
           <w:rFonts w:ascii="Times New Roman" w:hAnsi="Times New Roman" w:cs="Times New Roman"/>
         </w:rPr>
       </w:pPr>
-      <w:bookmarkStart w:id="2" w:name="_Toc177409471"/>
+      <w:bookmarkStart w:id="2" w:name="_Toc178527529"/>
       <w:r>
         <w:rPr>
           <w:rFonts w:ascii="Times New Roman" w:hAnsi="Times New Roman" w:cs="Times New Roman"/>
@@ -855,7 +839,7 @@
           <w:rFonts w:ascii="Times New Roman" w:hAnsi="Times New Roman" w:cs="Times New Roman"/>
         </w:rPr>
       </w:pPr>
-      <w:bookmarkStart w:id="3" w:name="_Toc177409472"/>
+      <w:bookmarkStart w:id="3" w:name="_Toc178527530"/>
       <w:r>
         <w:rPr>
           <w:rFonts w:ascii="Times New Roman" w:hAnsi="Times New Roman" w:cs="Times New Roman"/>
@@ -1071,7 +1055,7 @@
           <w:r>
             <w:fldChar w:fldCharType="separate"/>
           </w:r>
-          <w:hyperlink w:anchor="_Toc177409469" w:history="1">
+          <w:hyperlink w:anchor="_Toc178527527" w:history="1">
             <w:r>
               <w:rPr>
                 <w:rStyle w:val="Hyperlink"/>
@@ -1096,7 +1080,7 @@
               <w:rPr>
                 <w:noProof/>
               </w:rPr>
-              <w:instrText xml:space="preserve"> PAGEREF _Toc177409469 \h </w:instrText>
+              <w:instrText xml:space="preserve"> PAGEREF _Toc178527527 \h </w:instrText>
             </w:r>
             <w:r>
               <w:rPr>
@@ -1135,7 +1119,7 @@
               <w14:ligatures w14:val="standardContextual"/>
             </w:rPr>
           </w:pPr>
-          <w:hyperlink w:anchor="_Toc177409470" w:history="1">
+          <w:hyperlink w:anchor="_Toc178527528" w:history="1">
             <w:r>
               <w:rPr>
                 <w:rStyle w:val="Hyperlink"/>
@@ -1160,7 +1144,7 @@
               <w:rPr>
                 <w:noProof/>
               </w:rPr>
-              <w:instrText xml:space="preserve"> PAGEREF _Toc177409470 \h </w:instrText>
+              <w:instrText xml:space="preserve"> PAGEREF _Toc178527528 \h </w:instrText>
             </w:r>
             <w:r>
               <w:rPr>
@@ -1199,7 +1183,7 @@
               <w14:ligatures w14:val="standardContextual"/>
             </w:rPr>
           </w:pPr>
-          <w:hyperlink w:anchor="_Toc177409471" w:history="1">
+          <w:hyperlink w:anchor="_Toc178527529" w:history="1">
             <w:r>
               <w:rPr>
                 <w:rStyle w:val="Hyperlink"/>
@@ -1224,7 +1208,7 @@
               <w:rPr>
                 <w:noProof/>
               </w:rPr>
-              <w:instrText xml:space="preserve"> PAGEREF _Toc177409471 \h </w:instrText>
+              <w:instrText xml:space="preserve"> PAGEREF _Toc178527529 \h </w:instrText>
             </w:r>
             <w:r>
               <w:rPr>
@@ -1263,7 +1247,7 @@
               <w14:ligatures w14:val="standardContextual"/>
             </w:rPr>
           </w:pPr>
-          <w:hyperlink w:anchor="_Toc177409472" w:history="1">
+          <w:hyperlink w:anchor="_Toc178527530" w:history="1">
             <w:r>
               <w:rPr>
                 <w:rStyle w:val="Hyperlink"/>
@@ -1288,7 +1272,7 @@
               <w:rPr>
                 <w:noProof/>
               </w:rPr>
-              <w:instrText xml:space="preserve"> PAGEREF _Toc177409472 \h </w:instrText>
+              <w:instrText xml:space="preserve"> PAGEREF _Toc178527530 \h </w:instrText>
             </w:r>
             <w:r>
               <w:rPr>
@@ -1327,7 +1311,7 @@
               <w14:ligatures w14:val="standardContextual"/>
             </w:rPr>
           </w:pPr>
-          <w:hyperlink w:anchor="_Toc177409473" w:history="1">
+          <w:hyperlink w:anchor="_Toc178527531" w:history="1">
             <w:r>
               <w:rPr>
                 <w:rStyle w:val="Hyperlink"/>
@@ -1352,7 +1336,7 @@
               <w:rPr>
                 <w:noProof/>
               </w:rPr>
-              <w:instrText xml:space="preserve"> PAGEREF _Toc177409473 \h </w:instrText>
+              <w:instrText xml:space="preserve"> PAGEREF _Toc178527531 \h </w:instrText>
             </w:r>
             <w:r>
               <w:rPr>
@@ -1391,7 +1375,7 @@
               <w14:ligatures w14:val="standardContextual"/>
             </w:rPr>
           </w:pPr>
-          <w:hyperlink w:anchor="_Toc177409474" w:history="1">
+          <w:hyperlink w:anchor="_Toc178527532" w:history="1">
             <w:r>
               <w:rPr>
                 <w:rStyle w:val="Hyperlink"/>
@@ -1416,7 +1400,7 @@
               <w:rPr>
                 <w:noProof/>
               </w:rPr>
-              <w:instrText xml:space="preserve"> PAGEREF _Toc177409474 \h </w:instrText>
+              <w:instrText xml:space="preserve"> PAGEREF _Toc178527532 \h </w:instrText>
             </w:r>
             <w:r>
               <w:rPr>
@@ -1455,7 +1439,7 @@
               <w14:ligatures w14:val="standardContextual"/>
             </w:rPr>
           </w:pPr>
-          <w:hyperlink w:anchor="_Toc177409475" w:history="1">
+          <w:hyperlink w:anchor="_Toc178527533" w:history="1">
             <w:r>
               <w:rPr>
                 <w:rStyle w:val="Hyperlink"/>
@@ -1479,7 +1463,7 @@
               <w:rPr>
                 <w:noProof/>
               </w:rPr>
-              <w:instrText xml:space="preserve"> PAGEREF _Toc177409475 \h </w:instrText>
+              <w:instrText xml:space="preserve"> PAGEREF _Toc178527533 \h </w:instrText>
             </w:r>
             <w:r>
               <w:rPr>
@@ -1521,7 +1505,7 @@
               <w14:ligatures w14:val="standardContextual"/>
             </w:rPr>
           </w:pPr>
-          <w:hyperlink w:anchor="_Toc177409476" w:history="1">
+          <w:hyperlink w:anchor="_Toc178527534" w:history="1">
             <w:r>
               <w:rPr>
                 <w:rStyle w:val="Hyperlink"/>
@@ -1563,7 +1547,70 @@
               <w:rPr>
                 <w:noProof/>
               </w:rPr>
-              <w:instrText xml:space="preserve"> PAGEREF _Toc177409476 \h </w:instrText>
+              <w:instrText xml:space="preserve"> PAGEREF _Toc178527534 \h </w:instrText>
+            </w:r>
+            <w:r>
+              <w:rPr>
+                <w:noProof/>
+              </w:rPr>
+            </w:r>
+            <w:r>
+              <w:rPr>
+                <w:noProof/>
+              </w:rPr>
+              <w:fldChar w:fldCharType="separate"/>
+            </w:r>
+            <w:r>
+              <w:rPr>
+                <w:noProof/>
+              </w:rPr>
+              <w:t>1</w:t>
+            </w:r>
+            <w:r>
+              <w:rPr>
+                <w:noProof/>
+              </w:rPr>
+              <w:fldChar w:fldCharType="end"/>
+            </w:r>
+          </w:hyperlink>
+        </w:p>
+        <w:p>
+          <w:pPr>
+            <w:pStyle w:val="TOC1"/>
+            <w:rPr>
+              <w:rFonts w:asciiTheme="minorHAnsi" w:eastAsiaTheme="minorEastAsia" w:hAnsiTheme="minorHAnsi" w:cstheme="minorBidi"/>
+              <w:noProof/>
+              <w:sz w:val="22"/>
+              <w:szCs w:val="22"/>
+              <w:lang w:val="en-KE" w:eastAsia="en-KE" w:bidi="ar-SA"/>
+              <w14:ligatures w14:val="standardContextual"/>
+            </w:rPr>
+          </w:pPr>
+          <w:hyperlink w:anchor="_Toc178527535" w:history="1">
+            <w:r>
+              <w:rPr>
+                <w:rStyle w:val="Hyperlink"/>
+                <w:noProof/>
+              </w:rPr>
+              <w:t>Introduction</w:t>
+            </w:r>
+            <w:r>
+              <w:rPr>
+                <w:noProof/>
+              </w:rPr>
+              <w:tab/>
+            </w:r>
+            <w:r>
+              <w:rPr>
+                <w:noProof/>
+              </w:rPr>
+              <w:fldChar w:fldCharType="begin"/>
+            </w:r>
+            <w:r>
+              <w:rPr>
+                <w:noProof/>
+              </w:rPr>
+              <w:instrText xml:space="preserve"> PAGEREF _Toc178527535 \h </w:instrText>
             </w:r>
             <w:r>
               <w:rPr>
@@ -1606,7 +1653,7 @@
               <w14:ligatures w14:val="standardContextual"/>
             </w:rPr>
           </w:pPr>
-          <w:hyperlink w:anchor="_Toc177409477" w:history="1">
+          <w:hyperlink w:anchor="_Toc178527536" w:history="1">
             <w:r>
               <w:rPr>
                 <w:rStyle w:val="Hyperlink"/>
@@ -1650,7 +1697,7 @@
               <w:rPr>
                 <w:noProof/>
               </w:rPr>
-              <w:instrText xml:space="preserve"> PAGEREF _Toc177409477 \h </w:instrText>
+              <w:instrText xml:space="preserve"> PAGEREF _Toc178527536 \h </w:instrText>
             </w:r>
             <w:r>
               <w:rPr>
@@ -1693,7 +1740,7 @@
               <w14:ligatures w14:val="standardContextual"/>
             </w:rPr>
           </w:pPr>
-          <w:hyperlink w:anchor="_Toc177409478" w:history="1">
+          <w:hyperlink w:anchor="_Toc178527537" w:history="1">
             <w:r>
               <w:rPr>
                 <w:rStyle w:val="Hyperlink"/>
@@ -1737,7 +1784,7 @@
               <w:rPr>
                 <w:noProof/>
               </w:rPr>
-              <w:instrText xml:space="preserve"> PAGEREF _Toc177409478 \h </w:instrText>
+              <w:instrText xml:space="preserve"> PAGEREF _Toc178527537 \h </w:instrText>
             </w:r>
             <w:r>
               <w:rPr>
@@ -1780,7 +1827,7 @@
               <w14:ligatures w14:val="standardContextual"/>
             </w:rPr>
           </w:pPr>
-          <w:hyperlink w:anchor="_Toc177409479" w:history="1">
+          <w:hyperlink w:anchor="_Toc178527538" w:history="1">
             <w:r>
               <w:rPr>
                 <w:rStyle w:val="Hyperlink"/>
@@ -1824,7 +1871,7 @@
               <w:rPr>
                 <w:noProof/>
               </w:rPr>
-              <w:instrText xml:space="preserve"> PAGEREF _Toc177409479 \h </w:instrText>
+              <w:instrText xml:space="preserve"> PAGEREF _Toc178527538 \h </w:instrText>
             </w:r>
             <w:r>
               <w:rPr>
@@ -1867,7 +1914,7 @@
               <w14:ligatures w14:val="standardContextual"/>
             </w:rPr>
           </w:pPr>
-          <w:hyperlink w:anchor="_Toc177409480" w:history="1">
+          <w:hyperlink w:anchor="_Toc178527539" w:history="1">
             <w:r>
               <w:rPr>
                 <w:rStyle w:val="Hyperlink"/>
@@ -1910,7 +1957,7 @@
               <w:rPr>
                 <w:noProof/>
               </w:rPr>
-              <w:instrText xml:space="preserve"> PAGEREF _Toc177409480 \h </w:instrText>
+              <w:instrText xml:space="preserve"> PAGEREF _Toc178527539 \h </w:instrText>
             </w:r>
             <w:r>
               <w:rPr>
@@ -1953,7 +2000,7 @@
               <w14:ligatures w14:val="standardContextual"/>
             </w:rPr>
           </w:pPr>
-          <w:hyperlink w:anchor="_Toc177409481" w:history="1">
+          <w:hyperlink w:anchor="_Toc178527540" w:history="1">
             <w:r>
               <w:rPr>
                 <w:rStyle w:val="Hyperlink"/>
@@ -1997,7 +2044,7 @@
               <w:rPr>
                 <w:noProof/>
               </w:rPr>
-              <w:instrText xml:space="preserve"> PAGEREF _Toc177409481 \h </w:instrText>
+              <w:instrText xml:space="preserve"> PAGEREF _Toc178527540 \h </w:instrText>
             </w:r>
             <w:r>
               <w:rPr>
@@ -2040,7 +2087,7 @@
               <w14:ligatures w14:val="standardContextual"/>
             </w:rPr>
           </w:pPr>
-          <w:hyperlink w:anchor="_Toc177409482" w:history="1">
+          <w:hyperlink w:anchor="_Toc178527541" w:history="1">
             <w:r>
               <w:rPr>
                 <w:rStyle w:val="Hyperlink"/>
@@ -2084,7 +2131,7 @@
               <w:rPr>
                 <w:noProof/>
               </w:rPr>
-              <w:instrText xml:space="preserve"> PAGEREF _Toc177409482 \h </w:instrText>
+              <w:instrText xml:space="preserve"> PAGEREF _Toc178527541 \h </w:instrText>
             </w:r>
             <w:r>
               <w:rPr>
@@ -2126,7 +2173,7 @@
               <w14:ligatures w14:val="standardContextual"/>
             </w:rPr>
           </w:pPr>
-          <w:hyperlink w:anchor="_Toc177409483" w:history="1">
+          <w:hyperlink w:anchor="_Toc178527542" w:history="1">
             <w:r>
               <w:rPr>
                 <w:rStyle w:val="Hyperlink"/>
@@ -2170,7 +2217,70 @@
               <w:rPr>
                 <w:noProof/>
               </w:rPr>
-              <w:instrText xml:space="preserve"> PAGEREF _Toc177409483 \h </w:instrText>
+              <w:instrText xml:space="preserve"> PAGEREF _Toc178527542 \h </w:instrText>
+            </w:r>
+            <w:r>
+              <w:rPr>
+                <w:noProof/>
+              </w:rPr>
+            </w:r>
+            <w:r>
+              <w:rPr>
+                <w:noProof/>
+              </w:rPr>
+              <w:fldChar w:fldCharType="separate"/>
+            </w:r>
+            <w:r>
+              <w:rPr>
+                <w:noProof/>
+              </w:rPr>
+              <w:t>5</w:t>
+            </w:r>
+            <w:r>
+              <w:rPr>
+                <w:noProof/>
+              </w:rPr>
+              <w:fldChar w:fldCharType="end"/>
+            </w:r>
+          </w:hyperlink>
+        </w:p>
+        <w:p>
+          <w:pPr>
+            <w:pStyle w:val="TOC1"/>
+            <w:rPr>
+              <w:rFonts w:asciiTheme="minorHAnsi" w:eastAsiaTheme="minorEastAsia" w:hAnsiTheme="minorHAnsi" w:cstheme="minorBidi"/>
+              <w:noProof/>
+              <w:sz w:val="22"/>
+              <w:szCs w:val="22"/>
+              <w:lang w:val="en-KE" w:eastAsia="en-KE" w:bidi="ar-SA"/>
+              <w14:ligatures w14:val="standardContextual"/>
+            </w:rPr>
+          </w:pPr>
+          <w:hyperlink w:anchor="_Toc178527543" w:history="1">
+            <w:r>
+              <w:rPr>
+                <w:rStyle w:val="Hyperlink"/>
+                <w:noProof/>
+              </w:rPr>
+              <w:t>Literature Review</w:t>
+            </w:r>
+            <w:r>
+              <w:rPr>
+                <w:noProof/>
+              </w:rPr>
+              <w:tab/>
+            </w:r>
+            <w:r>
+              <w:rPr>
+                <w:noProof/>
+              </w:rPr>
+              <w:fldChar w:fldCharType="begin"/>
+            </w:r>
+            <w:r>
+              <w:rPr>
+                <w:noProof/>
+              </w:rPr>
+              <w:instrText xml:space="preserve"> PAGEREF _Toc178527543 \h </w:instrText>
             </w:r>
             <w:r>
               <w:rPr>
@@ -2213,7 +2323,7 @@
               <w14:ligatures w14:val="standardContextual"/>
             </w:rPr>
           </w:pPr>
-          <w:hyperlink w:anchor="_Toc177409484" w:history="1">
+          <w:hyperlink w:anchor="_Toc178527544" w:history="1">
             <w:r>
               <w:rPr>
                 <w:rStyle w:val="Hyperlink"/>
@@ -2255,7 +2365,7 @@
               <w:rPr>
                 <w:noProof/>
               </w:rPr>
-              <w:instrText xml:space="preserve"> PAGEREF _Toc177409484 \h </w:instrText>
+              <w:instrText xml:space="preserve"> PAGEREF _Toc178527544 \h </w:instrText>
             </w:r>
             <w:r>
               <w:rPr>
@@ -2298,7 +2408,7 @@
               <w14:ligatures w14:val="standardContextual"/>
             </w:rPr>
           </w:pPr>
-          <w:hyperlink w:anchor="_Toc177409485" w:history="1">
+          <w:hyperlink w:anchor="_Toc178527545" w:history="1">
             <w:r>
               <w:rPr>
                 <w:rStyle w:val="Hyperlink"/>
@@ -2340,7 +2450,7 @@
               <w:rPr>
                 <w:noProof/>
               </w:rPr>
-              <w:instrText xml:space="preserve"> PAGEREF _Toc177409485 \h </w:instrText>
+              <w:instrText xml:space="preserve"> PAGEREF _Toc178527545 \h </w:instrText>
             </w:r>
             <w:r>
               <w:rPr>
@@ -2383,7 +2493,7 @@
               <w14:ligatures w14:val="standardContextual"/>
             </w:rPr>
           </w:pPr>
-          <w:hyperlink w:anchor="_Toc177409486" w:history="1">
+          <w:hyperlink w:anchor="_Toc178527546" w:history="1">
             <w:r>
               <w:rPr>
                 <w:rStyle w:val="Hyperlink"/>
@@ -2425,7 +2535,7 @@
               <w:rPr>
                 <w:noProof/>
               </w:rPr>
-              <w:instrText xml:space="preserve"> PAGEREF _Toc177409486 \h </w:instrText>
+              <w:instrText xml:space="preserve"> PAGEREF _Toc178527546 \h </w:instrText>
             </w:r>
             <w:r>
               <w:rPr>
@@ -2468,7 +2578,7 @@
               <w14:ligatures w14:val="standardContextual"/>
             </w:rPr>
           </w:pPr>
-          <w:hyperlink w:anchor="_Toc177409487" w:history="1">
+          <w:hyperlink w:anchor="_Toc178527547" w:history="1">
             <w:r>
               <w:rPr>
                 <w:rStyle w:val="Hyperlink"/>
@@ -2510,7 +2620,7 @@
               <w:rPr>
                 <w:noProof/>
               </w:rPr>
-              <w:instrText xml:space="preserve"> PAGEREF _Toc177409487 \h </w:instrText>
+              <w:instrText xml:space="preserve"> PAGEREF _Toc178527547 \h </w:instrText>
             </w:r>
             <w:r>
               <w:rPr>
@@ -2553,7 +2663,7 @@
               <w14:ligatures w14:val="standardContextual"/>
             </w:rPr>
           </w:pPr>
-          <w:hyperlink w:anchor="_Toc177409488" w:history="1">
+          <w:hyperlink w:anchor="_Toc178527548" w:history="1">
             <w:r>
               <w:rPr>
                 <w:rStyle w:val="Hyperlink"/>
@@ -2595,7 +2705,7 @@
               <w:rPr>
                 <w:noProof/>
               </w:rPr>
-              <w:instrText xml:space="preserve"> PAGEREF _Toc177409488 \h </w:instrText>
+              <w:instrText xml:space="preserve"> PAGEREF _Toc178527548 \h </w:instrText>
             </w:r>
             <w:r>
               <w:rPr>
@@ -2613,346 +2723,6 @@
                 <w:noProof/>
               </w:rPr>
               <w:t>7</w:t>
-            </w:r>
-            <w:r>
-              <w:rPr>
-                <w:noProof/>
-              </w:rPr>
-              <w:fldChar w:fldCharType="end"/>
-            </w:r>
-          </w:hyperlink>
-        </w:p>
-        <w:p>
-          <w:pPr>
-            <w:pStyle w:val="TOC5"/>
-            <w:tabs>
-              <w:tab w:val="left" w:pos="2020"/>
-              <w:tab w:val="right" w:pos="9628"/>
-            </w:tabs>
-            <w:rPr>
-              <w:rFonts w:asciiTheme="minorHAnsi" w:eastAsiaTheme="minorEastAsia" w:hAnsiTheme="minorHAnsi" w:cstheme="minorBidi"/>
-              <w:noProof/>
-              <w:sz w:val="22"/>
-              <w:szCs w:val="22"/>
-              <w:lang w:val="en-KE" w:eastAsia="en-KE" w:bidi="ar-SA"/>
-              <w14:ligatures w14:val="standardContextual"/>
-            </w:rPr>
-          </w:pPr>
-          <w:hyperlink w:anchor="_Toc177409489" w:history="1">
-            <w:r>
-              <w:rPr>
-                <w:rStyle w:val="Hyperlink"/>
-                <w:noProof/>
-              </w:rPr>
-              <w:t>2.2.1.2.1</w:t>
-            </w:r>
-            <w:r>
-              <w:rPr>
-                <w:rFonts w:asciiTheme="minorHAnsi" w:eastAsiaTheme="minorEastAsia" w:hAnsiTheme="minorHAnsi" w:cstheme="minorBidi"/>
-                <w:noProof/>
-                <w:sz w:val="22"/>
-                <w:szCs w:val="22"/>
-                <w:lang w:val="en-KE" w:eastAsia="en-KE" w:bidi="ar-SA"/>
-                <w14:ligatures w14:val="standardContextual"/>
-              </w:rPr>
-              <w:tab/>
-            </w:r>
-            <w:r>
-              <w:rPr>
-                <w:rStyle w:val="Hyperlink"/>
-                <w:noProof/>
-              </w:rPr>
-              <w:t>Knowledge Based Methods of Facial Detection</w:t>
-            </w:r>
-            <w:r>
-              <w:rPr>
-                <w:noProof/>
-              </w:rPr>
-              <w:tab/>
-            </w:r>
-            <w:r>
-              <w:rPr>
-                <w:noProof/>
-              </w:rPr>
-              <w:fldChar w:fldCharType="begin"/>
-            </w:r>
-            <w:r>
-              <w:rPr>
-                <w:noProof/>
-              </w:rPr>
-              <w:instrText xml:space="preserve"> PAGEREF _Toc177409489 \h </w:instrText>
-            </w:r>
-            <w:r>
-              <w:rPr>
-                <w:noProof/>
-              </w:rPr>
-            </w:r>
-            <w:r>
-              <w:rPr>
-                <w:noProof/>
-              </w:rPr>
-              <w:fldChar w:fldCharType="separate"/>
-            </w:r>
-            <w:r>
-              <w:rPr>
-                <w:noProof/>
-              </w:rPr>
-              <w:t>7</w:t>
-            </w:r>
-            <w:r>
-              <w:rPr>
-                <w:noProof/>
-              </w:rPr>
-              <w:fldChar w:fldCharType="end"/>
-            </w:r>
-          </w:hyperlink>
-        </w:p>
-        <w:p>
-          <w:pPr>
-            <w:pStyle w:val="TOC5"/>
-            <w:tabs>
-              <w:tab w:val="left" w:pos="2020"/>
-              <w:tab w:val="right" w:pos="9628"/>
-            </w:tabs>
-            <w:rPr>
-              <w:rFonts w:asciiTheme="minorHAnsi" w:eastAsiaTheme="minorEastAsia" w:hAnsiTheme="minorHAnsi" w:cstheme="minorBidi"/>
-              <w:noProof/>
-              <w:sz w:val="22"/>
-              <w:szCs w:val="22"/>
-              <w:lang w:val="en-KE" w:eastAsia="en-KE" w:bidi="ar-SA"/>
-              <w14:ligatures w14:val="standardContextual"/>
-            </w:rPr>
-          </w:pPr>
-          <w:hyperlink w:anchor="_Toc177409490" w:history="1">
-            <w:r>
-              <w:rPr>
-                <w:rStyle w:val="Hyperlink"/>
-                <w:noProof/>
-              </w:rPr>
-              <w:t>2.2.1.2.2</w:t>
-            </w:r>
-            <w:r>
-              <w:rPr>
-                <w:rFonts w:asciiTheme="minorHAnsi" w:eastAsiaTheme="minorEastAsia" w:hAnsiTheme="minorHAnsi" w:cstheme="minorBidi"/>
-                <w:noProof/>
-                <w:sz w:val="22"/>
-                <w:szCs w:val="22"/>
-                <w:lang w:val="en-KE" w:eastAsia="en-KE" w:bidi="ar-SA"/>
-                <w14:ligatures w14:val="standardContextual"/>
-              </w:rPr>
-              <w:tab/>
-            </w:r>
-            <w:r>
-              <w:rPr>
-                <w:rStyle w:val="Hyperlink"/>
-                <w:noProof/>
-              </w:rPr>
-              <w:t>The Feature Invariant Approach of Face Detection</w:t>
-            </w:r>
-            <w:r>
-              <w:rPr>
-                <w:noProof/>
-              </w:rPr>
-              <w:tab/>
-            </w:r>
-            <w:r>
-              <w:rPr>
-                <w:noProof/>
-              </w:rPr>
-              <w:fldChar w:fldCharType="begin"/>
-            </w:r>
-            <w:r>
-              <w:rPr>
-                <w:noProof/>
-              </w:rPr>
-              <w:instrText xml:space="preserve"> PAGEREF _Toc177409490 \h </w:instrText>
-            </w:r>
-            <w:r>
-              <w:rPr>
-                <w:noProof/>
-              </w:rPr>
-            </w:r>
-            <w:r>
-              <w:rPr>
-                <w:noProof/>
-              </w:rPr>
-              <w:fldChar w:fldCharType="separate"/>
-            </w:r>
-            <w:r>
-              <w:rPr>
-                <w:noProof/>
-              </w:rPr>
-              <w:t>8</w:t>
-            </w:r>
-            <w:r>
-              <w:rPr>
-                <w:noProof/>
-              </w:rPr>
-              <w:fldChar w:fldCharType="end"/>
-            </w:r>
-          </w:hyperlink>
-        </w:p>
-        <w:p>
-          <w:pPr>
-            <w:pStyle w:val="TOC5"/>
-            <w:tabs>
-              <w:tab w:val="left" w:pos="2020"/>
-              <w:tab w:val="right" w:pos="9628"/>
-            </w:tabs>
-            <w:rPr>
-              <w:rFonts w:asciiTheme="minorHAnsi" w:eastAsiaTheme="minorEastAsia" w:hAnsiTheme="minorHAnsi" w:cstheme="minorBidi"/>
-              <w:noProof/>
-              <w:sz w:val="22"/>
-              <w:szCs w:val="22"/>
-              <w:lang w:val="en-KE" w:eastAsia="en-KE" w:bidi="ar-SA"/>
-              <w14:ligatures w14:val="standardContextual"/>
-            </w:rPr>
-          </w:pPr>
-          <w:hyperlink w:anchor="_Toc177409491" w:history="1">
-            <w:r>
-              <w:rPr>
-                <w:rStyle w:val="Hyperlink"/>
-                <w:noProof/>
-              </w:rPr>
-              <w:t>2.2.1.2.3</w:t>
-            </w:r>
-            <w:r>
-              <w:rPr>
-                <w:rFonts w:asciiTheme="minorHAnsi" w:eastAsiaTheme="minorEastAsia" w:hAnsiTheme="minorHAnsi" w:cstheme="minorBidi"/>
-                <w:noProof/>
-                <w:sz w:val="22"/>
-                <w:szCs w:val="22"/>
-                <w:lang w:val="en-KE" w:eastAsia="en-KE" w:bidi="ar-SA"/>
-                <w14:ligatures w14:val="standardContextual"/>
-              </w:rPr>
-              <w:tab/>
-            </w:r>
-            <w:r>
-              <w:rPr>
-                <w:rStyle w:val="Hyperlink"/>
-                <w:noProof/>
-              </w:rPr>
-              <w:t>The Template Based Approach of Face Detection</w:t>
-            </w:r>
-            <w:r>
-              <w:rPr>
-                <w:noProof/>
-              </w:rPr>
-              <w:tab/>
-            </w:r>
-            <w:r>
-              <w:rPr>
-                <w:noProof/>
-              </w:rPr>
-              <w:fldChar w:fldCharType="begin"/>
-            </w:r>
-            <w:r>
-              <w:rPr>
-                <w:noProof/>
-              </w:rPr>
-              <w:instrText xml:space="preserve"> PAGEREF _Toc177409491 \h </w:instrText>
-            </w:r>
-            <w:r>
-              <w:rPr>
-                <w:noProof/>
-              </w:rPr>
-            </w:r>
-            <w:r>
-              <w:rPr>
-                <w:noProof/>
-              </w:rPr>
-              <w:fldChar w:fldCharType="separate"/>
-            </w:r>
-            <w:r>
-              <w:rPr>
-                <w:noProof/>
-              </w:rPr>
-              <w:t>8</w:t>
-            </w:r>
-            <w:r>
-              <w:rPr>
-                <w:noProof/>
-              </w:rPr>
-              <w:fldChar w:fldCharType="end"/>
-            </w:r>
-          </w:hyperlink>
-        </w:p>
-        <w:p>
-          <w:pPr>
-            <w:pStyle w:val="TOC5"/>
-            <w:tabs>
-              <w:tab w:val="left" w:pos="2020"/>
-              <w:tab w:val="right" w:pos="9628"/>
-            </w:tabs>
-            <w:rPr>
-              <w:rFonts w:asciiTheme="minorHAnsi" w:eastAsiaTheme="minorEastAsia" w:hAnsiTheme="minorHAnsi" w:cstheme="minorBidi"/>
-              <w:noProof/>
-              <w:sz w:val="22"/>
-              <w:szCs w:val="22"/>
-              <w:lang w:val="en-KE" w:eastAsia="en-KE" w:bidi="ar-SA"/>
-              <w14:ligatures w14:val="standardContextual"/>
-            </w:rPr>
-          </w:pPr>
-          <w:hyperlink w:anchor="_Toc177409492" w:history="1">
-            <w:r>
-              <w:rPr>
-                <w:rStyle w:val="Hyperlink"/>
-                <w:noProof/>
-              </w:rPr>
-              <w:t>2.2.1.2.4</w:t>
-            </w:r>
-            <w:r>
-              <w:rPr>
-                <w:rFonts w:asciiTheme="minorHAnsi" w:eastAsiaTheme="minorEastAsia" w:hAnsiTheme="minorHAnsi" w:cstheme="minorBidi"/>
-                <w:noProof/>
-                <w:sz w:val="22"/>
-                <w:szCs w:val="22"/>
-                <w:lang w:val="en-KE" w:eastAsia="en-KE" w:bidi="ar-SA"/>
-                <w14:ligatures w14:val="standardContextual"/>
-              </w:rPr>
-              <w:tab/>
-            </w:r>
-            <w:r>
-              <w:rPr>
-                <w:rStyle w:val="Hyperlink"/>
-                <w:noProof/>
-              </w:rPr>
-              <w:t>The Appearance Based Approach of Facial Detection</w:t>
-            </w:r>
-            <w:r>
-              <w:rPr>
-                <w:noProof/>
-              </w:rPr>
-              <w:tab/>
-            </w:r>
-            <w:r>
-              <w:rPr>
-                <w:noProof/>
-              </w:rPr>
-              <w:fldChar w:fldCharType="begin"/>
-            </w:r>
-            <w:r>
-              <w:rPr>
-                <w:noProof/>
-              </w:rPr>
-              <w:instrText xml:space="preserve"> PAGEREF _Toc177409492 \h </w:instrText>
-            </w:r>
-            <w:r>
-              <w:rPr>
-                <w:noProof/>
-              </w:rPr>
-            </w:r>
-            <w:r>
-              <w:rPr>
-                <w:noProof/>
-              </w:rPr>
-              <w:fldChar w:fldCharType="separate"/>
-            </w:r>
-            <w:r>
-              <w:rPr>
-                <w:noProof/>
-              </w:rPr>
-              <w:t>9</w:t>
             </w:r>
             <w:r>
               <w:rPr>
@@ -2978,7 +2748,7 @@
               <w14:ligatures w14:val="standardContextual"/>
             </w:rPr>
           </w:pPr>
-          <w:hyperlink w:anchor="_Toc177409493" w:history="1">
+          <w:hyperlink w:anchor="_Toc178527549" w:history="1">
             <w:r>
               <w:rPr>
                 <w:rStyle w:val="Hyperlink"/>
@@ -3020,7 +2790,7 @@
               <w:rPr>
                 <w:noProof/>
               </w:rPr>
-              <w:instrText xml:space="preserve"> PAGEREF _Toc177409493 \h </w:instrText>
+              <w:instrText xml:space="preserve"> PAGEREF _Toc178527549 \h </w:instrText>
             </w:r>
             <w:r>
               <w:rPr>
@@ -3063,7 +2833,7 @@
               <w14:ligatures w14:val="standardContextual"/>
             </w:rPr>
           </w:pPr>
-          <w:hyperlink w:anchor="_Toc177409494" w:history="1">
+          <w:hyperlink w:anchor="_Toc178527550" w:history="1">
             <w:r>
               <w:rPr>
                 <w:rStyle w:val="Hyperlink"/>
@@ -3105,7 +2875,7 @@
               <w:rPr>
                 <w:noProof/>
               </w:rPr>
-              <w:instrText xml:space="preserve"> PAGEREF _Toc177409494 \h </w:instrText>
+              <w:instrText xml:space="preserve"> PAGEREF _Toc178527550 \h </w:instrText>
             </w:r>
             <w:r>
               <w:rPr>
@@ -3148,7 +2918,7 @@
               <w14:ligatures w14:val="standardContextual"/>
             </w:rPr>
           </w:pPr>
-          <w:hyperlink w:anchor="_Toc177409495" w:history="1">
+          <w:hyperlink w:anchor="_Toc178527551" w:history="1">
             <w:r>
               <w:rPr>
                 <w:rStyle w:val="Hyperlink"/>
@@ -3190,7 +2960,7 @@
               <w:rPr>
                 <w:noProof/>
               </w:rPr>
-              <w:instrText xml:space="preserve"> PAGEREF _Toc177409495 \h </w:instrText>
+              <w:instrText xml:space="preserve"> PAGEREF _Toc178527551 \h </w:instrText>
             </w:r>
             <w:r>
               <w:rPr>
@@ -3233,7 +3003,7 @@
               <w14:ligatures w14:val="standardContextual"/>
             </w:rPr>
           </w:pPr>
-          <w:hyperlink w:anchor="_Toc177409496" w:history="1">
+          <w:hyperlink w:anchor="_Toc178527552" w:history="1">
             <w:r>
               <w:rPr>
                 <w:rStyle w:val="Hyperlink"/>
@@ -3275,7 +3045,7 @@
               <w:rPr>
                 <w:noProof/>
               </w:rPr>
-              <w:instrText xml:space="preserve"> PAGEREF _Toc177409496 \h </w:instrText>
+              <w:instrText xml:space="preserve"> PAGEREF _Toc178527552 \h </w:instrText>
             </w:r>
             <w:r>
               <w:rPr>
@@ -3318,7 +3088,7 @@
               <w14:ligatures w14:val="standardContextual"/>
             </w:rPr>
           </w:pPr>
-          <w:hyperlink w:anchor="_Toc177409497" w:history="1">
+          <w:hyperlink w:anchor="_Toc178527553" w:history="1">
             <w:r>
               <w:rPr>
                 <w:rStyle w:val="Hyperlink"/>
@@ -3360,7 +3130,7 @@
               <w:rPr>
                 <w:noProof/>
               </w:rPr>
-              <w:instrText xml:space="preserve"> PAGEREF _Toc177409497 \h </w:instrText>
+              <w:instrText xml:space="preserve"> PAGEREF _Toc178527553 \h </w:instrText>
             </w:r>
             <w:r>
               <w:rPr>
@@ -3403,7 +3173,7 @@
               <w14:ligatures w14:val="standardContextual"/>
             </w:rPr>
           </w:pPr>
-          <w:hyperlink w:anchor="_Toc177409498" w:history="1">
+          <w:hyperlink w:anchor="_Toc178527554" w:history="1">
             <w:r>
               <w:rPr>
                 <w:rStyle w:val="Hyperlink"/>
@@ -3445,7 +3215,7 @@
               <w:rPr>
                 <w:noProof/>
               </w:rPr>
-              <w:instrText xml:space="preserve"> PAGEREF _Toc177409498 \h </w:instrText>
+              <w:instrText xml:space="preserve"> PAGEREF _Toc178527554 \h </w:instrText>
             </w:r>
             <w:r>
               <w:rPr>
@@ -3488,7 +3258,7 @@
               <w14:ligatures w14:val="standardContextual"/>
             </w:rPr>
           </w:pPr>
-          <w:hyperlink w:anchor="_Toc177409499" w:history="1">
+          <w:hyperlink w:anchor="_Toc178527555" w:history="1">
             <w:r>
               <w:rPr>
                 <w:rStyle w:val="Hyperlink"/>
@@ -3530,7 +3300,7 @@
               <w:rPr>
                 <w:noProof/>
               </w:rPr>
-              <w:instrText xml:space="preserve"> PAGEREF _Toc177409499 \h </w:instrText>
+              <w:instrText xml:space="preserve"> PAGEREF _Toc178527555 \h </w:instrText>
             </w:r>
             <w:r>
               <w:rPr>
@@ -3548,91 +3318,6 @@
                 <w:noProof/>
               </w:rPr>
               <w:t>15</w:t>
-            </w:r>
-            <w:r>
-              <w:rPr>
-                <w:noProof/>
-              </w:rPr>
-              <w:fldChar w:fldCharType="end"/>
-            </w:r>
-          </w:hyperlink>
-        </w:p>
-        <w:p>
-          <w:pPr>
-            <w:pStyle w:val="TOC5"/>
-            <w:tabs>
-              <w:tab w:val="left" w:pos="2020"/>
-              <w:tab w:val="right" w:pos="9628"/>
-            </w:tabs>
-            <w:rPr>
-              <w:rFonts w:asciiTheme="minorHAnsi" w:eastAsiaTheme="minorEastAsia" w:hAnsiTheme="minorHAnsi" w:cstheme="minorBidi"/>
-              <w:noProof/>
-              <w:sz w:val="22"/>
-              <w:szCs w:val="22"/>
-              <w:lang w:val="en-KE" w:eastAsia="en-KE" w:bidi="ar-SA"/>
-              <w14:ligatures w14:val="standardContextual"/>
-            </w:rPr>
-          </w:pPr>
-          <w:hyperlink w:anchor="_Toc177409500" w:history="1">
-            <w:r>
-              <w:rPr>
-                <w:rStyle w:val="Hyperlink"/>
-                <w:noProof/>
-              </w:rPr>
-              <w:t>2.3.2.1.1</w:t>
-            </w:r>
-            <w:r>
-              <w:rPr>
-                <w:rFonts w:asciiTheme="minorHAnsi" w:eastAsiaTheme="minorEastAsia" w:hAnsiTheme="minorHAnsi" w:cstheme="minorBidi"/>
-                <w:noProof/>
-                <w:sz w:val="22"/>
-                <w:szCs w:val="22"/>
-                <w:lang w:val="en-KE" w:eastAsia="en-KE" w:bidi="ar-SA"/>
-                <w14:ligatures w14:val="standardContextual"/>
-              </w:rPr>
-              <w:tab/>
-            </w:r>
-            <w:r>
-              <w:rPr>
-                <w:rStyle w:val="Hyperlink"/>
-                <w:noProof/>
-              </w:rPr>
-              <w:t>Types of Padding</w:t>
-            </w:r>
-            <w:r>
-              <w:rPr>
-                <w:noProof/>
-              </w:rPr>
-              <w:tab/>
-            </w:r>
-            <w:r>
-              <w:rPr>
-                <w:noProof/>
-              </w:rPr>
-              <w:fldChar w:fldCharType="begin"/>
-            </w:r>
-            <w:r>
-              <w:rPr>
-                <w:noProof/>
-              </w:rPr>
-              <w:instrText xml:space="preserve"> PAGEREF _Toc177409500 \h </w:instrText>
-            </w:r>
-            <w:r>
-              <w:rPr>
-                <w:noProof/>
-              </w:rPr>
-            </w:r>
-            <w:r>
-              <w:rPr>
-                <w:noProof/>
-              </w:rPr>
-              <w:fldChar w:fldCharType="separate"/>
-            </w:r>
-            <w:r>
-              <w:rPr>
-                <w:noProof/>
-              </w:rPr>
-              <w:t>16</w:t>
             </w:r>
             <w:r>
               <w:rPr>
@@ -3658,7 +3343,7 @@
               <w14:ligatures w14:val="standardContextual"/>
             </w:rPr>
           </w:pPr>
-          <w:hyperlink w:anchor="_Toc177409501" w:history="1">
+          <w:hyperlink w:anchor="_Toc178527556" w:history="1">
             <w:r>
               <w:rPr>
                 <w:rStyle w:val="Hyperlink"/>
@@ -3702,7 +3387,7 @@
               <w:rPr>
                 <w:noProof/>
               </w:rPr>
-              <w:instrText xml:space="preserve"> PAGEREF _Toc177409501 \h </w:instrText>
+              <w:instrText xml:space="preserve"> PAGEREF _Toc178527556 \h </w:instrText>
             </w:r>
             <w:r>
               <w:rPr>
@@ -3745,7 +3430,7 @@
               <w14:ligatures w14:val="standardContextual"/>
             </w:rPr>
           </w:pPr>
-          <w:hyperlink w:anchor="_Toc177409502" w:history="1">
+          <w:hyperlink w:anchor="_Toc178527557" w:history="1">
             <w:r>
               <w:rPr>
                 <w:rStyle w:val="Hyperlink"/>
@@ -3789,7 +3474,7 @@
               <w:rPr>
                 <w:noProof/>
               </w:rPr>
-              <w:instrText xml:space="preserve"> PAGEREF _Toc177409502 \h </w:instrText>
+              <w:instrText xml:space="preserve"> PAGEREF _Toc178527557 \h </w:instrText>
             </w:r>
             <w:r>
               <w:rPr>
@@ -3832,7 +3517,7 @@
               <w14:ligatures w14:val="standardContextual"/>
             </w:rPr>
           </w:pPr>
-          <w:hyperlink w:anchor="_Toc177409503" w:history="1">
+          <w:hyperlink w:anchor="_Toc178527558" w:history="1">
             <w:r>
               <w:rPr>
                 <w:rStyle w:val="Hyperlink"/>
@@ -3876,7 +3561,7 @@
               <w:rPr>
                 <w:noProof/>
               </w:rPr>
-              <w:instrText xml:space="preserve"> PAGEREF _Toc177409503 \h </w:instrText>
+              <w:instrText xml:space="preserve"> PAGEREF _Toc178527558 \h </w:instrText>
             </w:r>
             <w:r>
               <w:rPr>
@@ -3919,7 +3604,7 @@
               <w14:ligatures w14:val="standardContextual"/>
             </w:rPr>
           </w:pPr>
-          <w:hyperlink w:anchor="_Toc177409504" w:history="1">
+          <w:hyperlink w:anchor="_Toc178527559" w:history="1">
             <w:r>
               <w:rPr>
                 <w:rStyle w:val="Hyperlink"/>
@@ -3963,7 +3648,7 @@
               <w:rPr>
                 <w:noProof/>
               </w:rPr>
-              <w:instrText xml:space="preserve"> PAGEREF _Toc177409504 \h </w:instrText>
+              <w:instrText xml:space="preserve"> PAGEREF _Toc178527559 \h </w:instrText>
             </w:r>
             <w:r>
               <w:rPr>
@@ -4006,7 +3691,7 @@
               <w14:ligatures w14:val="standardContextual"/>
             </w:rPr>
           </w:pPr>
-          <w:hyperlink w:anchor="_Toc177409505" w:history="1">
+          <w:hyperlink w:anchor="_Toc178527560" w:history="1">
             <w:r>
               <w:rPr>
                 <w:rStyle w:val="Hyperlink"/>
@@ -4048,7 +3733,7 @@
               <w:rPr>
                 <w:noProof/>
               </w:rPr>
-              <w:instrText xml:space="preserve"> PAGEREF _Toc177409505 \h </w:instrText>
+              <w:instrText xml:space="preserve"> PAGEREF _Toc178527560 \h </w:instrText>
             </w:r>
             <w:r>
               <w:rPr>
@@ -4091,7 +3776,7 @@
               <w14:ligatures w14:val="standardContextual"/>
             </w:rPr>
           </w:pPr>
-          <w:hyperlink w:anchor="_Toc177409506" w:history="1">
+          <w:hyperlink w:anchor="_Toc178527561" w:history="1">
             <w:r>
               <w:rPr>
                 <w:rStyle w:val="Hyperlink"/>
@@ -4142,7 +3827,7 @@
               <w:rPr>
                 <w:noProof/>
               </w:rPr>
-              <w:instrText xml:space="preserve"> PAGEREF _Toc177409506 \h </w:instrText>
+              <w:instrText xml:space="preserve"> PAGEREF _Toc178527561 \h </w:instrText>
             </w:r>
             <w:r>
               <w:rPr>
@@ -4185,7 +3870,7 @@
               <w14:ligatures w14:val="standardContextual"/>
             </w:rPr>
           </w:pPr>
-          <w:hyperlink w:anchor="_Toc177409507" w:history="1">
+          <w:hyperlink w:anchor="_Toc178527562" w:history="1">
             <w:r>
               <w:rPr>
                 <w:rStyle w:val="Hyperlink"/>
@@ -4227,7 +3912,7 @@
               <w:rPr>
                 <w:noProof/>
               </w:rPr>
-              <w:instrText xml:space="preserve"> PAGEREF _Toc177409507 \h </w:instrText>
+              <w:instrText xml:space="preserve"> PAGEREF _Toc178527562 \h </w:instrText>
             </w:r>
             <w:r>
               <w:rPr>
@@ -4269,7 +3954,7 @@
               <w14:ligatures w14:val="standardContextual"/>
             </w:rPr>
           </w:pPr>
-          <w:hyperlink w:anchor="_Toc177409508" w:history="1">
+          <w:hyperlink w:anchor="_Toc178527563" w:history="1">
             <w:r>
               <w:rPr>
                 <w:rStyle w:val="Hyperlink"/>
@@ -4313,7 +3998,70 @@
               <w:rPr>
                 <w:noProof/>
               </w:rPr>
-              <w:instrText xml:space="preserve"> PAGEREF _Toc177409508 \h </w:instrText>
+              <w:instrText xml:space="preserve"> PAGEREF _Toc178527563 \h </w:instrText>
+            </w:r>
+            <w:r>
+              <w:rPr>
+                <w:noProof/>
+              </w:rPr>
+            </w:r>
+            <w:r>
+              <w:rPr>
+                <w:noProof/>
+              </w:rPr>
+              <w:fldChar w:fldCharType="separate"/>
+            </w:r>
+            <w:r>
+              <w:rPr>
+                <w:noProof/>
+              </w:rPr>
+              <w:t>24</w:t>
+            </w:r>
+            <w:r>
+              <w:rPr>
+                <w:noProof/>
+              </w:rPr>
+              <w:fldChar w:fldCharType="end"/>
+            </w:r>
+          </w:hyperlink>
+        </w:p>
+        <w:p>
+          <w:pPr>
+            <w:pStyle w:val="TOC1"/>
+            <w:rPr>
+              <w:rFonts w:asciiTheme="minorHAnsi" w:eastAsiaTheme="minorEastAsia" w:hAnsiTheme="minorHAnsi" w:cstheme="minorBidi"/>
+              <w:noProof/>
+              <w:sz w:val="22"/>
+              <w:szCs w:val="22"/>
+              <w:lang w:val="en-KE" w:eastAsia="en-KE" w:bidi="ar-SA"/>
+              <w14:ligatures w14:val="standardContextual"/>
+            </w:rPr>
+          </w:pPr>
+          <w:hyperlink w:anchor="_Toc178527564" w:history="1">
+            <w:r>
+              <w:rPr>
+                <w:rStyle w:val="Hyperlink"/>
+                <w:noProof/>
+              </w:rPr>
+              <w:t>Methodology</w:t>
+            </w:r>
+            <w:r>
+              <w:rPr>
+                <w:noProof/>
+              </w:rPr>
+              <w:tab/>
+            </w:r>
+            <w:r>
+              <w:rPr>
+                <w:noProof/>
+              </w:rPr>
+              <w:fldChar w:fldCharType="begin"/>
+            </w:r>
+            <w:r>
+              <w:rPr>
+                <w:noProof/>
+              </w:rPr>
+              <w:instrText xml:space="preserve"> PAGEREF _Toc178527564 \h </w:instrText>
             </w:r>
             <w:r>
               <w:rPr>
@@ -4356,7 +4104,7 @@
               <w14:ligatures w14:val="standardContextual"/>
             </w:rPr>
           </w:pPr>
-          <w:hyperlink w:anchor="_Toc177409509" w:history="1">
+          <w:hyperlink w:anchor="_Toc178527565" w:history="1">
             <w:r>
               <w:rPr>
                 <w:rStyle w:val="Hyperlink"/>
@@ -4398,7 +4146,7 @@
               <w:rPr>
                 <w:noProof/>
               </w:rPr>
-              <w:instrText xml:space="preserve"> PAGEREF _Toc177409509 \h </w:instrText>
+              <w:instrText xml:space="preserve"> PAGEREF _Toc178527565 \h </w:instrText>
             </w:r>
             <w:r>
               <w:rPr>
@@ -4441,7 +4189,7 @@
               <w14:ligatures w14:val="standardContextual"/>
             </w:rPr>
           </w:pPr>
-          <w:hyperlink w:anchor="_Toc177409510" w:history="1">
+          <w:hyperlink w:anchor="_Toc178527566" w:history="1">
             <w:r>
               <w:rPr>
                 <w:rStyle w:val="Hyperlink"/>
@@ -4483,7 +4231,7 @@
               <w:rPr>
                 <w:noProof/>
               </w:rPr>
-              <w:instrText xml:space="preserve"> PAGEREF _Toc177409510 \h </w:instrText>
+              <w:instrText xml:space="preserve"> PAGEREF _Toc178527566 \h </w:instrText>
             </w:r>
             <w:r>
               <w:rPr>
@@ -4526,7 +4274,7 @@
               <w14:ligatures w14:val="standardContextual"/>
             </w:rPr>
           </w:pPr>
-          <w:hyperlink w:anchor="_Toc177409511" w:history="1">
+          <w:hyperlink w:anchor="_Toc178527567" w:history="1">
             <w:r>
               <w:rPr>
                 <w:rStyle w:val="Hyperlink"/>
@@ -4568,7 +4316,7 @@
               <w:rPr>
                 <w:noProof/>
               </w:rPr>
-              <w:instrText xml:space="preserve"> PAGEREF _Toc177409511 \h </w:instrText>
+              <w:instrText xml:space="preserve"> PAGEREF _Toc178527567 \h </w:instrText>
             </w:r>
             <w:r>
               <w:rPr>
@@ -4610,7 +4358,7 @@
               <w14:ligatures w14:val="standardContextual"/>
             </w:rPr>
           </w:pPr>
-          <w:hyperlink w:anchor="_Toc177409512" w:history="1">
+          <w:hyperlink w:anchor="_Toc178527568" w:history="1">
             <w:r>
               <w:rPr>
                 <w:rStyle w:val="Hyperlink"/>
@@ -4654,7 +4402,7 @@
               <w:rPr>
                 <w:noProof/>
               </w:rPr>
-              <w:instrText xml:space="preserve"> PAGEREF _Toc177409512 \h </w:instrText>
+              <w:instrText xml:space="preserve"> PAGEREF _Toc178527568 \h </w:instrText>
             </w:r>
             <w:r>
               <w:rPr>
@@ -4672,6 +4420,260 @@
                 <w:noProof/>
               </w:rPr>
               <w:t>33</w:t>
+            </w:r>
+            <w:r>
+              <w:rPr>
+                <w:noProof/>
+              </w:rPr>
+              <w:fldChar w:fldCharType="end"/>
+            </w:r>
+          </w:hyperlink>
+        </w:p>
+        <w:p>
+          <w:pPr>
+            <w:pStyle w:val="TOC1"/>
+            <w:tabs>
+              <w:tab w:val="left" w:pos="480"/>
+            </w:tabs>
+            <w:rPr>
+              <w:rFonts w:asciiTheme="minorHAnsi" w:eastAsiaTheme="minorEastAsia" w:hAnsiTheme="minorHAnsi" w:cstheme="minorBidi"/>
+              <w:noProof/>
+              <w:sz w:val="22"/>
+              <w:szCs w:val="22"/>
+              <w:lang w:val="en-KE" w:eastAsia="en-KE" w:bidi="ar-SA"/>
+              <w14:ligatures w14:val="standardContextual"/>
+            </w:rPr>
+          </w:pPr>
+          <w:hyperlink w:anchor="_Toc178527569" w:history="1">
+            <w:r>
+              <w:rPr>
+                <w:rStyle w:val="Hyperlink"/>
+                <w:noProof/>
+              </w:rPr>
+              <w:t>5</w:t>
+            </w:r>
+            <w:r>
+              <w:rPr>
+                <w:rFonts w:asciiTheme="minorHAnsi" w:eastAsiaTheme="minorEastAsia" w:hAnsiTheme="minorHAnsi" w:cstheme="minorBidi"/>
+                <w:noProof/>
+                <w:sz w:val="22"/>
+                <w:szCs w:val="22"/>
+                <w:lang w:val="en-KE" w:eastAsia="en-KE" w:bidi="ar-SA"/>
+                <w14:ligatures w14:val="standardContextual"/>
+              </w:rPr>
+              <w:tab/>
+            </w:r>
+            <w:r>
+              <w:rPr>
+                <w:rStyle w:val="Hyperlink"/>
+                <w:noProof/>
+              </w:rPr>
+              <w:t>Appendix</w:t>
+            </w:r>
+            <w:r>
+              <w:rPr>
+                <w:noProof/>
+              </w:rPr>
+              <w:tab/>
+            </w:r>
+            <w:r>
+              <w:rPr>
+                <w:noProof/>
+              </w:rPr>
+              <w:fldChar w:fldCharType="begin"/>
+            </w:r>
+            <w:r>
+              <w:rPr>
+                <w:noProof/>
+              </w:rPr>
+              <w:instrText xml:space="preserve"> PAGEREF _Toc178527569 \h </w:instrText>
+            </w:r>
+            <w:r>
+              <w:rPr>
+                <w:noProof/>
+              </w:rPr>
+            </w:r>
+            <w:r>
+              <w:rPr>
+                <w:noProof/>
+              </w:rPr>
+              <w:fldChar w:fldCharType="separate"/>
+            </w:r>
+            <w:r>
+              <w:rPr>
+                <w:noProof/>
+              </w:rPr>
+              <w:t>39</w:t>
+            </w:r>
+            <w:r>
+              <w:rPr>
+                <w:noProof/>
+              </w:rPr>
+              <w:fldChar w:fldCharType="end"/>
+            </w:r>
+          </w:hyperlink>
+        </w:p>
+        <w:p>
+          <w:pPr>
+            <w:pStyle w:val="TOC2"/>
+            <w:tabs>
+              <w:tab w:val="left" w:pos="960"/>
+              <w:tab w:val="right" w:pos="9628"/>
+            </w:tabs>
+            <w:rPr>
+              <w:rFonts w:asciiTheme="minorHAnsi" w:eastAsiaTheme="minorEastAsia" w:hAnsiTheme="minorHAnsi" w:cstheme="minorBidi"/>
+              <w:noProof/>
+              <w:sz w:val="22"/>
+              <w:szCs w:val="22"/>
+              <w:lang w:val="en-KE" w:eastAsia="en-KE" w:bidi="ar-SA"/>
+              <w14:ligatures w14:val="standardContextual"/>
+            </w:rPr>
+          </w:pPr>
+          <w:hyperlink w:anchor="_Toc178527570" w:history="1">
+            <w:r>
+              <w:rPr>
+                <w:rStyle w:val="Hyperlink"/>
+                <w:noProof/>
+              </w:rPr>
+              <w:t>5.1</w:t>
+            </w:r>
+            <w:r>
+              <w:rPr>
+                <w:rFonts w:asciiTheme="minorHAnsi" w:eastAsiaTheme="minorEastAsia" w:hAnsiTheme="minorHAnsi" w:cstheme="minorBidi"/>
+                <w:noProof/>
+                <w:sz w:val="22"/>
+                <w:szCs w:val="22"/>
+                <w:lang w:val="en-KE" w:eastAsia="en-KE" w:bidi="ar-SA"/>
+                <w14:ligatures w14:val="standardContextual"/>
+              </w:rPr>
+              <w:tab/>
+            </w:r>
+            <w:r>
+              <w:rPr>
+                <w:rStyle w:val="Hyperlink"/>
+                <w:noProof/>
+              </w:rPr>
+              <w:t>Appendix 1: Work Plan</w:t>
+            </w:r>
+            <w:r>
+              <w:rPr>
+                <w:noProof/>
+              </w:rPr>
+              <w:tab/>
+            </w:r>
+            <w:r>
+              <w:rPr>
+                <w:noProof/>
+              </w:rPr>
+              <w:fldChar w:fldCharType="begin"/>
+            </w:r>
+            <w:r>
+              <w:rPr>
+                <w:noProof/>
+              </w:rPr>
+              <w:instrText xml:space="preserve"> PAGEREF _Toc178527570 \h </w:instrText>
+            </w:r>
+            <w:r>
+              <w:rPr>
+                <w:noProof/>
+              </w:rPr>
+            </w:r>
+            <w:r>
+              <w:rPr>
+                <w:noProof/>
+              </w:rPr>
+              <w:fldChar w:fldCharType="separate"/>
+            </w:r>
+            <w:r>
+              <w:rPr>
+                <w:noProof/>
+              </w:rPr>
+              <w:t>39</w:t>
+            </w:r>
+            <w:r>
+              <w:rPr>
+                <w:noProof/>
+              </w:rPr>
+              <w:fldChar w:fldCharType="end"/>
+            </w:r>
+          </w:hyperlink>
+        </w:p>
+        <w:p>
+          <w:pPr>
+            <w:pStyle w:val="TOC2"/>
+            <w:tabs>
+              <w:tab w:val="left" w:pos="960"/>
+              <w:tab w:val="right" w:pos="9628"/>
+            </w:tabs>
+            <w:rPr>
+              <w:rFonts w:asciiTheme="minorHAnsi" w:eastAsiaTheme="minorEastAsia" w:hAnsiTheme="minorHAnsi" w:cstheme="minorBidi"/>
+              <w:noProof/>
+              <w:sz w:val="22"/>
+              <w:szCs w:val="22"/>
+              <w:lang w:val="en-KE" w:eastAsia="en-KE" w:bidi="ar-SA"/>
+              <w14:ligatures w14:val="standardContextual"/>
+            </w:rPr>
+          </w:pPr>
+          <w:hyperlink w:anchor="_Toc178527571" w:history="1">
+            <w:r>
+              <w:rPr>
+                <w:rStyle w:val="Hyperlink"/>
+                <w:noProof/>
+              </w:rPr>
+              <w:t>5.2</w:t>
+            </w:r>
+            <w:r>
+              <w:rPr>
+                <w:rFonts w:asciiTheme="minorHAnsi" w:eastAsiaTheme="minorEastAsia" w:hAnsiTheme="minorHAnsi" w:cstheme="minorBidi"/>
+                <w:noProof/>
+                <w:sz w:val="22"/>
+                <w:szCs w:val="22"/>
+                <w:lang w:val="en-KE" w:eastAsia="en-KE" w:bidi="ar-SA"/>
+                <w14:ligatures w14:val="standardContextual"/>
+              </w:rPr>
+              <w:tab/>
+            </w:r>
+            <w:r>
+              <w:rPr>
+                <w:rStyle w:val="Hyperlink"/>
+                <w:noProof/>
+              </w:rPr>
+              <w:t>Appendix 2: Budget</w:t>
+            </w:r>
+            <w:r>
+              <w:rPr>
+                <w:noProof/>
+              </w:rPr>
+              <w:tab/>
+            </w:r>
+            <w:r>
+              <w:rPr>
+                <w:noProof/>
+              </w:rPr>
+              <w:fldChar w:fldCharType="begin"/>
+            </w:r>
+            <w:r>
+              <w:rPr>
+                <w:noProof/>
+              </w:rPr>
+              <w:instrText xml:space="preserve"> PAGEREF _Toc178527571 \h </w:instrText>
+            </w:r>
+            <w:r>
+              <w:rPr>
+                <w:noProof/>
+              </w:rPr>
+            </w:r>
+            <w:r>
+              <w:rPr>
+                <w:noProof/>
+              </w:rPr>
+              <w:fldChar w:fldCharType="separate"/>
+            </w:r>
+            <w:r>
+              <w:rPr>
+                <w:noProof/>
+              </w:rPr>
+              <w:t>39</w:t>
             </w:r>
             <w:r>
               <w:rPr>
@@ -4736,7 +4738,7 @@
           <w:rFonts w:ascii="Times New Roman" w:hAnsi="Times New Roman" w:cs="Times New Roman"/>
         </w:rPr>
       </w:pPr>
-      <w:bookmarkStart w:id="4" w:name="_Toc177409473"/>
+      <w:bookmarkStart w:id="4" w:name="_Toc178527531"/>
       <w:r>
         <w:rPr>
           <w:rFonts w:ascii="Times New Roman" w:hAnsi="Times New Roman" w:cs="Times New Roman"/>
@@ -4848,7 +4850,7 @@
           <w:rFonts w:ascii="Times New Roman" w:hAnsi="Times New Roman" w:cs="Times New Roman"/>
         </w:rPr>
       </w:pPr>
-      <w:bookmarkStart w:id="5" w:name="_Toc177409474"/>
+      <w:bookmarkStart w:id="5" w:name="_Toc178527532"/>
       <w:r>
         <w:rPr>
           <w:rFonts w:ascii="Times New Roman" w:hAnsi="Times New Roman" w:cs="Times New Roman"/>
@@ -5633,7 +5635,7 @@
           <w:numId w:val="0"/>
         </w:numPr>
       </w:pPr>
-      <w:bookmarkStart w:id="6" w:name="_Toc177409475"/>
+      <w:bookmarkStart w:id="6" w:name="_Toc178527533"/>
       <w:r>
         <w:lastRenderedPageBreak/>
         <w:t>List of Abbreviations and Acronyms</w:t>
@@ -5700,14 +5702,14 @@
       <w:pPr>
         <w:pStyle w:val="BodyText"/>
         <w:rPr>
-          <w:rFonts w:ascii="Times New Roman" w:hAnsi="Times New Roman" w:cs="Times New Roman"/>
-        </w:rPr>
-      </w:pPr>
-      <w:r>
-        <w:rPr>
-          <w:rFonts w:ascii="Times New Roman" w:hAnsi="Times New Roman" w:cs="Times New Roman"/>
-        </w:rPr>
-        <w:t>LSTM</w:t>
+          <w:lang w:val="en-KE"/>
+        </w:rPr>
+      </w:pPr>
+      <w:r>
+        <w:rPr>
+          <w:rFonts w:ascii="Times New Roman" w:hAnsi="Times New Roman" w:cs="Times New Roman"/>
+        </w:rPr>
+        <w:t>DFW</w:t>
       </w:r>
       <w:r>
         <w:rPr>
@@ -5721,7 +5723,12 @@
           <w:rFonts w:ascii="Times New Roman" w:hAnsi="Times New Roman" w:cs="Times New Roman"/>
         </w:rPr>
         <w:tab/>
-        <w:t xml:space="preserve"> Long Short-term Memory</w:t>
+      </w:r>
+      <w:r>
+        <w:rPr>
+          <w:lang w:val="en-KE"/>
+        </w:rPr>
+        <w:t>Disguised Faces in The Wild</w:t>
       </w:r>
     </w:p>
     <w:p>
@@ -5733,9 +5740,37 @@
       </w:pPr>
       <w:r>
         <w:rPr>
-          <w:rFonts w:ascii="Times New Roman" w:hAnsi="Times New Roman" w:cs="Times New Roman"/>
-        </w:rPr>
-        <w:t>DFW</w:t>
+          <w:lang w:val="en-KE"/>
+        </w:rPr>
+        <w:t>IOT</w:t>
+      </w:r>
+      <w:r>
+        <w:rPr>
+          <w:lang w:val="en-KE"/>
+        </w:rPr>
+        <w:tab/>
+        <w:t>.............................................................................................</w:t>
+      </w:r>
+      <w:r>
+        <w:rPr>
+          <w:lang w:val="en-KE"/>
+        </w:rPr>
+        <w:tab/>
+        <w:t>Internet of Things</w:t>
+      </w:r>
+    </w:p>
+    <w:p>
+      <w:pPr>
+        <w:pStyle w:val="BodyText"/>
+        <w:rPr>
+          <w:rFonts w:ascii="Times New Roman" w:hAnsi="Times New Roman" w:cs="Times New Roman"/>
+        </w:rPr>
+      </w:pPr>
+      <w:r>
+        <w:rPr>
+          <w:rFonts w:ascii="Times New Roman" w:hAnsi="Times New Roman" w:cs="Times New Roman"/>
+        </w:rPr>
+        <w:t>LSTM</w:t>
       </w:r>
       <w:r>
         <w:rPr>
@@ -5749,12 +5784,7 @@
           <w:rFonts w:ascii="Times New Roman" w:hAnsi="Times New Roman" w:cs="Times New Roman"/>
         </w:rPr>
         <w:tab/>
-      </w:r>
-      <w:r>
-        <w:rPr>
-          <w:lang w:val="en-KE"/>
-        </w:rPr>
-        <w:t>Disguised Faces in The Wild</w:t>
+        <w:t xml:space="preserve"> Long Short-term Memory</w:t>
       </w:r>
     </w:p>
     <w:p>
@@ -5890,7 +5920,7 @@
           <w:numId w:val="9"/>
         </w:numPr>
       </w:pPr>
-      <w:bookmarkStart w:id="7" w:name="_Toc177409476"/>
+      <w:bookmarkStart w:id="7" w:name="_Toc178527534"/>
       <w:r>
         <w:lastRenderedPageBreak/>
         <w:t>Chapter One</w:t>
@@ -5905,9 +5935,11 @@
           <w:numId w:val="0"/>
         </w:numPr>
       </w:pPr>
+      <w:bookmarkStart w:id="8" w:name="_Toc178527535"/>
       <w:r>
         <w:t>Introduction</w:t>
       </w:r>
+      <w:bookmarkEnd w:id="8"/>
     </w:p>
     <w:p>
       <w:pPr>
@@ -5916,14 +5948,14 @@
           <w:rFonts w:ascii="Times New Roman" w:hAnsi="Times New Roman" w:cs="Times New Roman"/>
         </w:rPr>
       </w:pPr>
-      <w:bookmarkStart w:id="8" w:name="_Toc177409477"/>
+      <w:bookmarkStart w:id="9" w:name="_Toc178527536"/>
       <w:r>
         <w:rPr>
           <w:rFonts w:ascii="Times New Roman" w:hAnsi="Times New Roman" w:cs="Times New Roman"/>
         </w:rPr>
         <w:t>Background of Study</w:t>
       </w:r>
-      <w:bookmarkEnd w:id="8"/>
+      <w:bookmarkEnd w:id="9"/>
     </w:p>
     <w:p>
       <w:pPr>
@@ -5997,14 +6029,14 @@
           <w:rFonts w:ascii="Times New Roman" w:hAnsi="Times New Roman" w:cs="Times New Roman"/>
         </w:rPr>
       </w:pPr>
-      <w:bookmarkStart w:id="9" w:name="_Toc177409478"/>
+      <w:bookmarkStart w:id="10" w:name="_Toc178527537"/>
       <w:r>
         <w:rPr>
           <w:rFonts w:ascii="Times New Roman" w:hAnsi="Times New Roman" w:cs="Times New Roman"/>
         </w:rPr>
         <w:t>Statement of the Problem</w:t>
       </w:r>
-      <w:bookmarkEnd w:id="9"/>
+      <w:bookmarkEnd w:id="10"/>
     </w:p>
     <w:p>
       <w:pPr>
@@ -6069,14 +6101,14 @@
           <w:rFonts w:ascii="Times New Roman" w:hAnsi="Times New Roman" w:cs="Times New Roman"/>
         </w:rPr>
       </w:pPr>
-      <w:bookmarkStart w:id="10" w:name="_Toc177409479"/>
+      <w:bookmarkStart w:id="11" w:name="_Toc178527538"/>
       <w:r>
         <w:rPr>
           <w:rFonts w:ascii="Times New Roman" w:hAnsi="Times New Roman" w:cs="Times New Roman"/>
         </w:rPr>
         <w:t>Justification of the study</w:t>
       </w:r>
-      <w:bookmarkEnd w:id="10"/>
+      <w:bookmarkEnd w:id="11"/>
     </w:p>
     <w:p>
       <w:pPr>
@@ -6142,14 +6174,14 @@
       <w:pPr>
         <w:pStyle w:val="Heading2"/>
       </w:pPr>
-      <w:bookmarkStart w:id="11" w:name="_Toc177409480"/>
+      <w:bookmarkStart w:id="12" w:name="_Toc178527539"/>
       <w:r>
         <w:rPr>
           <w:rFonts w:ascii="Times New Roman" w:hAnsi="Times New Roman" w:cs="Times New Roman"/>
         </w:rPr>
         <w:t>OBJECTIVES</w:t>
       </w:r>
-      <w:bookmarkEnd w:id="11"/>
+      <w:bookmarkEnd w:id="12"/>
     </w:p>
     <w:p>
       <w:pPr>
@@ -6158,14 +6190,14 @@
           <w:rFonts w:ascii="Times New Roman" w:hAnsi="Times New Roman" w:cs="Times New Roman"/>
         </w:rPr>
       </w:pPr>
-      <w:bookmarkStart w:id="12" w:name="_Toc177409481"/>
+      <w:bookmarkStart w:id="13" w:name="_Toc178527540"/>
       <w:r>
         <w:rPr>
           <w:rFonts w:ascii="Times New Roman" w:hAnsi="Times New Roman" w:cs="Times New Roman"/>
         </w:rPr>
         <w:t>General Objective</w:t>
       </w:r>
-      <w:bookmarkEnd w:id="12"/>
+      <w:bookmarkEnd w:id="13"/>
     </w:p>
     <w:p>
       <w:pPr>
@@ -6188,14 +6220,14 @@
           <w:rFonts w:ascii="Times New Roman" w:hAnsi="Times New Roman" w:cs="Times New Roman"/>
         </w:rPr>
       </w:pPr>
-      <w:bookmarkStart w:id="13" w:name="_Toc177409482"/>
+      <w:bookmarkStart w:id="14" w:name="_Toc178527541"/>
       <w:r>
         <w:rPr>
           <w:rFonts w:ascii="Times New Roman" w:hAnsi="Times New Roman" w:cs="Times New Roman"/>
         </w:rPr>
         <w:t>Specific Objectives</w:t>
       </w:r>
-      <w:bookmarkEnd w:id="13"/>
+      <w:bookmarkEnd w:id="14"/>
     </w:p>
     <w:p>
       <w:pPr>
@@ -6212,37 +6244,7 @@
         <w:rPr>
           <w:rFonts w:ascii="Times New Roman" w:hAnsi="Times New Roman" w:cs="Times New Roman"/>
         </w:rPr>
-        <w:t xml:space="preserve">To </w:t>
-      </w:r>
-      <w:r>
-        <w:rPr>
-          <w:rFonts w:ascii="Times New Roman" w:hAnsi="Times New Roman" w:cs="Times New Roman"/>
-        </w:rPr>
-        <w:t xml:space="preserve">examine the effect of padding on the accuracy </w:t>
-      </w:r>
-      <w:r>
-        <w:rPr>
-          <w:rFonts w:ascii="Times New Roman" w:hAnsi="Times New Roman" w:cs="Times New Roman"/>
-        </w:rPr>
-        <w:t xml:space="preserve">of the pretrained model: </w:t>
-      </w:r>
-      <w:r>
-        <w:rPr>
-          <w:rFonts w:ascii="Times New Roman" w:hAnsi="Times New Roman" w:cs="Times New Roman"/>
-        </w:rPr>
-        <w:t>VGGFACE</w:t>
-      </w:r>
-      <w:r>
-        <w:rPr>
-          <w:rFonts w:ascii="Times New Roman" w:hAnsi="Times New Roman" w:cs="Times New Roman"/>
-        </w:rPr>
-        <w:t>-16</w:t>
-      </w:r>
-      <w:r>
-        <w:rPr>
-          <w:rFonts w:ascii="Times New Roman" w:hAnsi="Times New Roman" w:cs="Times New Roman"/>
-        </w:rPr>
-        <w:t>.</w:t>
+        <w:t>To build a facial recognition model using convolution neural networks</w:t>
       </w:r>
     </w:p>
     <w:p>
@@ -6252,12 +6254,45 @@
           <w:numId w:val="1"/>
         </w:numPr>
         <w:spacing w:line="480" w:lineRule="auto"/>
-      </w:pPr>
-      <w:r>
-        <w:rPr>
-          <w:rFonts w:ascii="Times New Roman" w:hAnsi="Times New Roman" w:cs="Times New Roman"/>
-        </w:rPr>
-        <w:t>To build a facial recognition model using convolution neural networks and examine the effect of padding on the accuracy of the model</w:t>
+        <w:rPr>
+          <w:rFonts w:ascii="Times New Roman" w:hAnsi="Times New Roman" w:cs="Times New Roman"/>
+        </w:rPr>
+      </w:pPr>
+      <w:r>
+        <w:rPr>
+          <w:rFonts w:ascii="Times New Roman" w:hAnsi="Times New Roman" w:cs="Times New Roman"/>
+        </w:rPr>
+        <w:t xml:space="preserve">To </w:t>
+      </w:r>
+      <w:r>
+        <w:rPr>
+          <w:rFonts w:ascii="Times New Roman" w:hAnsi="Times New Roman" w:cs="Times New Roman"/>
+        </w:rPr>
+        <w:t xml:space="preserve">examine the effect of padding on </w:t>
+      </w:r>
+      <w:r>
+        <w:rPr>
+          <w:rFonts w:ascii="Times New Roman" w:hAnsi="Times New Roman" w:cs="Times New Roman"/>
+        </w:rPr>
+        <w:t>a</w:t>
+      </w:r>
+      <w:r>
+        <w:rPr>
+          <w:rFonts w:ascii="Times New Roman" w:hAnsi="Times New Roman" w:cs="Times New Roman"/>
+        </w:rPr>
+        <w:t xml:space="preserve"> pretrained model: </w:t>
+      </w:r>
+      <w:r>
+        <w:rPr>
+          <w:rFonts w:ascii="Times New Roman" w:hAnsi="Times New Roman" w:cs="Times New Roman"/>
+        </w:rPr>
+        <w:t>VGGFACE</w:t>
+      </w:r>
+      <w:r>
+        <w:rPr>
+          <w:rFonts w:ascii="Times New Roman" w:hAnsi="Times New Roman" w:cs="Times New Roman"/>
+        </w:rPr>
+        <w:t>-16</w:t>
       </w:r>
       <w:r>
         <w:rPr>
@@ -6273,48 +6308,15 @@
           <w:numId w:val="1"/>
         </w:numPr>
         <w:spacing w:line="480" w:lineRule="auto"/>
-      </w:pPr>
-      <w:r>
-        <w:rPr>
-          <w:rFonts w:ascii="Times New Roman" w:hAnsi="Times New Roman" w:cs="Times New Roman"/>
-        </w:rPr>
-        <w:t xml:space="preserve">To </w:t>
-      </w:r>
-      <w:r>
-        <w:rPr>
-          <w:rFonts w:ascii="Times New Roman" w:hAnsi="Times New Roman" w:cs="Times New Roman"/>
-        </w:rPr>
-        <w:t>examine the effect of padding on the training time of VGGFACE</w:t>
-      </w:r>
-      <w:r>
-        <w:rPr>
-          <w:rFonts w:ascii="Times New Roman" w:hAnsi="Times New Roman" w:cs="Times New Roman"/>
-        </w:rPr>
-        <w:t>-16</w:t>
-      </w:r>
-      <w:r>
-        <w:rPr>
-          <w:rFonts w:ascii="Times New Roman" w:hAnsi="Times New Roman" w:cs="Times New Roman"/>
-        </w:rPr>
-        <w:t xml:space="preserve"> and a </w:t>
-      </w:r>
-      <w:r>
-        <w:rPr>
-          <w:rFonts w:ascii="Times New Roman" w:hAnsi="Times New Roman" w:cs="Times New Roman"/>
-        </w:rPr>
-        <w:t>self-built</w:t>
-      </w:r>
-      <w:r>
-        <w:rPr>
-          <w:rFonts w:ascii="Times New Roman" w:hAnsi="Times New Roman" w:cs="Times New Roman"/>
-        </w:rPr>
-        <w:t xml:space="preserve"> model</w:t>
-      </w:r>
-      <w:r>
-        <w:rPr>
-          <w:rFonts w:ascii="Times New Roman" w:hAnsi="Times New Roman" w:cs="Times New Roman"/>
-        </w:rPr>
-        <w:t>.</w:t>
+        <w:rPr>
+          <w:rFonts w:ascii="Times New Roman" w:hAnsi="Times New Roman" w:cs="Times New Roman"/>
+        </w:rPr>
+      </w:pPr>
+      <w:r>
+        <w:rPr>
+          <w:rFonts w:ascii="Times New Roman" w:hAnsi="Times New Roman" w:cs="Times New Roman"/>
+        </w:rPr>
+        <w:t>To examine the effect of padding on facial recognition using a self-trained model</w:t>
       </w:r>
     </w:p>
     <w:p>
@@ -6394,7 +6396,7 @@
           <w:rFonts w:ascii="Times New Roman" w:hAnsi="Times New Roman" w:cs="Times New Roman"/>
         </w:rPr>
       </w:pPr>
-      <w:bookmarkStart w:id="14" w:name="_Toc177409483"/>
+      <w:bookmarkStart w:id="15" w:name="_Toc178527542"/>
       <w:r>
         <w:rPr>
           <w:rFonts w:ascii="Times New Roman" w:hAnsi="Times New Roman" w:cs="Times New Roman"/>
@@ -6402,7 +6404,7 @@
         <w:lastRenderedPageBreak/>
         <w:t>Chapter Two</w:t>
       </w:r>
-      <w:bookmarkEnd w:id="14"/>
+      <w:bookmarkEnd w:id="15"/>
     </w:p>
     <w:p>
       <w:pPr>
@@ -6412,19 +6414,21 @@
           <w:numId w:val="0"/>
         </w:numPr>
       </w:pPr>
+      <w:bookmarkStart w:id="16" w:name="_Toc178527543"/>
       <w:r>
         <w:t>Literature Review</w:t>
       </w:r>
+      <w:bookmarkEnd w:id="16"/>
     </w:p>
     <w:p>
       <w:pPr>
         <w:pStyle w:val="Heading2"/>
       </w:pPr>
-      <w:bookmarkStart w:id="15" w:name="_Toc177409484"/>
+      <w:bookmarkStart w:id="17" w:name="_Toc178527544"/>
       <w:r>
         <w:t>Introduction</w:t>
       </w:r>
-      <w:bookmarkEnd w:id="15"/>
+      <w:bookmarkEnd w:id="17"/>
     </w:p>
     <w:p>
       <w:pPr>
@@ -6452,11 +6456,11 @@
       <w:pPr>
         <w:pStyle w:val="Heading2"/>
       </w:pPr>
-      <w:bookmarkStart w:id="16" w:name="_Toc177409485"/>
+      <w:bookmarkStart w:id="18" w:name="_Toc178527545"/>
       <w:r>
         <w:t>Facial Recognition</w:t>
       </w:r>
-      <w:bookmarkEnd w:id="16"/>
+      <w:bookmarkEnd w:id="18"/>
     </w:p>
     <w:p>
       <w:pPr>
@@ -6478,12 +6482,12 @@
       <w:pPr>
         <w:pStyle w:val="Heading3"/>
       </w:pPr>
-      <w:bookmarkStart w:id="17" w:name="_Toc177409486"/>
+      <w:bookmarkStart w:id="19" w:name="_Toc178527546"/>
       <w:r>
         <w:lastRenderedPageBreak/>
         <w:t>Face Detection</w:t>
       </w:r>
-      <w:bookmarkEnd w:id="17"/>
+      <w:bookmarkEnd w:id="19"/>
     </w:p>
     <w:p>
       <w:pPr>
@@ -6507,7 +6511,21 @@
         <w:rPr>
           <w:rFonts w:ascii="Times New Roman" w:hAnsi="Times New Roman" w:cs="Times New Roman"/>
         </w:rPr>
-        <w:t xml:space="preserve">2002). It is important to highlight that there are several methods that could be used for detecting faces from images. These methods include knowledge based methods, feature invariant approaches, template matching methods, and appearance based methods. Indeed, the mentioned methods are important when detecting faces from images, but all these methods are accompanied by several challenges. This owes to the reality that Yang </w:t>
+        <w:t xml:space="preserve">2002). It is important to highlight that there are several methods that could be used for detecting faces from images. These methods include </w:t>
+      </w:r>
+      <w:proofErr w:type="gramStart"/>
+      <w:r>
+        <w:rPr>
+          <w:rFonts w:ascii="Times New Roman" w:hAnsi="Times New Roman" w:cs="Times New Roman"/>
+        </w:rPr>
+        <w:t>knowledge based</w:t>
+      </w:r>
+      <w:proofErr w:type="gramEnd"/>
+      <w:r>
+        <w:rPr>
+          <w:rFonts w:ascii="Times New Roman" w:hAnsi="Times New Roman" w:cs="Times New Roman"/>
+        </w:rPr>
+        <w:t xml:space="preserve"> methods, feature invariant approaches, template matching methods, and appearance based methods. Indeed, the mentioned methods are important when detecting faces from images, but all these methods are accompanied by several challenges. This owes to the reality that Yang </w:t>
       </w:r>
       <w:r>
         <w:rPr>
@@ -6526,11 +6544,11 @@
       <w:pPr>
         <w:pStyle w:val="Heading4"/>
       </w:pPr>
-      <w:bookmarkStart w:id="18" w:name="_Toc177409487"/>
+      <w:bookmarkStart w:id="20" w:name="_Toc178527547"/>
       <w:r>
         <w:t>Challenges in Face Detection</w:t>
       </w:r>
-      <w:bookmarkEnd w:id="18"/>
+      <w:bookmarkEnd w:id="20"/>
     </w:p>
     <w:p>
       <w:pPr>
@@ -6651,21 +6669,26 @@
       <w:pPr>
         <w:pStyle w:val="Heading4"/>
       </w:pPr>
-      <w:bookmarkStart w:id="19" w:name="_Toc177409488"/>
+      <w:bookmarkStart w:id="21" w:name="_Toc178527548"/>
       <w:r>
         <w:t>Face Detection Approaches</w:t>
       </w:r>
-      <w:bookmarkEnd w:id="19"/>
-    </w:p>
-    <w:p>
-      <w:pPr>
-        <w:pStyle w:val="Heading5"/>
-      </w:pPr>
-      <w:bookmarkStart w:id="20" w:name="_Toc177409489"/>
-      <w:r>
+      <w:bookmarkEnd w:id="21"/>
+    </w:p>
+    <w:p>
+      <w:pPr>
+        <w:rPr>
+          <w:b/>
+          <w:bCs/>
+        </w:rPr>
+      </w:pPr>
+      <w:r>
+        <w:rPr>
+          <w:b/>
+          <w:bCs/>
+        </w:rPr>
         <w:t>Knowledge Based Methods of Facial Detection</w:t>
       </w:r>
-      <w:bookmarkEnd w:id="20"/>
     </w:p>
     <w:p>
       <w:pPr>
@@ -6680,19 +6703,38 @@
           <w:rFonts w:ascii="Times New Roman" w:hAnsi="Times New Roman" w:cs="Times New Roman"/>
         </w:rPr>
         <w:tab/>
-        <w:t>This method relies on a set of rules to detect whether there is a human face in an image. The method captures the human knowledge of faces and interprets the knowledge into a set of rules. For instance, the face has two symmetric eyes; the eye areas are darker than the cheeks, the distance between eyes, and the difference in colors between the eyes and cheeks. It is notable that using the knowledge base method for face detection could be difficult because it is difficult to develop a set of rules that can correctly identify a human face. This owes to the fact that there could be very many false positives if the rules are too general. Likewise, there could be many false negatives if the rules are too strict. This drawback has hampered researchers from using this technique. However, Chen et al., (2001) used the knowledge based method to detect faces in an image with an accuracy of 94%. One disadvantage with this method is that it is not efficient.</w:t>
-      </w:r>
-    </w:p>
-    <w:p>
-      <w:pPr>
-        <w:pStyle w:val="Heading5"/>
-      </w:pPr>
-      <w:bookmarkStart w:id="21" w:name="_Toc177409490"/>
-      <w:r>
+        <w:t xml:space="preserve">This method relies on a set of rules to detect whether there is a human face in an image. The method captures the human knowledge of faces and interprets the knowledge into a set of rules. For instance, the face has two symmetric eyes; the eye areas are darker than the cheeks, the distance between eyes, and the difference in colors between the eyes and cheeks. It is notable that using the knowledge base method for face detection could be difficult because it is difficult to develop a set of rules that can correctly identify a human face. This owes to the fact that there could be very many false positives if the rules are too general. Likewise, there could be many false negatives if the rules are too strict. This drawback has hampered researchers from using this technique. However, Chen et al., (2001) used the </w:t>
+      </w:r>
+      <w:proofErr w:type="gramStart"/>
+      <w:r>
+        <w:rPr>
+          <w:rFonts w:ascii="Times New Roman" w:hAnsi="Times New Roman" w:cs="Times New Roman"/>
+        </w:rPr>
+        <w:t>knowledge based</w:t>
+      </w:r>
+      <w:proofErr w:type="gramEnd"/>
+      <w:r>
+        <w:rPr>
+          <w:rFonts w:ascii="Times New Roman" w:hAnsi="Times New Roman" w:cs="Times New Roman"/>
+        </w:rPr>
+        <w:t xml:space="preserve"> method to detect faces in an image with an accuracy of 94%. One disadvantage with this method is that it is not efficient.</w:t>
+      </w:r>
+    </w:p>
+    <w:p>
+      <w:pPr>
+        <w:rPr>
+          <w:b/>
+          <w:bCs/>
+        </w:rPr>
+      </w:pPr>
+      <w:r>
+        <w:rPr>
+          <w:b/>
+          <w:bCs/>
+        </w:rPr>
         <w:lastRenderedPageBreak/>
         <w:t>The Feature Invariant Approach of Face Detection</w:t>
       </w:r>
-      <w:bookmarkEnd w:id="21"/>
     </w:p>
     <w:p>
       <w:pPr>
@@ -6730,18 +6772,51 @@
         <w:rPr>
           <w:rFonts w:ascii="Times New Roman" w:hAnsi="Times New Roman" w:cs="Times New Roman"/>
         </w:rPr>
-        <w:t xml:space="preserve"> (2013) define a face landmark as a prominent feature that can play a discriminative role or can serve as anchor points in face detection. Examples of such landmarks include the eye corners, the nose tip, nostril corners, mouth corners, end points of eyebrow arcs, ear lobes, and the chin. This approach works by detecting facial landmarks, texture and skin color before using a statistical model to identify the presence of a face in an image. Critical to the discussion is the reality that different authors have used the feature invariant approach for face detection. For instance, Kapil and Jain (2013) compared texture based to the structure and shape based feature invariant based methods and concluded that the texture based method is more accurate. However, the authors argue that feature invariant based methods are computationally expensive.</w:t>
-      </w:r>
-    </w:p>
-    <w:p>
-      <w:pPr>
-        <w:pStyle w:val="Heading5"/>
-      </w:pPr>
-      <w:bookmarkStart w:id="22" w:name="_Toc177409491"/>
-      <w:r>
+        <w:t xml:space="preserve"> (2013) define a face landmark as a prominent feature that can play a discriminative role or can serve as anchor points in face detection. Examples of such landmarks include the eye corners, the nose tip, nostril corners, mouth corners, end points of eyebrow arcs, ear lobes, and the chin. This approach works by detecting facial landmarks, texture and skin color before using a statistical model to identify the presence of a face in an image. Critical to the discussion is the reality that different authors have used the feature invariant approach for face detection. For instance, Kapil and Jain (2013) compared texture based to the structure and </w:t>
+      </w:r>
+      <w:proofErr w:type="gramStart"/>
+      <w:r>
+        <w:rPr>
+          <w:rFonts w:ascii="Times New Roman" w:hAnsi="Times New Roman" w:cs="Times New Roman"/>
+        </w:rPr>
+        <w:t>shape based</w:t>
+      </w:r>
+      <w:proofErr w:type="gramEnd"/>
+      <w:r>
+        <w:rPr>
+          <w:rFonts w:ascii="Times New Roman" w:hAnsi="Times New Roman" w:cs="Times New Roman"/>
+        </w:rPr>
+        <w:t xml:space="preserve"> feature invariant based methods and concluded that the texture based method is more accurate. However, the authors argue that feature </w:t>
+      </w:r>
+      <w:proofErr w:type="gramStart"/>
+      <w:r>
+        <w:rPr>
+          <w:rFonts w:ascii="Times New Roman" w:hAnsi="Times New Roman" w:cs="Times New Roman"/>
+        </w:rPr>
+        <w:t>invariant based</w:t>
+      </w:r>
+      <w:proofErr w:type="gramEnd"/>
+      <w:r>
+        <w:rPr>
+          <w:rFonts w:ascii="Times New Roman" w:hAnsi="Times New Roman" w:cs="Times New Roman"/>
+        </w:rPr>
+        <w:t xml:space="preserve"> methods are computationally expensive.</w:t>
+      </w:r>
+    </w:p>
+    <w:p>
+      <w:pPr>
+        <w:rPr>
+          <w:b/>
+          <w:bCs/>
+        </w:rPr>
+      </w:pPr>
+      <w:r>
+        <w:rPr>
+          <w:b/>
+          <w:bCs/>
+        </w:rPr>
         <w:t>The Template Based Approach of Face Detection</w:t>
       </w:r>
-      <w:bookmarkEnd w:id="22"/>
     </w:p>
     <w:p>
       <w:pPr>
@@ -6756,19 +6831,37 @@
           <w:rFonts w:ascii="Times New Roman" w:hAnsi="Times New Roman" w:cs="Times New Roman"/>
         </w:rPr>
         <w:tab/>
-        <w:t xml:space="preserve">This method functions to extract facial image features to gain the Euclidean distance value served as input face comparison value of the users’ faces stored in the database (Hidayat, Wibowo, Satria, Winursito, 2021). Simply put, the template based approach transforms an image into geometric primitives like curves and points. This is done by identifying distinctive features like the eye, the nose, the chin, and the mouth before measuring their relative positions, widths and other parameters of the distinctive features. Features extracted from an image are then compared to known features of a human face to check whether an image is that of a human face. For further elucidation the eye, nose, mouth and the chin are compared to that of a human face. If the features obtained from the image match those of a human face, then the object in question is declared to be a human face. It is vital to note that Hidayat, et al., (2021) assert that the template approach of facial recognition is known to have a lighter computational load than other methods because it does not require features from the entire face. </w:t>
-      </w:r>
-    </w:p>
-    <w:p>
-      <w:pPr>
-        <w:pStyle w:val="Heading5"/>
-      </w:pPr>
-      <w:bookmarkStart w:id="23" w:name="_Toc177409492"/>
-      <w:r>
-        <w:lastRenderedPageBreak/>
+        <w:t xml:space="preserve">This method functions to extract facial image features to gain the Euclidean distance value served as input face comparison value of the users’ faces stored in the database (Hidayat, Wibowo, Satria, Winursito, 2021). Simply put, the </w:t>
+      </w:r>
+      <w:proofErr w:type="gramStart"/>
+      <w:r>
+        <w:rPr>
+          <w:rFonts w:ascii="Times New Roman" w:hAnsi="Times New Roman" w:cs="Times New Roman"/>
+        </w:rPr>
+        <w:t>template based</w:t>
+      </w:r>
+      <w:proofErr w:type="gramEnd"/>
+      <w:r>
+        <w:rPr>
+          <w:rFonts w:ascii="Times New Roman" w:hAnsi="Times New Roman" w:cs="Times New Roman"/>
+        </w:rPr>
+        <w:t xml:space="preserve"> approach transforms an image into geometric primitives like curves and points. This is done by identifying distinctive features like the eye, the nose, the chin, and the mouth before measuring their relative positions, widths and other parameters of the distinctive features. Features extracted from an image are then compared to known features of a human face to check whether an image is that of a human face. For further elucidation the eye, nose, mouth and the chin are compared to that of a human face. If the features obtained from the image match those of a human face, then the object in question is declared to be a human face. It is vital to note that Hidayat, et al., (2021) assert that the template approach of facial recognition is known to have a lighter computational load than other methods because it does not require features from the entire face. </w:t>
+      </w:r>
+    </w:p>
+    <w:p>
+      <w:pPr>
+        <w:rPr>
+          <w:b/>
+          <w:bCs/>
+        </w:rPr>
+      </w:pPr>
+      <w:r>
+        <w:rPr>
+          <w:b/>
+          <w:bCs/>
+        </w:rPr>
         <w:t>The Appearance Based Approach of Facial Detection</w:t>
       </w:r>
-      <w:bookmarkEnd w:id="23"/>
     </w:p>
     <w:p>
       <w:pPr>
@@ -6779,8 +6872,58 @@
         <w:rPr>
           <w:rFonts w:ascii="Times New Roman" w:hAnsi="Times New Roman" w:cs="Times New Roman"/>
         </w:rPr>
+        <w:lastRenderedPageBreak/>
         <w:tab/>
-        <w:t>The idea behind using Appearance methods for face detection relies on the linear algebra concept of subspaces. This approach of facial detection relies on the entire face, which is taken in as an input image data. The data collected from the input image is processed into a two dimensional pattern that is later used to decide whether there is a human face in an image. Critical to the discussion is the fact that this technique finds the best facial features because it rejects redundant information and keeps important information. Vital to the discussion is the fact that different authors have used the appearance based technique successfully. For example, Rusia and Singh (2023) used the appearance based technique of facial recognition and examined some of the face identity threats faced by this technique. Regardless, Yan et al., (2018) argues that appearance</w:t>
+        <w:t xml:space="preserve">The idea behind using Appearance methods for face detection relies on the linear algebra concept of subspaces. This approach of facial detection relies on the entire face, which is taken in as an input image data. The data collected from the input image is processed into a </w:t>
+      </w:r>
+      <w:proofErr w:type="gramStart"/>
+      <w:r>
+        <w:rPr>
+          <w:rFonts w:ascii="Times New Roman" w:hAnsi="Times New Roman" w:cs="Times New Roman"/>
+        </w:rPr>
+        <w:t>two dimensional</w:t>
+      </w:r>
+      <w:proofErr w:type="gramEnd"/>
+      <w:r>
+        <w:rPr>
+          <w:rFonts w:ascii="Times New Roman" w:hAnsi="Times New Roman" w:cs="Times New Roman"/>
+        </w:rPr>
+        <w:t xml:space="preserve"> pattern that is later used to decide whether there is a human face in an image. Critical to the discussion is the fact that this technique finds the best facial features because it rejects redundant information and keeps important information. Vital to the discussion is the fact that different authors have used the </w:t>
+      </w:r>
+      <w:proofErr w:type="gramStart"/>
+      <w:r>
+        <w:rPr>
+          <w:rFonts w:ascii="Times New Roman" w:hAnsi="Times New Roman" w:cs="Times New Roman"/>
+        </w:rPr>
+        <w:t>appearance based</w:t>
+      </w:r>
+      <w:proofErr w:type="gramEnd"/>
+      <w:r>
+        <w:rPr>
+          <w:rFonts w:ascii="Times New Roman" w:hAnsi="Times New Roman" w:cs="Times New Roman"/>
+        </w:rPr>
+        <w:t xml:space="preserve"> technique successfully. For example, Rusia and Singh (2023) used the </w:t>
+      </w:r>
+      <w:proofErr w:type="gramStart"/>
+      <w:r>
+        <w:rPr>
+          <w:rFonts w:ascii="Times New Roman" w:hAnsi="Times New Roman" w:cs="Times New Roman"/>
+        </w:rPr>
+        <w:t>appearance based</w:t>
+      </w:r>
+      <w:proofErr w:type="gramEnd"/>
+      <w:r>
+        <w:rPr>
+          <w:rFonts w:ascii="Times New Roman" w:hAnsi="Times New Roman" w:cs="Times New Roman"/>
+        </w:rPr>
+        <w:t xml:space="preserve"> technique of facial recognition and examined some of the face identity threats faced by this technique. Regardless, Yan et al., (2018) argues that </w:t>
+      </w:r>
+      <w:proofErr w:type="gramStart"/>
+      <w:r>
+        <w:rPr>
+          <w:rFonts w:ascii="Times New Roman" w:hAnsi="Times New Roman" w:cs="Times New Roman"/>
+        </w:rPr>
+        <w:t>appearance</w:t>
       </w:r>
       <w:r>
         <w:rPr>
@@ -6792,18 +6935,25 @@
         <w:rPr>
           <w:rFonts w:ascii="Times New Roman" w:hAnsi="Times New Roman" w:cs="Times New Roman"/>
         </w:rPr>
-        <w:t xml:space="preserve">based methods are computationally expensive and have difficulty handling substantial amounts of facial variations. </w:t>
+        <w:t>based</w:t>
+      </w:r>
+      <w:proofErr w:type="gramEnd"/>
+      <w:r>
+        <w:rPr>
+          <w:rFonts w:ascii="Times New Roman" w:hAnsi="Times New Roman" w:cs="Times New Roman"/>
+        </w:rPr>
+        <w:t xml:space="preserve"> methods are computationally expensive and have difficulty handling substantial amounts of facial variations. </w:t>
       </w:r>
     </w:p>
     <w:p>
       <w:pPr>
         <w:pStyle w:val="Heading3"/>
       </w:pPr>
-      <w:bookmarkStart w:id="24" w:name="_Toc177409493"/>
+      <w:bookmarkStart w:id="22" w:name="_Toc178527549"/>
       <w:r>
         <w:t>Face Identification Approaches</w:t>
       </w:r>
-      <w:bookmarkEnd w:id="24"/>
+      <w:bookmarkEnd w:id="22"/>
     </w:p>
     <w:p>
       <w:pPr>
@@ -6818,16 +6968,58 @@
           <w:rFonts w:ascii="Times New Roman" w:hAnsi="Times New Roman" w:cs="Times New Roman"/>
         </w:rPr>
         <w:tab/>
-        <w:t>As already mentioned, facial recognition is a two-step process with the first face being the face detection and the second step being the face identification step. The face identification phase is where facial characteristics are extracted from a detected face and compared to a known face to confirm if the facial characteristics match those of the known face. Evidence from literature suggests that the template approach and the appearance based approaches are not only used in face detection but could also be used in face identification. As evidenced, Proyecto (2010) discusses template matching and the appearance based technique in both face detection and face identification. It is important to highlight that different publications on techniques that are used in face identification exist.  Apart from template matching and appearance based methods, statistical approaches are also used in face identification.</w:t>
+        <w:t xml:space="preserve">As already mentioned, facial recognition is a two-step process with the first face being the face detection and the second step being the face identification step. The face identification phase is where facial characteristics are extracted from a detected face and compared to a known face to confirm if the facial characteristics match those of the known face. Evidence from literature suggests that the template approach and the </w:t>
+      </w:r>
+      <w:proofErr w:type="gramStart"/>
+      <w:r>
+        <w:rPr>
+          <w:rFonts w:ascii="Times New Roman" w:hAnsi="Times New Roman" w:cs="Times New Roman"/>
+        </w:rPr>
+        <w:t>appearance based</w:t>
+      </w:r>
+      <w:proofErr w:type="gramEnd"/>
+      <w:r>
+        <w:rPr>
+          <w:rFonts w:ascii="Times New Roman" w:hAnsi="Times New Roman" w:cs="Times New Roman"/>
+        </w:rPr>
+        <w:t xml:space="preserve"> approaches are not only used in face detection but could also be used in face identification. As evidenced, Proyecto (2010) discusses template matching and the </w:t>
+      </w:r>
+      <w:proofErr w:type="gramStart"/>
+      <w:r>
+        <w:rPr>
+          <w:rFonts w:ascii="Times New Roman" w:hAnsi="Times New Roman" w:cs="Times New Roman"/>
+        </w:rPr>
+        <w:t>appearance based</w:t>
+      </w:r>
+      <w:proofErr w:type="gramEnd"/>
+      <w:r>
+        <w:rPr>
+          <w:rFonts w:ascii="Times New Roman" w:hAnsi="Times New Roman" w:cs="Times New Roman"/>
+        </w:rPr>
+        <w:t xml:space="preserve"> technique in both face detection and face identification. It is important to highlight that different publications on techniques that are used in face identification exist.  Apart from template matching and </w:t>
+      </w:r>
+      <w:proofErr w:type="gramStart"/>
+      <w:r>
+        <w:rPr>
+          <w:rFonts w:ascii="Times New Roman" w:hAnsi="Times New Roman" w:cs="Times New Roman"/>
+        </w:rPr>
+        <w:t>appearance based</w:t>
+      </w:r>
+      <w:proofErr w:type="gramEnd"/>
+      <w:r>
+        <w:rPr>
+          <w:rFonts w:ascii="Times New Roman" w:hAnsi="Times New Roman" w:cs="Times New Roman"/>
+        </w:rPr>
+        <w:t xml:space="preserve"> methods, statistical approaches are also used in face identification.</w:t>
       </w:r>
     </w:p>
     <w:p>
       <w:pPr>
         <w:pStyle w:val="Heading4"/>
       </w:pPr>
-      <w:bookmarkStart w:id="25" w:name="_heading=h.xkn7eq5w1o4"/>
-      <w:bookmarkStart w:id="26" w:name="_Toc177409494"/>
-      <w:bookmarkEnd w:id="25"/>
+      <w:bookmarkStart w:id="23" w:name="_heading=h.xkn7eq5w1o4"/>
+      <w:bookmarkStart w:id="24" w:name="_Toc178527550"/>
+      <w:bookmarkEnd w:id="23"/>
       <w:r>
         <w:t>Template Matching</w:t>
       </w:r>
@@ -6837,7 +7029,7 @@
       <w:r>
         <w:t>/ Geometric Approaches</w:t>
       </w:r>
-      <w:bookmarkEnd w:id="26"/>
+      <w:bookmarkEnd w:id="24"/>
     </w:p>
     <w:p>
       <w:pPr>
@@ -6849,14 +7041,14 @@
           <w:rFonts w:ascii="Times New Roman" w:hAnsi="Times New Roman" w:cs="Times New Roman"/>
         </w:rPr>
         <w:tab/>
-        <w:t xml:space="preserve">The template matching or the geometric approach of facial recognition is similar to the template matching of the face detection step. However, the objective of the facial recognition step is </w:t>
+        <w:t xml:space="preserve">The template matching or the geometric approach of facial recognition is similar to the template matching of the face detection step. However, the objective of the facial recognition step is different from the objective in the face identification step. This owes to the reality that the objective </w:t>
       </w:r>
       <w:r>
         <w:rPr>
           <w:rFonts w:ascii="Times New Roman" w:hAnsi="Times New Roman" w:cs="Times New Roman"/>
         </w:rPr>
         <w:lastRenderedPageBreak/>
-        <w:t xml:space="preserve">different from the objective in the face identification step. This owes to the reality that the objective of the facial recognition step is to match a face to a known person while the objective in the face detection step is to identify whether an object in an image is a human face or not. Like in the face detection step, features like the eye, the nose, the chin, and the mouth are extracted from a human face before matching the features in question to a known face. Consider a face </w:t>
+        <w:t xml:space="preserve">of the facial recognition step is to match a face to a known person while the objective in the face detection step is to identify whether an object in an image is a human face or not. Like in the face detection step, features like the eye, the nose, the chin, and the mouth are extracted from a human face before matching the features in question to a known face. Consider a face </w:t>
       </w:r>
       <w:r>
         <w:rPr>
@@ -7008,13 +7200,13 @@
       <w:pPr>
         <w:pStyle w:val="Heading4"/>
       </w:pPr>
-      <w:bookmarkStart w:id="27" w:name="_heading=h.603n9ogh56ag"/>
-      <w:bookmarkStart w:id="28" w:name="_Toc177409495"/>
-      <w:bookmarkEnd w:id="27"/>
+      <w:bookmarkStart w:id="25" w:name="_heading=h.603n9ogh56ag"/>
+      <w:bookmarkStart w:id="26" w:name="_Toc178527551"/>
+      <w:bookmarkEnd w:id="25"/>
       <w:r>
         <w:t>Appearance Based Methods</w:t>
       </w:r>
-      <w:bookmarkEnd w:id="28"/>
+      <w:bookmarkEnd w:id="26"/>
     </w:p>
     <w:p>
       <w:pPr>
@@ -7026,14 +7218,14 @@
           <w:rFonts w:ascii="Times New Roman" w:hAnsi="Times New Roman" w:cs="Times New Roman"/>
         </w:rPr>
         <w:tab/>
-        <w:t xml:space="preserve">Appearance based methods of face identification work the same way they work for face detection with the difference being the purpose of the method. This owes to the fact that the entire face is used to identify a face but with an aim of matching a face to that of a known person. It is important to highlight that this technique could be classified into linear and non-linear methods. </w:t>
+        <w:t xml:space="preserve">Appearance based methods of face identification work the same way they work for face detection with the difference being the purpose of the method. This owes to the fact that the entire face is used to identify a face but with an aim of matching a face to that of a known person. It is important to highlight that this technique could be classified into linear and non-linear methods. Examples of linear methods include principal components analysis, independent component analysis, </w:t>
       </w:r>
       <w:r>
         <w:rPr>
           <w:rFonts w:ascii="Times New Roman" w:hAnsi="Times New Roman" w:cs="Times New Roman"/>
         </w:rPr>
         <w:lastRenderedPageBreak/>
-        <w:t xml:space="preserve">Examples of linear methods include principal components analysis, independent component analysis, linear discriminant analysis, and linear regression classifier. Non-linear methods include kernel principal component analysis, local linear embedding, and kernel linear discriminant analysis. In a nonlinear approach the input image is mapped into higher dimensional space in which the face is simplified and linear. In principal component analysis a number of images are taken using gray levels. Each image is mapped to a long vector of gray levels. Several views of each person are collected in the database during training. During recognition a vector corresponding to an unknown face is compared with all vectors in the database (Viegas et al., 2019). </w:t>
+        <w:t xml:space="preserve">linear discriminant analysis, and linear regression classifier. Non-linear methods include kernel principal component analysis, local linear embedding, and kernel linear discriminant analysis. In a nonlinear approach the input image is mapped into higher dimensional space in which the face is simplified and linear. In principal component analysis a number of images are taken using gray levels. Each image is mapped to a long vector of gray levels. Several views of each person are collected in the database during training. During recognition a vector corresponding to an unknown face is compared with all vectors in the database (Viegas et al., 2019). </w:t>
       </w:r>
     </w:p>
     <w:p>
@@ -7049,7 +7241,49 @@
           <w:rFonts w:ascii="Times New Roman" w:hAnsi="Times New Roman" w:cs="Times New Roman"/>
         </w:rPr>
         <w:tab/>
-        <w:t xml:space="preserve">It is imperative to mention that several authors have investigated the appearance based method for facial recognition. For instance, Struc and Pavesic (2009) examine the performance of appearance based methods subject to different environmental factors and conclude that the linear discriminant analysis produces the best results across different environmental conditions. Wu et al., (2018) also debate appearance based methods of facial recognition by examining facial expressions using the technique in question. The authors controlled for lighting conditions using a histogram equalization technique and a brightness preserving technique and concluded that the brightness preserving technique performs better than the histogram equalization technique. </w:t>
+        <w:t xml:space="preserve">It is imperative to mention that several authors have investigated the </w:t>
+      </w:r>
+      <w:proofErr w:type="gramStart"/>
+      <w:r>
+        <w:rPr>
+          <w:rFonts w:ascii="Times New Roman" w:hAnsi="Times New Roman" w:cs="Times New Roman"/>
+        </w:rPr>
+        <w:t>appearance based</w:t>
+      </w:r>
+      <w:proofErr w:type="gramEnd"/>
+      <w:r>
+        <w:rPr>
+          <w:rFonts w:ascii="Times New Roman" w:hAnsi="Times New Roman" w:cs="Times New Roman"/>
+        </w:rPr>
+        <w:t xml:space="preserve"> method for facial recognition. For instance, Struc and Pavesic (2009) examine the performance of </w:t>
+      </w:r>
+      <w:proofErr w:type="gramStart"/>
+      <w:r>
+        <w:rPr>
+          <w:rFonts w:ascii="Times New Roman" w:hAnsi="Times New Roman" w:cs="Times New Roman"/>
+        </w:rPr>
+        <w:t>appearance based</w:t>
+      </w:r>
+      <w:proofErr w:type="gramEnd"/>
+      <w:r>
+        <w:rPr>
+          <w:rFonts w:ascii="Times New Roman" w:hAnsi="Times New Roman" w:cs="Times New Roman"/>
+        </w:rPr>
+        <w:t xml:space="preserve"> methods subject to different environmental factors and conclude that the linear discriminant analysis produces the best results across different environmental conditions. Wu et al., (2018) also debate </w:t>
+      </w:r>
+      <w:proofErr w:type="gramStart"/>
+      <w:r>
+        <w:rPr>
+          <w:rFonts w:ascii="Times New Roman" w:hAnsi="Times New Roman" w:cs="Times New Roman"/>
+        </w:rPr>
+        <w:t>appearance based</w:t>
+      </w:r>
+      <w:proofErr w:type="gramEnd"/>
+      <w:r>
+        <w:rPr>
+          <w:rFonts w:ascii="Times New Roman" w:hAnsi="Times New Roman" w:cs="Times New Roman"/>
+        </w:rPr>
+        <w:t xml:space="preserve"> methods of facial recognition by examining facial expressions using the technique in question. The authors controlled for lighting conditions using a histogram equalization technique and a brightness preserving technique and concluded that the brightness preserving technique performs better than the histogram equalization technique. </w:t>
       </w:r>
       <w:proofErr w:type="spellStart"/>
       <w:r>
@@ -7063,28 +7297,42 @@
         <w:rPr>
           <w:rFonts w:ascii="Times New Roman" w:hAnsi="Times New Roman" w:cs="Times New Roman"/>
         </w:rPr>
-        <w:t xml:space="preserve"> (2019) also examines appearance based methods of facial recognition by discussing the principal components analysis, independent component analysis, linear discriminant analysis methods used in facial recognition. A drawback for this method is that it is challenging to find an efficient combination of dimensionality reduction technique and classifier. </w:t>
-      </w:r>
-      <w:bookmarkStart w:id="29" w:name="_heading=h.ljdder1spgws"/>
+        <w:t xml:space="preserve"> (2019) also examines </w:t>
+      </w:r>
+      <w:proofErr w:type="gramStart"/>
+      <w:r>
+        <w:rPr>
+          <w:rFonts w:ascii="Times New Roman" w:hAnsi="Times New Roman" w:cs="Times New Roman"/>
+        </w:rPr>
+        <w:t>appearance based</w:t>
+      </w:r>
+      <w:proofErr w:type="gramEnd"/>
+      <w:r>
+        <w:rPr>
+          <w:rFonts w:ascii="Times New Roman" w:hAnsi="Times New Roman" w:cs="Times New Roman"/>
+        </w:rPr>
+        <w:t xml:space="preserve"> methods of facial recognition by discussing the principal components analysis, independent component analysis, linear discriminant analysis methods used in facial recognition. A drawback for this method is that it is challenging to find an efficient combination of dimensionality reduction technique and classifier. </w:t>
+      </w:r>
+      <w:bookmarkStart w:id="27" w:name="_heading=h.ljdder1spgws"/>
+      <w:bookmarkEnd w:id="27"/>
+    </w:p>
+    <w:p>
+      <w:pPr>
+        <w:pStyle w:val="Heading2"/>
+      </w:pPr>
+      <w:bookmarkStart w:id="28" w:name="_heading=h.9gict8km0erz"/>
+      <w:bookmarkStart w:id="29" w:name="_Toc178527552"/>
+      <w:bookmarkEnd w:id="28"/>
+      <w:r>
+        <w:t xml:space="preserve">Types </w:t>
+      </w:r>
+      <w:r>
+        <w:t xml:space="preserve">of </w:t>
+      </w:r>
+      <w:r>
+        <w:t>Neural Networks</w:t>
+      </w:r>
       <w:bookmarkEnd w:id="29"/>
-    </w:p>
-    <w:p>
-      <w:pPr>
-        <w:pStyle w:val="Heading2"/>
-      </w:pPr>
-      <w:bookmarkStart w:id="30" w:name="_heading=h.9gict8km0erz"/>
-      <w:bookmarkStart w:id="31" w:name="_Toc177409496"/>
-      <w:bookmarkEnd w:id="30"/>
-      <w:r>
-        <w:t xml:space="preserve">Types </w:t>
-      </w:r>
-      <w:r>
-        <w:t xml:space="preserve">of </w:t>
-      </w:r>
-      <w:r>
-        <w:t>Neural Networks</w:t>
-      </w:r>
-      <w:bookmarkEnd w:id="31"/>
     </w:p>
     <w:p>
       <w:pPr>
@@ -7113,13 +7361,13 @@
       <w:pPr>
         <w:pStyle w:val="Heading3"/>
       </w:pPr>
-      <w:bookmarkStart w:id="32" w:name="_heading=h.wgtdmttqie3v"/>
-      <w:bookmarkStart w:id="33" w:name="_Toc177409497"/>
-      <w:bookmarkEnd w:id="32"/>
+      <w:bookmarkStart w:id="30" w:name="_heading=h.wgtdmttqie3v"/>
+      <w:bookmarkStart w:id="31" w:name="_Toc178527553"/>
+      <w:bookmarkEnd w:id="30"/>
       <w:r>
         <w:t>Multiple Layer Neural Network</w:t>
       </w:r>
-      <w:bookmarkEnd w:id="33"/>
+      <w:bookmarkEnd w:id="31"/>
     </w:p>
     <w:p>
       <w:pPr>
@@ -7252,11 +7500,11 @@
       <w:pPr>
         <w:pStyle w:val="Heading3"/>
       </w:pPr>
-      <w:bookmarkStart w:id="34" w:name="_Toc177409498"/>
+      <w:bookmarkStart w:id="32" w:name="_Toc178527554"/>
       <w:r>
         <w:t>Convolution Neural Networks</w:t>
       </w:r>
-      <w:bookmarkEnd w:id="34"/>
+      <w:bookmarkEnd w:id="32"/>
     </w:p>
     <w:p>
       <w:pPr>
@@ -7364,11 +7612,11 @@
       <w:pPr>
         <w:pStyle w:val="Heading4"/>
       </w:pPr>
-      <w:bookmarkStart w:id="35" w:name="_Toc177409499"/>
+      <w:bookmarkStart w:id="33" w:name="_Toc178527555"/>
       <w:r>
         <w:t>Padding in Convolution Neural Networks</w:t>
       </w:r>
-      <w:bookmarkEnd w:id="35"/>
+      <w:bookmarkEnd w:id="33"/>
     </w:p>
     <w:p>
       <w:pPr>
@@ -7399,14 +7647,19 @@
     </w:p>
     <w:p>
       <w:pPr>
-        <w:pStyle w:val="Heading5"/>
-      </w:pPr>
-      <w:bookmarkStart w:id="36" w:name="_Toc177409500"/>
-      <w:r>
+        <w:rPr>
+          <w:b/>
+          <w:bCs/>
+        </w:rPr>
+      </w:pPr>
+      <w:r>
+        <w:rPr>
+          <w:b/>
+          <w:bCs/>
+        </w:rPr>
         <w:lastRenderedPageBreak/>
         <w:t>Types of Padding</w:t>
       </w:r>
-      <w:bookmarkEnd w:id="36"/>
     </w:p>
     <w:p>
       <w:pPr>
@@ -7514,7 +7767,7 @@
                                 <w:noProof/>
                               </w:rPr>
                             </w:pPr>
-                            <w:bookmarkStart w:id="37" w:name="_Toc177418714"/>
+                            <w:bookmarkStart w:id="34" w:name="_Toc177418714"/>
                             <w:r>
                               <w:t xml:space="preserve">Figure </w:t>
                             </w:r>
@@ -7560,7 +7813,7 @@
                             <w:r>
                               <w:t>: Zero Padding</w:t>
                             </w:r>
-                            <w:bookmarkEnd w:id="37"/>
+                            <w:bookmarkEnd w:id="34"/>
                           </w:p>
                         </w:txbxContent>
                       </wps:txbx>
@@ -7592,7 +7845,7 @@
                           <w:noProof/>
                         </w:rPr>
                       </w:pPr>
-                      <w:bookmarkStart w:id="38" w:name="_Toc177418714"/>
+                      <w:bookmarkStart w:id="35" w:name="_Toc177418714"/>
                       <w:r>
                         <w:t xml:space="preserve">Figure </w:t>
                       </w:r>
@@ -7638,7 +7891,7 @@
                       <w:r>
                         <w:t>: Zero Padding</w:t>
                       </w:r>
-                      <w:bookmarkEnd w:id="38"/>
+                      <w:bookmarkEnd w:id="35"/>
                     </w:p>
                   </w:txbxContent>
                 </v:textbox>
@@ -7861,7 +8114,7 @@
                                 <w:color w:val="000000"/>
                               </w:rPr>
                             </w:pPr>
-                            <w:bookmarkStart w:id="39" w:name="_Toc177418715"/>
+                            <w:bookmarkStart w:id="36" w:name="_Toc177418715"/>
                             <w:r>
                               <w:t xml:space="preserve">Figure </w:t>
                             </w:r>
@@ -7907,7 +8160,7 @@
                             <w:r>
                               <w:t>: Reflection Padding</w:t>
                             </w:r>
-                            <w:bookmarkEnd w:id="39"/>
+                            <w:bookmarkEnd w:id="36"/>
                           </w:p>
                         </w:txbxContent>
                       </wps:txbx>
@@ -7936,7 +8189,7 @@
                           <w:color w:val="000000"/>
                         </w:rPr>
                       </w:pPr>
-                      <w:bookmarkStart w:id="40" w:name="_Toc177418715"/>
+                      <w:bookmarkStart w:id="37" w:name="_Toc177418715"/>
                       <w:r>
                         <w:t xml:space="preserve">Figure </w:t>
                       </w:r>
@@ -7982,7 +8235,7 @@
                       <w:r>
                         <w:t>: Reflection Padding</w:t>
                       </w:r>
-                      <w:bookmarkEnd w:id="40"/>
+                      <w:bookmarkEnd w:id="37"/>
                     </w:p>
                   </w:txbxContent>
                 </v:textbox>
@@ -8201,7 +8454,7 @@
                                 <w:color w:val="000000"/>
                               </w:rPr>
                             </w:pPr>
-                            <w:bookmarkStart w:id="41" w:name="_Toc177418716"/>
+                            <w:bookmarkStart w:id="38" w:name="_Toc177418716"/>
                             <w:r>
                               <w:t xml:space="preserve">Figure </w:t>
                             </w:r>
@@ -8247,7 +8500,7 @@
                             <w:r>
                               <w:t>: Replication Padding</w:t>
                             </w:r>
-                            <w:bookmarkEnd w:id="41"/>
+                            <w:bookmarkEnd w:id="38"/>
                           </w:p>
                         </w:txbxContent>
                       </wps:txbx>
@@ -8276,7 +8529,7 @@
                           <w:color w:val="000000"/>
                         </w:rPr>
                       </w:pPr>
-                      <w:bookmarkStart w:id="42" w:name="_Toc177418716"/>
+                      <w:bookmarkStart w:id="39" w:name="_Toc177418716"/>
                       <w:r>
                         <w:t xml:space="preserve">Figure </w:t>
                       </w:r>
@@ -8322,7 +8575,7 @@
                       <w:r>
                         <w:t>: Replication Padding</w:t>
                       </w:r>
-                      <w:bookmarkEnd w:id="42"/>
+                      <w:bookmarkEnd w:id="39"/>
                     </w:p>
                   </w:txbxContent>
                 </v:textbox>
@@ -8551,7 +8804,7 @@
                                 <w:color w:val="000000"/>
                               </w:rPr>
                             </w:pPr>
-                            <w:bookmarkStart w:id="43" w:name="_Toc177418717"/>
+                            <w:bookmarkStart w:id="40" w:name="_Toc177418717"/>
                             <w:r>
                               <w:t xml:space="preserve">Figure </w:t>
                             </w:r>
@@ -8597,7 +8850,7 @@
                             <w:r>
                               <w:t>: Circular Padding</w:t>
                             </w:r>
-                            <w:bookmarkEnd w:id="43"/>
+                            <w:bookmarkEnd w:id="40"/>
                           </w:p>
                         </w:txbxContent>
                       </wps:txbx>
@@ -8626,7 +8879,7 @@
                           <w:color w:val="000000"/>
                         </w:rPr>
                       </w:pPr>
-                      <w:bookmarkStart w:id="44" w:name="_Toc177418717"/>
+                      <w:bookmarkStart w:id="41" w:name="_Toc177418717"/>
                       <w:r>
                         <w:t xml:space="preserve">Figure </w:t>
                       </w:r>
@@ -8672,7 +8925,7 @@
                       <w:r>
                         <w:t>: Circular Padding</w:t>
                       </w:r>
-                      <w:bookmarkEnd w:id="44"/>
+                      <w:bookmarkEnd w:id="41"/>
                     </w:p>
                   </w:txbxContent>
                 </v:textbox>
@@ -8874,7 +9127,7 @@
                                 <w:noProof/>
                               </w:rPr>
                             </w:pPr>
-                            <w:bookmarkStart w:id="45" w:name="_Toc177418718"/>
+                            <w:bookmarkStart w:id="42" w:name="_Toc177418718"/>
                             <w:r>
                               <w:t xml:space="preserve">Figure </w:t>
                             </w:r>
@@ -8920,7 +9173,7 @@
                             <w:r>
                               <w:t>: Sequence Padding</w:t>
                             </w:r>
-                            <w:bookmarkEnd w:id="45"/>
+                            <w:bookmarkEnd w:id="42"/>
                           </w:p>
                         </w:txbxContent>
                       </wps:txbx>
@@ -8948,7 +9201,7 @@
                           <w:noProof/>
                         </w:rPr>
                       </w:pPr>
-                      <w:bookmarkStart w:id="46" w:name="_Toc177418718"/>
+                      <w:bookmarkStart w:id="43" w:name="_Toc177418718"/>
                       <w:r>
                         <w:t xml:space="preserve">Figure </w:t>
                       </w:r>
@@ -8994,7 +9247,7 @@
                       <w:r>
                         <w:t>: Sequence Padding</w:t>
                       </w:r>
-                      <w:bookmarkEnd w:id="46"/>
+                      <w:bookmarkEnd w:id="43"/>
                     </w:p>
                   </w:txbxContent>
                 </v:textbox>
@@ -9059,7 +9312,21 @@
           <w:color w:val="000000"/>
         </w:rPr>
         <w:tab/>
-        <w:t xml:space="preserve">An array of studies have been published either introducing new padding strategies or applying the already existing padding techniques on different problems. For </w:t>
+        <w:t xml:space="preserve">An array of studies </w:t>
+      </w:r>
+      <w:proofErr w:type="gramStart"/>
+      <w:r>
+        <w:rPr>
+          <w:color w:val="000000"/>
+        </w:rPr>
+        <w:t>have</w:t>
+      </w:r>
+      <w:proofErr w:type="gramEnd"/>
+      <w:r>
+        <w:rPr>
+          <w:color w:val="000000"/>
+        </w:rPr>
+        <w:t xml:space="preserve"> been published either introducing new padding strategies or applying the already existing padding techniques on different problems. For </w:t>
       </w:r>
       <w:r>
         <w:rPr>
@@ -9148,13 +9415,27 @@
         <w:rPr>
           <w:color w:val="000000"/>
         </w:rPr>
-        <w:t>-padding and pre-padding improve the accuracy of LSTMs but not CNNs because the architecture of CNNs forgets effects of time series variations. Tang et al., (2019) also investigate the effect of invalid and same padding using Pre-</w:t>
-      </w:r>
+        <w:t xml:space="preserve">-padding and pre-padding improve the accuracy of LSTMs but not CNNs because the architecture of CNNs forgets effects of time series variations. Tang et al., (2019) also investigate the effect of invalid and same padding using </w:t>
+      </w:r>
+      <w:proofErr w:type="gramStart"/>
       <w:r>
         <w:rPr>
           <w:color w:val="000000"/>
         </w:rPr>
-        <w:t>trained CNNs</w:t>
+        <w:t>Pre-</w:t>
+      </w:r>
+      <w:r>
+        <w:rPr>
+          <w:color w:val="000000"/>
+        </w:rPr>
+        <w:t>trained</w:t>
+      </w:r>
+      <w:proofErr w:type="gramEnd"/>
+      <w:r>
+        <w:rPr>
+          <w:color w:val="000000"/>
+        </w:rPr>
+        <w:t xml:space="preserve"> CNNs</w:t>
       </w:r>
       <w:r>
         <w:rPr>
@@ -9242,14 +9523,14 @@
       <w:r>
         <w:t xml:space="preserve"> </w:t>
       </w:r>
-      <w:bookmarkStart w:id="47" w:name="_Toc177409501"/>
+      <w:bookmarkStart w:id="44" w:name="_Toc178527556"/>
       <w:r>
         <w:rPr>
           <w:lang w:val="en-KE"/>
         </w:rPr>
         <w:t>Facial Recognition Datasets</w:t>
       </w:r>
-      <w:bookmarkEnd w:id="47"/>
+      <w:bookmarkEnd w:id="44"/>
     </w:p>
     <w:p>
       <w:pPr>
@@ -9266,11 +9547,19 @@
         <w:tab/>
         <w:t xml:space="preserve">An array of studies </w:t>
       </w:r>
+      <w:proofErr w:type="gramStart"/>
       <w:r>
         <w:rPr>
           <w:lang w:val="en-KE"/>
         </w:rPr>
-        <w:t>have been</w:t>
+        <w:t>have</w:t>
+      </w:r>
+      <w:proofErr w:type="gramEnd"/>
+      <w:r>
+        <w:rPr>
+          <w:lang w:val="en-KE"/>
+        </w:rPr>
+        <w:t xml:space="preserve"> been</w:t>
       </w:r>
       <w:r>
         <w:rPr>
@@ -9347,7 +9636,7 @@
           <w:lang w:val="en-KE"/>
         </w:rPr>
       </w:pPr>
-      <w:bookmarkStart w:id="48" w:name="_Toc177409502"/>
+      <w:bookmarkStart w:id="45" w:name="_Toc178527557"/>
       <w:r>
         <w:rPr>
           <w:lang w:val="en-KE"/>
@@ -9360,7 +9649,7 @@
         </w:rPr>
         <w:t xml:space="preserve"> Dataset</w:t>
       </w:r>
-      <w:bookmarkEnd w:id="48"/>
+      <w:bookmarkEnd w:id="45"/>
     </w:p>
     <w:p>
       <w:pPr>
@@ -9451,14 +9740,14 @@
           <w:lang w:val="en-KE"/>
         </w:rPr>
       </w:pPr>
-      <w:bookmarkStart w:id="49" w:name="_Toc177409503"/>
+      <w:bookmarkStart w:id="46" w:name="_Toc178527558"/>
       <w:r>
         <w:rPr>
           <w:lang w:val="en-KE"/>
         </w:rPr>
         <w:t>VGGFACE</w:t>
       </w:r>
-      <w:bookmarkEnd w:id="49"/>
+      <w:bookmarkEnd w:id="46"/>
     </w:p>
     <w:p>
       <w:pPr>
@@ -9544,14 +9833,14 @@
           <w:lang w:val="en-KE"/>
         </w:rPr>
       </w:pPr>
-      <w:bookmarkStart w:id="50" w:name="_Toc177409504"/>
+      <w:bookmarkStart w:id="47" w:name="_Toc178527559"/>
       <w:r>
         <w:rPr>
           <w:lang w:val="en-KE"/>
         </w:rPr>
         <w:t>KomNET Face Dataset</w:t>
       </w:r>
-      <w:bookmarkEnd w:id="50"/>
+      <w:bookmarkEnd w:id="47"/>
     </w:p>
     <w:p>
       <w:pPr>
@@ -9682,11 +9971,11 @@
       <w:pPr>
         <w:pStyle w:val="Heading2"/>
       </w:pPr>
-      <w:bookmarkStart w:id="51" w:name="_Toc177409505"/>
+      <w:bookmarkStart w:id="48" w:name="_Toc178527560"/>
       <w:r>
         <w:t>Facial Recognition Architectures</w:t>
       </w:r>
-      <w:bookmarkEnd w:id="51"/>
+      <w:bookmarkEnd w:id="48"/>
     </w:p>
     <w:p>
       <w:pPr>
@@ -9738,7 +10027,7 @@
           <w:lang w:val="en-KE"/>
         </w:rPr>
       </w:pPr>
-      <w:bookmarkStart w:id="52" w:name="_Toc177409506"/>
+      <w:bookmarkStart w:id="49" w:name="_Toc178527561"/>
       <w:r>
         <w:rPr>
           <w:lang w:val="en-KE"/>
@@ -9757,7 +10046,7 @@
       <w:r>
         <w:t>et</w:t>
       </w:r>
-      <w:bookmarkEnd w:id="52"/>
+      <w:bookmarkEnd w:id="49"/>
     </w:p>
     <w:p>
       <w:pPr>
@@ -9808,11 +10097,11 @@
       <w:pPr>
         <w:pStyle w:val="Heading3"/>
       </w:pPr>
-      <w:bookmarkStart w:id="53" w:name="_Toc177409507"/>
+      <w:bookmarkStart w:id="50" w:name="_Toc178527562"/>
       <w:r>
         <w:t>DeepFace</w:t>
       </w:r>
-      <w:bookmarkEnd w:id="53"/>
+      <w:bookmarkEnd w:id="50"/>
     </w:p>
     <w:p>
       <w:pPr>
@@ -9940,7 +10229,7 @@
         <w:pStyle w:val="Caption"/>
         <w:jc w:val="center"/>
       </w:pPr>
-      <w:bookmarkStart w:id="54" w:name="_Toc177418719"/>
+      <w:bookmarkStart w:id="51" w:name="_Toc177418719"/>
       <w:r>
         <w:t xml:space="preserve">Figure </w:t>
       </w:r>
@@ -9986,7 +10275,7 @@
       <w:r>
         <w:t>: Face Alignment</w:t>
       </w:r>
-      <w:bookmarkEnd w:id="54"/>
+      <w:bookmarkEnd w:id="51"/>
     </w:p>
     <w:p>
       <w:pPr>
@@ -10049,7 +10338,7 @@
           <w:rFonts w:ascii="Times New Roman" w:hAnsi="Times New Roman" w:cs="Times New Roman"/>
         </w:rPr>
       </w:pPr>
-      <w:bookmarkStart w:id="55" w:name="_Toc177409508"/>
+      <w:bookmarkStart w:id="52" w:name="_Toc178527563"/>
       <w:r>
         <w:rPr>
           <w:rFonts w:ascii="Times New Roman" w:hAnsi="Times New Roman" w:cs="Times New Roman"/>
@@ -10057,7 +10346,7 @@
         <w:lastRenderedPageBreak/>
         <w:t>Chapter Three</w:t>
       </w:r>
-      <w:bookmarkEnd w:id="55"/>
+      <w:bookmarkEnd w:id="52"/>
     </w:p>
     <w:p>
       <w:pPr>
@@ -10067,19 +10356,21 @@
           <w:numId w:val="0"/>
         </w:numPr>
       </w:pPr>
+      <w:bookmarkStart w:id="53" w:name="_Toc178527564"/>
       <w:r>
         <w:t>Methodology</w:t>
       </w:r>
+      <w:bookmarkEnd w:id="53"/>
     </w:p>
     <w:p>
       <w:pPr>
         <w:pStyle w:val="Heading2"/>
       </w:pPr>
-      <w:bookmarkStart w:id="56" w:name="_Toc177409509"/>
+      <w:bookmarkStart w:id="54" w:name="_Toc178527565"/>
       <w:r>
         <w:t>Artificial Neural Networks</w:t>
       </w:r>
-      <w:bookmarkEnd w:id="56"/>
+      <w:bookmarkEnd w:id="54"/>
     </w:p>
     <w:p>
       <w:pPr>
@@ -10091,7 +10382,21 @@
           <w:rFonts w:ascii="Times New Roman" w:hAnsi="Times New Roman" w:cs="Times New Roman"/>
         </w:rPr>
         <w:tab/>
-        <w:t>Artificial neural networks is a machine learning technique that tries to imitate the intelligence of a human brain. The human brain contains neurons that are connected to one another through axons and dendrites. The connecting region between axons and dendrites is called a synapse. The strength of synaptic connections often changes due to changes in external stimuli, which in turn influence how learning occurs in the human brain</w:t>
+        <w:t xml:space="preserve">Artificial neural networks </w:t>
+      </w:r>
+      <w:proofErr w:type="gramStart"/>
+      <w:r>
+        <w:rPr>
+          <w:rFonts w:ascii="Times New Roman" w:hAnsi="Times New Roman" w:cs="Times New Roman"/>
+        </w:rPr>
+        <w:t>is</w:t>
+      </w:r>
+      <w:proofErr w:type="gramEnd"/>
+      <w:r>
+        <w:rPr>
+          <w:rFonts w:ascii="Times New Roman" w:hAnsi="Times New Roman" w:cs="Times New Roman"/>
+        </w:rPr>
+        <w:t xml:space="preserve"> a machine learning technique that tries to imitate the intelligence of a human brain. The human brain contains neurons that are connected to one another through axons and dendrites. The connecting region between axons and dendrites is called a synapse. The strength of synaptic connections often changes due to changes in external stimuli, which in turn influence how learning occurs in the human brain</w:t>
       </w:r>
       <w:r>
         <w:rPr>
@@ -10163,7 +10468,7 @@
                                 <w:noProof/>
                               </w:rPr>
                             </w:pPr>
-                            <w:bookmarkStart w:id="57" w:name="_Toc177418720"/>
+                            <w:bookmarkStart w:id="55" w:name="_Toc177418720"/>
                             <w:r>
                               <w:t xml:space="preserve">Figure </w:t>
                             </w:r>
@@ -10209,7 +10514,7 @@
                             <w:r>
                               <w:t>: Artificial Neural Network</w:t>
                             </w:r>
-                            <w:bookmarkEnd w:id="57"/>
+                            <w:bookmarkEnd w:id="55"/>
                           </w:p>
                         </w:txbxContent>
                       </wps:txbx>
@@ -10238,7 +10543,7 @@
                           <w:noProof/>
                         </w:rPr>
                       </w:pPr>
-                      <w:bookmarkStart w:id="58" w:name="_Toc177418720"/>
+                      <w:bookmarkStart w:id="56" w:name="_Toc177418720"/>
                       <w:r>
                         <w:t xml:space="preserve">Figure </w:t>
                       </w:r>
@@ -10284,7 +10589,7 @@
                       <w:r>
                         <w:t>: Artificial Neural Network</w:t>
                       </w:r>
-                      <w:bookmarkEnd w:id="58"/>
+                      <w:bookmarkEnd w:id="56"/>
                     </w:p>
                   </w:txbxContent>
                 </v:textbox>
@@ -10986,7 +11291,7 @@
                                 <w:noProof/>
                               </w:rPr>
                             </w:pPr>
-                            <w:bookmarkStart w:id="59" w:name="_Toc177418721"/>
+                            <w:bookmarkStart w:id="57" w:name="_Toc177418721"/>
                             <w:r>
                               <w:t xml:space="preserve">Figure </w:t>
                             </w:r>
@@ -11032,7 +11337,7 @@
                             <w:r>
                               <w:t>: An Artificial Neural Network with a Bias</w:t>
                             </w:r>
-                            <w:bookmarkEnd w:id="59"/>
+                            <w:bookmarkEnd w:id="57"/>
                           </w:p>
                         </w:txbxContent>
                       </wps:txbx>
@@ -11064,7 +11369,7 @@
                           <w:noProof/>
                         </w:rPr>
                       </w:pPr>
-                      <w:bookmarkStart w:id="60" w:name="_Toc177418721"/>
+                      <w:bookmarkStart w:id="58" w:name="_Toc177418721"/>
                       <w:r>
                         <w:t xml:space="preserve">Figure </w:t>
                       </w:r>
@@ -11110,7 +11415,7 @@
                       <w:r>
                         <w:t>: An Artificial Neural Network with a Bias</w:t>
                       </w:r>
-                      <w:bookmarkEnd w:id="60"/>
+                      <w:bookmarkEnd w:id="58"/>
                     </w:p>
                   </w:txbxContent>
                 </v:textbox>
@@ -11244,7 +11549,21 @@
         <w:rPr>
           <w:rFonts w:ascii="Times New Roman" w:hAnsi="Times New Roman" w:cs="Times New Roman"/>
         </w:rPr>
-        <w:t>) multiplied by the predictor variables X(X</w:t>
+        <w:t xml:space="preserve">) multiplied by the predictor variables </w:t>
+      </w:r>
+      <w:proofErr w:type="gramStart"/>
+      <w:r>
+        <w:rPr>
+          <w:rFonts w:ascii="Times New Roman" w:hAnsi="Times New Roman" w:cs="Times New Roman"/>
+        </w:rPr>
+        <w:t>X(</w:t>
+      </w:r>
+      <w:proofErr w:type="gramEnd"/>
+      <w:r>
+        <w:rPr>
+          <w:rFonts w:ascii="Times New Roman" w:hAnsi="Times New Roman" w:cs="Times New Roman"/>
+        </w:rPr>
+        <w:t>X</w:t>
       </w:r>
       <w:r>
         <w:rPr>
@@ -11544,11 +11863,11 @@
       <w:pPr>
         <w:pStyle w:val="Heading3"/>
       </w:pPr>
-      <w:bookmarkStart w:id="61" w:name="_Toc177409510"/>
+      <w:bookmarkStart w:id="59" w:name="_Toc178527566"/>
       <w:r>
         <w:t>Deriving the Backpropagation Algorithm</w:t>
       </w:r>
-      <w:bookmarkEnd w:id="61"/>
+      <w:bookmarkEnd w:id="59"/>
     </w:p>
     <w:p>
       <w:pPr>
@@ -11602,7 +11921,6 @@
         </w:rPr>
         <w:t xml:space="preserve"> be the weight matrices denoting the value of the synaptic weight that connects the j</w:t>
       </w:r>
-      <w:proofErr w:type="spellStart"/>
       <w:r>
         <w:rPr>
           <w:rFonts w:ascii="Times New Roman" w:hAnsi="Times New Roman" w:cs="Times New Roman"/>
@@ -11610,7 +11928,6 @@
         </w:rPr>
         <w:t>th</w:t>
       </w:r>
-      <w:proofErr w:type="spellEnd"/>
       <w:r>
         <w:rPr>
           <w:rFonts w:ascii="Times New Roman" w:hAnsi="Times New Roman" w:cs="Times New Roman"/>
@@ -11693,7 +12010,6 @@
         </w:rPr>
         <w:t xml:space="preserve"> Is the synaptic weight connecting the j</w:t>
       </w:r>
-      <w:proofErr w:type="spellStart"/>
       <w:r>
         <w:rPr>
           <w:rFonts w:ascii="Times New Roman" w:hAnsi="Times New Roman" w:cs="Times New Roman"/>
@@ -11701,7 +12017,6 @@
         </w:rPr>
         <w:t>th</w:t>
       </w:r>
-      <w:proofErr w:type="spellEnd"/>
       <w:r>
         <w:rPr>
           <w:rFonts w:ascii="Times New Roman" w:hAnsi="Times New Roman" w:cs="Times New Roman"/>
@@ -11784,7 +12099,6 @@
         </w:rPr>
         <w:t xml:space="preserve"> Is the synaptic weight connecting the j</w:t>
       </w:r>
-      <w:proofErr w:type="spellStart"/>
       <w:r>
         <w:rPr>
           <w:rFonts w:ascii="Times New Roman" w:hAnsi="Times New Roman" w:cs="Times New Roman"/>
@@ -11792,7 +12106,6 @@
         </w:rPr>
         <w:t>th</w:t>
       </w:r>
-      <w:proofErr w:type="spellEnd"/>
       <w:r>
         <w:rPr>
           <w:rFonts w:ascii="Times New Roman" w:hAnsi="Times New Roman" w:cs="Times New Roman"/>
@@ -11875,7 +12188,6 @@
         </w:rPr>
         <w:t xml:space="preserve"> Is the synaptic weight connecting the j</w:t>
       </w:r>
-      <w:proofErr w:type="spellStart"/>
       <w:r>
         <w:rPr>
           <w:rFonts w:ascii="Times New Roman" w:hAnsi="Times New Roman" w:cs="Times New Roman"/>
@@ -11883,7 +12195,6 @@
         </w:rPr>
         <w:t>th</w:t>
       </w:r>
-      <w:proofErr w:type="spellEnd"/>
       <w:r>
         <w:rPr>
           <w:rFonts w:ascii="Times New Roman" w:hAnsi="Times New Roman" w:cs="Times New Roman"/>
@@ -11967,7 +12278,7 @@
         <w:pStyle w:val="Caption"/>
         <w:jc w:val="center"/>
       </w:pPr>
-      <w:bookmarkStart w:id="62" w:name="_Toc177418722"/>
+      <w:bookmarkStart w:id="60" w:name="_Toc177418722"/>
       <w:r>
         <w:t xml:space="preserve">Figure </w:t>
       </w:r>
@@ -12013,7 +12324,7 @@
       <w:r>
         <w:t>: Image Showing an Artificial Neural Network</w:t>
       </w:r>
-      <w:bookmarkEnd w:id="62"/>
+      <w:bookmarkEnd w:id="60"/>
     </w:p>
     <w:p>
       <w:pPr>
@@ -12062,14 +12373,12 @@
       <w:r>
         <w:t xml:space="preserve"> be vectors whose elements denote the weighted inputs of the j</w:t>
       </w:r>
-      <w:proofErr w:type="spellStart"/>
       <w:r>
         <w:rPr>
           <w:vertAlign w:val="superscript"/>
         </w:rPr>
         <w:t>th</w:t>
       </w:r>
-      <w:proofErr w:type="spellEnd"/>
       <w:r>
         <w:t xml:space="preserve"> neuron of layer L and are defined as the following.</w:t>
       </w:r>
@@ -14859,14 +15168,12 @@
       <w:r>
         <w:t xml:space="preserve">  is the value produced by the jth output neuron of the network for the k</w:t>
       </w:r>
-      <w:proofErr w:type="spellStart"/>
       <w:r>
         <w:rPr>
           <w:vertAlign w:val="superscript"/>
         </w:rPr>
         <w:t>th</w:t>
       </w:r>
-      <w:proofErr w:type="spellEnd"/>
       <w:r>
         <w:t xml:space="preserve"> training sample, while </w:t>
       </w:r>
@@ -16407,8 +16714,17 @@
           <w:i w:val="0"/>
           <w:iCs w:val="0"/>
         </w:rPr>
-        <w:t xml:space="preserve">      (</w:t>
-      </w:r>
+        <w:t xml:space="preserve">   </w:t>
+      </w:r>
+      <w:proofErr w:type="gramStart"/>
+      <w:r>
+        <w:rPr>
+          <w:i w:val="0"/>
+          <w:iCs w:val="0"/>
+        </w:rPr>
+        <w:t xml:space="preserve">   (</w:t>
+      </w:r>
+      <w:proofErr w:type="gramEnd"/>
       <w:r>
         <w:rPr>
           <w:i w:val="0"/>
@@ -16685,8 +17001,17 @@
           <w:i w:val="0"/>
           <w:iCs w:val="0"/>
         </w:rPr>
-        <w:t xml:space="preserve">      (</w:t>
-      </w:r>
+        <w:t xml:space="preserve">   </w:t>
+      </w:r>
+      <w:proofErr w:type="gramStart"/>
+      <w:r>
+        <w:rPr>
+          <w:i w:val="0"/>
+          <w:iCs w:val="0"/>
+        </w:rPr>
+        <w:t xml:space="preserve">   (</w:t>
+      </w:r>
+      <w:proofErr w:type="gramEnd"/>
       <w:r>
         <w:rPr>
           <w:i w:val="0"/>
@@ -19098,8 +19423,17 @@
           <w:i w:val="0"/>
           <w:iCs w:val="0"/>
         </w:rPr>
-        <w:t xml:space="preserve">      (</w:t>
-      </w:r>
+        <w:t xml:space="preserve">   </w:t>
+      </w:r>
+      <w:proofErr w:type="gramStart"/>
+      <w:r>
+        <w:rPr>
+          <w:i w:val="0"/>
+          <w:iCs w:val="0"/>
+        </w:rPr>
+        <w:t xml:space="preserve">   (</w:t>
+      </w:r>
+      <w:proofErr w:type="gramEnd"/>
       <w:r>
         <w:rPr>
           <w:i w:val="0"/>
@@ -19406,7 +19740,11 @@
       </w:r>
       <w:r>
         <w:tab/>
-        <w:t xml:space="preserve">      </w:t>
+        <w:t xml:space="preserve">   </w:t>
+      </w:r>
+      <w:proofErr w:type="gramStart"/>
+      <w:r>
+        <w:t xml:space="preserve">   </w:t>
       </w:r>
       <w:r>
         <w:rPr>
@@ -19415,6 +19753,7 @@
         </w:rPr>
         <w:t>(</w:t>
       </w:r>
+      <w:proofErr w:type="gramEnd"/>
       <w:r>
         <w:rPr>
           <w:i w:val="0"/>
@@ -22057,8 +22396,13 @@
       <w:pPr>
         <w:spacing w:line="480" w:lineRule="auto"/>
       </w:pPr>
-      <w:r>
-        <w:t xml:space="preserve">Where </w:t>
+      <w:proofErr w:type="gramStart"/>
+      <w:r>
+        <w:t>Where</w:t>
+      </w:r>
+      <w:proofErr w:type="gramEnd"/>
+      <w:r>
+        <w:t xml:space="preserve"> </w:t>
       </w:r>
     </w:p>
     <w:p>
@@ -23565,8 +23909,17 @@
           <w:i w:val="0"/>
           <w:iCs w:val="0"/>
         </w:rPr>
-        <w:t xml:space="preserve">      (</w:t>
-      </w:r>
+        <w:t xml:space="preserve">   </w:t>
+      </w:r>
+      <w:proofErr w:type="gramStart"/>
+      <w:r>
+        <w:rPr>
+          <w:i w:val="0"/>
+          <w:iCs w:val="0"/>
+        </w:rPr>
+        <w:t xml:space="preserve">   (</w:t>
+      </w:r>
+      <w:proofErr w:type="gramEnd"/>
       <w:r>
         <w:rPr>
           <w:i w:val="0"/>
@@ -23875,7 +24228,11 @@
       </w:r>
       <w:r>
         <w:tab/>
-        <w:t xml:space="preserve">      </w:t>
+        <w:t xml:space="preserve">   </w:t>
+      </w:r>
+      <w:proofErr w:type="gramStart"/>
+      <w:r>
+        <w:t xml:space="preserve">   </w:t>
       </w:r>
       <w:r>
         <w:rPr>
@@ -23884,6 +24241,7 @@
         </w:rPr>
         <w:t>(</w:t>
       </w:r>
+      <w:proofErr w:type="gramEnd"/>
       <w:r>
         <w:rPr>
           <w:i w:val="0"/>
@@ -26537,8 +26895,13 @@
       <w:pPr>
         <w:spacing w:line="480" w:lineRule="auto"/>
       </w:pPr>
-      <w:r>
-        <w:t xml:space="preserve">Where </w:t>
+      <w:proofErr w:type="gramStart"/>
+      <w:r>
+        <w:t>Where</w:t>
+      </w:r>
+      <w:proofErr w:type="gramEnd"/>
+      <w:r>
+        <w:t xml:space="preserve"> </w:t>
       </w:r>
     </w:p>
     <w:p>
@@ -27331,11 +27694,11 @@
       <w:pPr>
         <w:pStyle w:val="Heading2"/>
       </w:pPr>
-      <w:bookmarkStart w:id="63" w:name="_Toc177409511"/>
+      <w:bookmarkStart w:id="61" w:name="_Toc178527567"/>
       <w:r>
         <w:t>Convolution Neural Network Architecture</w:t>
       </w:r>
-      <w:bookmarkEnd w:id="63"/>
+      <w:bookmarkEnd w:id="61"/>
     </w:p>
     <w:p>
       <w:pPr>
@@ -27410,9 +27773,9 @@
           <w:rFonts w:ascii="Times New Roman" w:hAnsi="Times New Roman" w:cs="Times New Roman"/>
         </w:rPr>
       </w:pPr>
-      <w:bookmarkStart w:id="64" w:name="_heading=h.ipnx3a8c2uud"/>
-      <w:bookmarkStart w:id="65" w:name="_Toc177409512"/>
-      <w:bookmarkEnd w:id="64"/>
+      <w:bookmarkStart w:id="62" w:name="_heading=h.ipnx3a8c2uud"/>
+      <w:bookmarkStart w:id="63" w:name="_Toc178527568"/>
+      <w:bookmarkEnd w:id="62"/>
       <w:r>
         <w:rPr>
           <w:rFonts w:ascii="Times New Roman" w:hAnsi="Times New Roman" w:cs="Times New Roman"/>
@@ -27420,7 +27783,7 @@
         <w:lastRenderedPageBreak/>
         <w:t>References</w:t>
       </w:r>
-      <w:bookmarkEnd w:id="65"/>
+      <w:bookmarkEnd w:id="63"/>
     </w:p>
     <w:p>
       <w:pPr>
@@ -28121,7 +28484,21 @@
         <w:rPr>
           <w:rFonts w:ascii="Times New Roman" w:hAnsi="Times New Roman" w:cs="Times New Roman"/>
         </w:rPr>
-        <w:t xml:space="preserve">Hinton, E. G., Osindero, O., and Teh, Y. (2006). A Fast Learning Algorithm for Deep Belief Nets. </w:t>
+        <w:t xml:space="preserve">Hinton, E. G., Osindero, O., and Teh, Y. (2006). A </w:t>
+      </w:r>
+      <w:proofErr w:type="gramStart"/>
+      <w:r>
+        <w:rPr>
+          <w:rFonts w:ascii="Times New Roman" w:hAnsi="Times New Roman" w:cs="Times New Roman"/>
+        </w:rPr>
+        <w:t>Fast Learning</w:t>
+      </w:r>
+      <w:proofErr w:type="gramEnd"/>
+      <w:r>
+        <w:rPr>
+          <w:rFonts w:ascii="Times New Roman" w:hAnsi="Times New Roman" w:cs="Times New Roman"/>
+        </w:rPr>
+        <w:t xml:space="preserve"> Algorithm for Deep Belief Nets. </w:t>
       </w:r>
     </w:p>
     <w:p>
@@ -29664,18 +30041,22 @@
       <w:pPr>
         <w:pStyle w:val="Heading1"/>
       </w:pPr>
+      <w:bookmarkStart w:id="64" w:name="_Toc178527569"/>
       <w:r>
         <w:lastRenderedPageBreak/>
         <w:t>Appendix</w:t>
       </w:r>
+      <w:bookmarkEnd w:id="64"/>
     </w:p>
     <w:p>
       <w:pPr>
         <w:pStyle w:val="Heading2"/>
       </w:pPr>
+      <w:bookmarkStart w:id="65" w:name="_Toc178527570"/>
       <w:r>
         <w:t>Appendix 1: Work Plan</w:t>
       </w:r>
+      <w:bookmarkEnd w:id="65"/>
     </w:p>
     <w:tbl>
       <w:tblPr>
@@ -33740,18 +34121,7 @@
                 <w:szCs w:val="22"/>
                 <w:lang w:val="en-KE" w:eastAsia="en-KE" w:bidi="ar-SA"/>
               </w:rPr>
-              <w:t>Defence</w:t>
-            </w:r>
-            <w:r>
-              <w:rPr>
-                <w:rFonts w:ascii="Calibri" w:eastAsia="Times New Roman" w:hAnsi="Calibri" w:cs="Calibri"/>
-                <w:color w:val="000000"/>
-                <w:kern w:val="0"/>
-                <w:sz w:val="22"/>
-                <w:szCs w:val="22"/>
-                <w:lang w:val="en-KE" w:eastAsia="en-KE" w:bidi="ar-SA"/>
-              </w:rPr>
-              <w:t xml:space="preserve"> of Thesis</w:t>
+              <w:t>Defence of Thesis</w:t>
             </w:r>
           </w:p>
         </w:tc>
@@ -34147,18 +34517,7 @@
                 <w:szCs w:val="22"/>
                 <w:lang w:val="en-KE" w:eastAsia="en-KE" w:bidi="ar-SA"/>
               </w:rPr>
-              <w:t xml:space="preserve">Inputs from </w:t>
-            </w:r>
-            <w:r>
-              <w:rPr>
-                <w:rFonts w:ascii="Calibri" w:eastAsia="Times New Roman" w:hAnsi="Calibri" w:cs="Calibri"/>
-                <w:color w:val="000000"/>
-                <w:kern w:val="0"/>
-                <w:sz w:val="22"/>
-                <w:szCs w:val="22"/>
-                <w:lang w:val="en-KE" w:eastAsia="en-KE" w:bidi="ar-SA"/>
-              </w:rPr>
-              <w:t>Panellists</w:t>
+              <w:t>Inputs from Panellists</w:t>
             </w:r>
           </w:p>
         </w:tc>
@@ -35277,9 +35636,11 @@
       <w:pPr>
         <w:pStyle w:val="Heading2"/>
       </w:pPr>
+      <w:bookmarkStart w:id="66" w:name="_Toc178527571"/>
       <w:r>
         <w:t>Appendix 2: Budget</w:t>
       </w:r>
+      <w:bookmarkEnd w:id="66"/>
     </w:p>
     <w:tbl>
       <w:tblPr>
@@ -35654,18 +36015,7 @@
                 <w:szCs w:val="22"/>
                 <w:lang w:val="en-KE" w:eastAsia="en-KE" w:bidi="ar-SA"/>
               </w:rPr>
-              <w:t>Smartphones</w:t>
-            </w:r>
-            <w:r>
-              <w:rPr>
-                <w:rFonts w:ascii="Calibri" w:eastAsia="Times New Roman" w:hAnsi="Calibri" w:cs="Calibri"/>
-                <w:color w:val="000000"/>
-                <w:kern w:val="0"/>
-                <w:sz w:val="22"/>
-                <w:szCs w:val="22"/>
-                <w:lang w:val="en-KE" w:eastAsia="en-KE" w:bidi="ar-SA"/>
-              </w:rPr>
-              <w:t xml:space="preserve"> for Data Collection</w:t>
+              <w:t>Smartphones for Data Collection</w:t>
             </w:r>
           </w:p>
         </w:tc>

</xml_diff>

<commit_message>
complete literature on convolutions
</commit_message>
<xml_diff>
--- a/mydocuments/Revision3/Sikolia_Thesis_Revision_3.docx
+++ b/mydocuments/Revision3/Sikolia_Thesis_Revision_3.docx
@@ -463,14 +463,6 @@
         </w:rPr>
         <w:t>Jomo Kenyatta University of Agriculture and Technology</w:t>
       </w:r>
-    </w:p>
-    <w:p>
-      <w:pPr>
-        <w:spacing w:line="480" w:lineRule="auto"/>
-        <w:rPr>
-          <w:rFonts w:ascii="Times New Roman" w:hAnsi="Times New Roman" w:cs="Times New Roman"/>
-        </w:rPr>
-      </w:pPr>
     </w:p>
     <w:p>
       <w:pPr>
@@ -5645,6 +5637,7 @@
     <w:p>
       <w:pPr>
         <w:pStyle w:val="BodyText"/>
+        <w:ind w:firstLine="720"/>
         <w:rPr>
           <w:rFonts w:ascii="Times New Roman" w:hAnsi="Times New Roman" w:cs="Times New Roman"/>
         </w:rPr>
@@ -5660,7 +5653,24 @@
           <w:rFonts w:ascii="Times New Roman" w:hAnsi="Times New Roman" w:cs="Times New Roman"/>
         </w:rPr>
         <w:tab/>
-        <w:t>…………………………………………………………….</w:t>
+      </w:r>
+      <w:r>
+        <w:rPr>
+          <w:rFonts w:ascii="Times New Roman" w:hAnsi="Times New Roman" w:cs="Times New Roman"/>
+        </w:rPr>
+        <w:tab/>
+      </w:r>
+      <w:r>
+        <w:rPr>
+          <w:rFonts w:ascii="Times New Roman" w:hAnsi="Times New Roman" w:cs="Times New Roman"/>
+        </w:rPr>
+        <w:t>………………………………</w:t>
+      </w:r>
+      <w:r>
+        <w:rPr>
+          <w:rFonts w:ascii="Times New Roman" w:hAnsi="Times New Roman" w:cs="Times New Roman"/>
+        </w:rPr>
+        <w:t>.</w:t>
       </w:r>
       <w:r>
         <w:rPr>
@@ -5673,6 +5683,7 @@
     <w:p>
       <w:pPr>
         <w:pStyle w:val="BodyText"/>
+        <w:ind w:firstLine="720"/>
         <w:rPr>
           <w:rFonts w:ascii="Times New Roman" w:hAnsi="Times New Roman" w:cs="Times New Roman"/>
         </w:rPr>
@@ -5688,8 +5699,33 @@
           <w:rFonts w:ascii="Times New Roman" w:hAnsi="Times New Roman" w:cs="Times New Roman"/>
         </w:rPr>
         <w:tab/>
-        <w:t>…………………………………………………………….</w:t>
-      </w:r>
+      </w:r>
+      <w:r>
+        <w:rPr>
+          <w:rFonts w:ascii="Times New Roman" w:hAnsi="Times New Roman" w:cs="Times New Roman"/>
+        </w:rPr>
+        <w:tab/>
+      </w:r>
+      <w:r>
+        <w:rPr>
+          <w:rFonts w:ascii="Times New Roman" w:hAnsi="Times New Roman" w:cs="Times New Roman"/>
+        </w:rPr>
+        <w:t>……………………………</w:t>
+      </w:r>
+      <w:proofErr w:type="gramStart"/>
+      <w:r>
+        <w:rPr>
+          <w:rFonts w:ascii="Times New Roman" w:hAnsi="Times New Roman" w:cs="Times New Roman"/>
+        </w:rPr>
+        <w:t>…</w:t>
+      </w:r>
+      <w:r>
+        <w:rPr>
+          <w:rFonts w:ascii="Times New Roman" w:hAnsi="Times New Roman" w:cs="Times New Roman"/>
+        </w:rPr>
+        <w:t>..</w:t>
+      </w:r>
+      <w:proofErr w:type="gramEnd"/>
       <w:r>
         <w:rPr>
           <w:rFonts w:ascii="Times New Roman" w:hAnsi="Times New Roman" w:cs="Times New Roman"/>
@@ -5701,6 +5737,7 @@
     <w:p>
       <w:pPr>
         <w:pStyle w:val="BodyText"/>
+        <w:ind w:firstLine="720"/>
         <w:rPr>
           <w:lang w:val="en-KE"/>
         </w:rPr>
@@ -5716,7 +5753,6 @@
           <w:rFonts w:ascii="Times New Roman" w:hAnsi="Times New Roman" w:cs="Times New Roman"/>
         </w:rPr>
         <w:tab/>
-        <w:t>…………………………………………………………….</w:t>
       </w:r>
       <w:r>
         <w:rPr>
@@ -5726,6 +5762,26 @@
       </w:r>
       <w:r>
         <w:rPr>
+          <w:rFonts w:ascii="Times New Roman" w:hAnsi="Times New Roman" w:cs="Times New Roman"/>
+        </w:rPr>
+        <w:t>……………………………</w:t>
+      </w:r>
+      <w:proofErr w:type="gramStart"/>
+      <w:r>
+        <w:rPr>
+          <w:rFonts w:ascii="Times New Roman" w:hAnsi="Times New Roman" w:cs="Times New Roman"/>
+        </w:rPr>
+        <w:t>…..</w:t>
+      </w:r>
+      <w:proofErr w:type="gramEnd"/>
+      <w:r>
+        <w:rPr>
+          <w:rFonts w:ascii="Times New Roman" w:hAnsi="Times New Roman" w:cs="Times New Roman"/>
+        </w:rPr>
+        <w:tab/>
+      </w:r>
+      <w:r>
+        <w:rPr>
           <w:lang w:val="en-KE"/>
         </w:rPr>
         <w:t>Disguised Faces in The Wild</w:t>
@@ -5734,6 +5790,7 @@
     <w:p>
       <w:pPr>
         <w:pStyle w:val="BodyText"/>
+        <w:ind w:firstLine="720"/>
         <w:rPr>
           <w:lang w:val="en-KE"/>
         </w:rPr>
@@ -5749,7 +5806,18 @@
           <w:lang w:val="en-KE"/>
         </w:rPr>
         <w:tab/>
-        <w:t>.............................................................................................</w:t>
+      </w:r>
+      <w:r>
+        <w:rPr>
+          <w:lang w:val="en-KE"/>
+        </w:rPr>
+        <w:tab/>
+      </w:r>
+      <w:r>
+        <w:rPr>
+          <w:lang w:val="en-KE"/>
+        </w:rPr>
+        <w:t>..................................................</w:t>
       </w:r>
       <w:r>
         <w:rPr>
@@ -5762,6 +5830,7 @@
     <w:p>
       <w:pPr>
         <w:pStyle w:val="BodyText"/>
+        <w:ind w:left="720"/>
         <w:rPr>
           <w:rFonts w:ascii="Times New Roman" w:hAnsi="Times New Roman" w:cs="Times New Roman"/>
         </w:rPr>
@@ -5777,7 +5846,24 @@
           <w:rFonts w:ascii="Times New Roman" w:hAnsi="Times New Roman" w:cs="Times New Roman"/>
         </w:rPr>
         <w:tab/>
-        <w:t>…………………………………………………………….</w:t>
+      </w:r>
+      <w:r>
+        <w:rPr>
+          <w:rFonts w:ascii="Times New Roman" w:hAnsi="Times New Roman" w:cs="Times New Roman"/>
+        </w:rPr>
+        <w:tab/>
+      </w:r>
+      <w:r>
+        <w:rPr>
+          <w:rFonts w:ascii="Times New Roman" w:hAnsi="Times New Roman" w:cs="Times New Roman"/>
+        </w:rPr>
+        <w:t>…………………………</w:t>
+      </w:r>
+      <w:r>
+        <w:rPr>
+          <w:rFonts w:ascii="Times New Roman" w:hAnsi="Times New Roman" w:cs="Times New Roman"/>
+        </w:rPr>
+        <w:t>……...</w:t>
       </w:r>
       <w:r>
         <w:rPr>
@@ -5790,6 +5876,7 @@
     <w:p>
       <w:pPr>
         <w:pStyle w:val="BodyText"/>
+        <w:ind w:firstLine="720"/>
         <w:rPr>
           <w:lang w:val="en-KE"/>
         </w:rPr>
@@ -5805,7 +5892,18 @@
           <w:lang w:val="en-KE"/>
         </w:rPr>
         <w:tab/>
-        <w:t>.............................................................................................</w:t>
+      </w:r>
+      <w:r>
+        <w:rPr>
+          <w:lang w:val="en-KE"/>
+        </w:rPr>
+        <w:tab/>
+      </w:r>
+      <w:r>
+        <w:rPr>
+          <w:lang w:val="en-KE"/>
+        </w:rPr>
+        <w:t>...................................................</w:t>
       </w:r>
       <w:r>
         <w:rPr>
@@ -5814,6 +5912,164 @@
         <w:tab/>
         <w:t>Visual Geometry Group</w:t>
       </w:r>
+    </w:p>
+    <w:p>
+      <w:pPr>
+        <w:pStyle w:val="BodyText"/>
+        <w:ind w:firstLine="720"/>
+        <w:rPr>
+          <w:lang w:val="en-KE"/>
+        </w:rPr>
+      </w:pPr>
+      <w:r>
+        <w:rPr>
+          <w:lang w:val="en-KE"/>
+        </w:rPr>
+        <w:t xml:space="preserve">VGG16 </w:t>
+      </w:r>
+      <w:r>
+        <w:rPr>
+          <w:lang w:val="en-KE"/>
+        </w:rPr>
+        <w:tab/>
+      </w:r>
+      <w:r>
+        <w:rPr>
+          <w:lang w:val="en-KE"/>
+        </w:rPr>
+        <w:t>....................................................</w:t>
+      </w:r>
+      <w:r>
+        <w:rPr>
+          <w:lang w:val="en-KE"/>
+        </w:rPr>
+        <w:tab/>
+        <w:t>Visual Geometry Group 16</w:t>
+      </w:r>
+    </w:p>
+    <w:p>
+      <w:pPr>
+        <w:pStyle w:val="BodyText"/>
+        <w:ind w:firstLine="720"/>
+        <w:rPr>
+          <w:lang w:val="en-KE"/>
+        </w:rPr>
+      </w:pPr>
+      <w:r>
+        <w:rPr>
+          <w:lang w:val="en-KE"/>
+        </w:rPr>
+        <w:t xml:space="preserve">VGG19 </w:t>
+      </w:r>
+      <w:r>
+        <w:rPr>
+          <w:lang w:val="en-KE"/>
+        </w:rPr>
+        <w:tab/>
+      </w:r>
+      <w:r>
+        <w:rPr>
+          <w:lang w:val="en-KE"/>
+        </w:rPr>
+        <w:t>....................................................</w:t>
+      </w:r>
+      <w:r>
+        <w:rPr>
+          <w:lang w:val="en-KE"/>
+        </w:rPr>
+        <w:tab/>
+        <w:t>Visual Geometry Group 19</w:t>
+      </w:r>
+    </w:p>
+    <w:p>
+      <w:pPr>
+        <w:pStyle w:val="BodyText"/>
+        <w:ind w:firstLine="720"/>
+        <w:rPr>
+          <w:lang w:val="en-KE"/>
+        </w:rPr>
+      </w:pPr>
+      <w:r>
+        <w:rPr>
+          <w:lang w:val="en-KE"/>
+        </w:rPr>
+        <w:t xml:space="preserve">VGGFACE </w:t>
+      </w:r>
+      <w:r>
+        <w:rPr>
+          <w:lang w:val="en-KE"/>
+        </w:rPr>
+        <w:tab/>
+      </w:r>
+      <w:r>
+        <w:rPr>
+          <w:lang w:val="en-KE"/>
+        </w:rPr>
+        <w:t>.....................................................</w:t>
+      </w:r>
+      <w:r>
+        <w:rPr>
+          <w:lang w:val="en-KE"/>
+        </w:rPr>
+        <w:tab/>
+        <w:t>Visual Geometry Group FACE</w:t>
+      </w:r>
+    </w:p>
+    <w:p>
+      <w:pPr>
+        <w:pStyle w:val="BodyText"/>
+        <w:ind w:firstLine="720"/>
+        <w:rPr>
+          <w:lang w:val="en-KE"/>
+        </w:rPr>
+      </w:pPr>
+      <w:r>
+        <w:rPr>
+          <w:lang w:val="en-KE"/>
+        </w:rPr>
+        <w:t xml:space="preserve">VGGFACE16 </w:t>
+      </w:r>
+      <w:r>
+        <w:rPr>
+          <w:lang w:val="en-KE"/>
+        </w:rPr>
+        <w:tab/>
+        <w:t>.....................................................</w:t>
+      </w:r>
+      <w:r>
+        <w:rPr>
+          <w:lang w:val="en-KE"/>
+        </w:rPr>
+        <w:tab/>
+        <w:t>Visual Geometry Group FACE-16</w:t>
+      </w:r>
+    </w:p>
+    <w:p>
+      <w:pPr>
+        <w:pStyle w:val="BodyText"/>
+        <w:ind w:firstLine="720"/>
+        <w:rPr>
+          <w:lang w:val="en-KE"/>
+        </w:rPr>
+      </w:pPr>
+    </w:p>
+    <w:p>
+      <w:pPr>
+        <w:pStyle w:val="BodyText"/>
+        <w:ind w:firstLine="720"/>
+        <w:rPr>
+          <w:lang w:val="en-KE"/>
+        </w:rPr>
+      </w:pPr>
+    </w:p>
+    <w:p>
+      <w:pPr>
+        <w:pStyle w:val="BodyText"/>
+        <w:ind w:firstLine="720"/>
+        <w:rPr>
+          <w:lang w:val="en-KE"/>
+        </w:rPr>
+      </w:pPr>
     </w:p>
     <w:p>
       <w:pPr>
@@ -8007,35 +8263,11 @@
         <w:pStyle w:val="BodyText"/>
         <w:spacing w:before="126" w:after="126" w:line="480" w:lineRule="auto"/>
         <w:rPr>
-          <w:color w:val="000000"/>
-        </w:rPr>
-      </w:pPr>
-      <w:r>
-        <w:rPr>
           <w:b/>
           <w:bCs/>
           <w:color w:val="000000"/>
         </w:rPr>
-        <w:t>Same Padding</w:t>
-      </w:r>
-      <w:r>
-        <w:rPr>
-          <w:color w:val="000000"/>
-        </w:rPr>
-        <w:t xml:space="preserve">: This padding strategy is similar to zero padding when zeros are added to the edges of an image. </w:t>
-      </w:r>
-      <w:r>
-        <w:rPr>
-          <w:color w:val="000000"/>
-        </w:rPr>
-        <w:t>However,</w:t>
-      </w:r>
-      <w:r>
-        <w:rPr>
-          <w:color w:val="000000"/>
-        </w:rPr>
-        <w:t xml:space="preserve"> a different figure, say 1, could be added on the edges of an image, which would make the padding strategy different from zero padding. This type of padding is also called constant padding.</w:t>
-      </w:r>
+      </w:pPr>
     </w:p>
     <w:p>
       <w:pPr>
@@ -8051,19 +8283,57 @@
           <w:bCs/>
           <w:color w:val="000000"/>
         </w:rPr>
-        <w:t>Valid Padding</w:t>
+        <w:t>Same Padding</w:t>
       </w:r>
       <w:r>
         <w:rPr>
           <w:color w:val="000000"/>
         </w:rPr>
-        <w:t>: valid padding occurs when no extra data is placed at the borders of a matrix or image. Essentially, it is best understood as the absence of padding.</w:t>
+        <w:t xml:space="preserve">: This padding strategy is similar to zero padding when zeros are added to the edges of an image. </w:t>
+      </w:r>
+      <w:r>
+        <w:rPr>
+          <w:color w:val="000000"/>
+        </w:rPr>
+        <w:t>However,</w:t>
+      </w:r>
+      <w:r>
+        <w:rPr>
+          <w:color w:val="000000"/>
+        </w:rPr>
+        <w:t xml:space="preserve"> a different figure, say 1, could be added on the edges of an image, which would make the padding strategy different from zero padding. This type of padding is also called constant padding.</w:t>
       </w:r>
     </w:p>
     <w:p>
       <w:pPr>
         <w:pStyle w:val="BodyText"/>
         <w:spacing w:before="126" w:after="126" w:line="480" w:lineRule="auto"/>
+        <w:rPr>
+          <w:color w:val="000000"/>
+        </w:rPr>
+      </w:pPr>
+      <w:r>
+        <w:rPr>
+          <w:b/>
+          <w:bCs/>
+          <w:color w:val="000000"/>
+        </w:rPr>
+        <w:t>Valid Padding</w:t>
+      </w:r>
+      <w:r>
+        <w:rPr>
+          <w:color w:val="000000"/>
+        </w:rPr>
+        <w:t>: valid padding occurs when no extra data is placed at the borders of a matrix or image. Essentially, it is best understood as the absence of padding.</w:t>
+      </w:r>
+    </w:p>
+    <w:p>
+      <w:pPr>
+        <w:pStyle w:val="BodyText"/>
+        <w:spacing w:before="126" w:after="126" w:line="480" w:lineRule="auto"/>
+        <w:rPr>
+          <w:color w:val="000000"/>
+        </w:rPr>
       </w:pPr>
       <w:r>
         <w:rPr>
@@ -8323,42 +8593,8 @@
         <w:spacing w:before="240" w:after="240" w:line="480" w:lineRule="auto"/>
         <w:rPr>
           <w:rFonts w:ascii="Liberation Serif" w:hAnsi="Liberation Serif"/>
-          <w:color w:val="000000"/>
-          <w:sz w:val="24"/>
-          <w:szCs w:val="24"/>
-        </w:rPr>
-      </w:pPr>
-    </w:p>
-    <w:p>
-      <w:pPr>
-        <w:pStyle w:val="PreformattedText"/>
-        <w:spacing w:before="240" w:after="240" w:line="480" w:lineRule="auto"/>
-        <w:rPr>
-          <w:rFonts w:ascii="Liberation Serif" w:hAnsi="Liberation Serif"/>
-          <w:color w:val="000000"/>
-          <w:sz w:val="24"/>
-          <w:szCs w:val="24"/>
-        </w:rPr>
-      </w:pPr>
-    </w:p>
-    <w:p>
-      <w:pPr>
-        <w:pStyle w:val="PreformattedText"/>
-        <w:spacing w:before="240" w:after="240" w:line="480" w:lineRule="auto"/>
-        <w:rPr>
-          <w:rFonts w:ascii="Liberation Serif" w:hAnsi="Liberation Serif"/>
-          <w:color w:val="000000"/>
-          <w:sz w:val="24"/>
-          <w:szCs w:val="24"/>
-        </w:rPr>
-      </w:pPr>
-    </w:p>
-    <w:p>
-      <w:pPr>
-        <w:pStyle w:val="PreformattedText"/>
-        <w:spacing w:before="240" w:after="240" w:line="480" w:lineRule="auto"/>
-        <w:rPr>
-          <w:rFonts w:ascii="Liberation Serif" w:hAnsi="Liberation Serif"/>
+          <w:b/>
+          <w:bCs/>
           <w:color w:val="000000"/>
           <w:sz w:val="24"/>
           <w:szCs w:val="24"/>
@@ -8384,6 +8620,7 @@
           <w:sz w:val="24"/>
           <w:szCs w:val="24"/>
         </w:rPr>
+        <w:lastRenderedPageBreak/>
         <w:t>Replication Padding</w:t>
       </w:r>
       <w:r>
@@ -9064,14 +9301,14 @@
         <w:rPr>
           <w:color w:val="000000"/>
         </w:rPr>
-        <w:t xml:space="preserve">: is a type of padding strategy commonly applied to sequential or time series data. This padding technique is thoroughly documented by Rio et al., (2020) and can be divided into </w:t>
+        <w:t xml:space="preserve">: is a type of padding strategy commonly applied to sequential or time series data. This padding technique is thoroughly documented by Rio et al., (2020) and can be divided into truncation padding, post-padding and pre-padding. Truncation padding occurs when items in an array are trimmed to have the same length as an array with the least length. Another padding strategy under sequence padding is post-padding and occurs when a chosen value (usually zero) is </w:t>
       </w:r>
       <w:r>
         <w:rPr>
           <w:color w:val="000000"/>
         </w:rPr>
         <w:lastRenderedPageBreak/>
-        <w:t>truncation padding, post-padding and pre-padding. Truncation padding occurs when items in an array are trimmed to have the same length as an array with the least length. Another padding strategy under sequence padding is post-padding and occurs when a chosen value (usually zero) is added at the end of short array items to make all short arrays equal to the longest array. Pre-padding is the opposite of post-padding and occurs when a chosen value (usually zero) is added at the beginning of shorter arrays in a bid to make them equal to the longest array. This type of padding could also be called causal padding.</w:t>
+        <w:t>added at the end of short array items to make all short arrays equal to the longest array. Pre-padding is the opposite of post-padding and occurs when a chosen value (usually zero) is added at the beginning of shorter arrays in a bid to make them equal to the longest array. This type of padding could also be called causal padding.</w:t>
       </w:r>
     </w:p>
     <w:p>
@@ -9396,26 +9633,26 @@
         <w:rPr>
           <w:color w:val="000000"/>
         </w:rPr>
-        <w:t xml:space="preserve"> of this, Reddy </w:t>
+        <w:t xml:space="preserve"> of this, Reddy and Reddy (2019) investigated the effect of post-padding and pre-padding in Long short-term memory (LSTM) neural networks and CNNs. The authors concluded </w:t>
       </w:r>
       <w:r>
         <w:rPr>
           <w:color w:val="000000"/>
         </w:rPr>
+        <w:t>that post</w:t>
+      </w:r>
+      <w:r>
+        <w:rPr>
+          <w:color w:val="000000"/>
+        </w:rPr>
+        <w:t xml:space="preserve">-padding and pre-padding improve the accuracy of LSTMs but not CNNs because the architecture of CNNs forgets </w:t>
+      </w:r>
+      <w:r>
+        <w:rPr>
+          <w:color w:val="000000"/>
+        </w:rPr>
         <w:lastRenderedPageBreak/>
-        <w:t xml:space="preserve">and Reddy (2019) investigated the effect of post-padding and pre-padding in Long short-term memory (LSTM) neural networks and CNNs. The authors concluded </w:t>
-      </w:r>
-      <w:r>
-        <w:rPr>
-          <w:color w:val="000000"/>
-        </w:rPr>
-        <w:t>that post</w:t>
-      </w:r>
-      <w:r>
-        <w:rPr>
-          <w:color w:val="000000"/>
-        </w:rPr>
-        <w:t xml:space="preserve">-padding and pre-padding improve the accuracy of LSTMs but not CNNs because the architecture of CNNs forgets effects of time series variations. Tang et al., (2019) also investigate the effect of invalid and same padding using </w:t>
+        <w:t xml:space="preserve">effects of time series variations. Tang et al., (2019) also investigate the effect of invalid and same padding using </w:t>
       </w:r>
       <w:proofErr w:type="gramStart"/>
       <w:r>
@@ -9595,14 +9832,20 @@
         <w:rPr>
           <w:lang w:val="en-KE"/>
         </w:rPr>
+        <w:t>twenty-one</w:t>
+      </w:r>
+      <w:r>
+        <w:rPr>
+          <w:lang w:val="en-KE"/>
+        </w:rPr>
+        <w:t xml:space="preserve"> different datasets that have been used for research in facial recognition. This publication discusses main characteristics of each dataset and should be the first stop shop for authors looking to examine data sets used for facial recognition. Ortis and Becker (2013) also discuss facial recognition </w:t>
+      </w:r>
+      <w:r>
+        <w:rPr>
+          <w:lang w:val="en-KE"/>
+        </w:rPr>
         <w:lastRenderedPageBreak/>
-        <w:t>twenty-one</w:t>
-      </w:r>
-      <w:r>
-        <w:rPr>
-          <w:lang w:val="en-KE"/>
-        </w:rPr>
-        <w:t xml:space="preserve"> different datasets that have been used for research in facial recognition. This publication discusses main characteristics of each dataset and should be the first stop shop for authors looking to examine data sets used for facial recognition. Ortis and Becker (2013) also discuss facial recognition data sets only that they focus on web scale datasets. This owes to the fact that web scale datasets are created for facial recognition in real time and on the web. Such datasets should scale well and be ready to be used for tagging friends or finding celebrities</w:t>
+        <w:t>data sets only that they focus on web scale datasets. This owes to the fact that web scale datasets are created for facial recognition in real time and on the web. Such datasets should scale well and be ready to be used for tagging friends or finding celebrities</w:t>
       </w:r>
       <w:r>
         <w:rPr>
@@ -9780,32 +10023,32 @@
         <w:rPr>
           <w:lang w:val="en-KE"/>
         </w:rPr>
-        <w:t xml:space="preserve">. Critical to the discussion is the fact that this data set was examined </w:t>
+        <w:t>. Critical to the discussion is the fact that this data set was examined by human annotators to eliminate images that could introduce noise into the dataset. It is important to hi</w:t>
       </w:r>
       <w:r>
         <w:rPr>
           <w:lang w:val="en-KE"/>
         </w:rPr>
+        <w:t xml:space="preserve">ghlight that this dataset has been used and cited by authors widely. For example, Ibrahem and Abdulameer (2023) examine a pretrained model that was created from this dataset to </w:t>
+      </w:r>
+      <w:r>
+        <w:rPr>
+          <w:lang w:val="en-KE"/>
+        </w:rPr>
+        <w:t>discuss</w:t>
+      </w:r>
+      <w:r>
+        <w:rPr>
+          <w:lang w:val="en-KE"/>
+        </w:rPr>
+        <w:t xml:space="preserve"> a model </w:t>
+      </w:r>
+      <w:r>
+        <w:rPr>
+          <w:lang w:val="en-KE"/>
+        </w:rPr>
         <w:lastRenderedPageBreak/>
-        <w:t>by human annotators to eliminate images that could introduce noise into the dataset. It is important to hi</w:t>
-      </w:r>
-      <w:r>
-        <w:rPr>
-          <w:lang w:val="en-KE"/>
-        </w:rPr>
-        <w:t xml:space="preserve">ghlight that this dataset has been used and cited by authors widely. For example, Ibrahem and Abdulameer (2023) examine a pretrained model that was created from this dataset to </w:t>
-      </w:r>
-      <w:r>
-        <w:rPr>
-          <w:lang w:val="en-KE"/>
-        </w:rPr>
-        <w:t>discuss</w:t>
-      </w:r>
-      <w:r>
-        <w:rPr>
-          <w:lang w:val="en-KE"/>
-        </w:rPr>
-        <w:t xml:space="preserve"> a model aimed at solving the age problem associated with facial recognition.</w:t>
+        <w:t>aimed at solving the age problem associated with facial recognition.</w:t>
       </w:r>
       <w:r>
         <w:rPr>
@@ -9995,20 +10238,20 @@
         <w:t>d</w:t>
       </w:r>
       <w:r>
-        <w:t xml:space="preserve"> to match or a recognize a face belonging to a particular person. An example of an author that has conducted review on facial recognition architectures is sun </w:t>
+        <w:t xml:space="preserve"> to match or a recognize a face belonging to a particular person. An example of an author that has conducted review on facial recognition architectures is sun and Redei (2022). </w:t>
+      </w:r>
+      <w:r>
+        <w:t xml:space="preserve">Specifically, the authors in question discuss architectures such as FaceNet, DeepFace, </w:t>
+      </w:r>
+      <w:r>
+        <w:t>DeepID-Net</w:t>
+      </w:r>
+      <w:r>
+        <w:t xml:space="preserve">, and Local binary patterns architectures. Gupta (2017) also reviewed some of the existing architectures in facial recognition. In particular, the author discusses architectures like </w:t>
       </w:r>
       <w:r>
         <w:lastRenderedPageBreak/>
-        <w:t xml:space="preserve">and Redei (2022). </w:t>
-      </w:r>
-      <w:r>
-        <w:t xml:space="preserve">Specifically, the authors in question discuss architectures such as FaceNet, DeepFace, </w:t>
-      </w:r>
-      <w:r>
-        <w:t>DeepID-Net</w:t>
-      </w:r>
-      <w:r>
-        <w:t>, and Local binary patterns architectures. Gupta (2017) also reviewed some of the existing architectures in facial recognition. In particular, the author discusses architectures like WebFace, DeepFace,</w:t>
+        <w:t>WebFace, DeepFace,</w:t>
       </w:r>
       <w:r>
         <w:t xml:space="preserve"> </w:t>
@@ -10127,38 +10370,38 @@
         <w:t>It is important to note that the researchers introduced an idea of</w:t>
       </w:r>
       <w:r>
-        <w:t xml:space="preserve"> 3D modelling based on face fiducial points, which in turn is used to align faces. Simply put, the facial alignment methodology </w:t>
+        <w:t xml:space="preserve"> 3D modelling based on face fiducial points, which in turn is used to align faces. Simply put, the facial alignment methodology proposed by </w:t>
+      </w:r>
+      <w:r>
+        <w:t>Taigman</w:t>
+      </w:r>
+      <w:r>
+        <w:t xml:space="preserve"> et al., (2014) can transform an image shown in </w:t>
+      </w:r>
+      <w:r>
+        <w:t>figure 2.6 (a) to an image shown in figure 2.6</w:t>
+      </w:r>
+      <w:r>
+        <w:t xml:space="preserve"> </w:t>
+      </w:r>
+      <w:r>
+        <w:t>(b)</w:t>
+      </w:r>
+      <w:r>
+        <w:t xml:space="preserve">. </w:t>
+      </w:r>
+      <w:r>
+        <w:t xml:space="preserve">Resulting images from facial alignment are then subjected to a deep convolution neural network architecture that is thoroughly documented by </w:t>
+      </w:r>
+      <w:r>
+        <w:t>Taigman</w:t>
+      </w:r>
+      <w:r>
+        <w:t xml:space="preserve"> et al., (2014). Vital to the </w:t>
       </w:r>
       <w:r>
         <w:lastRenderedPageBreak/>
-        <w:t xml:space="preserve">proposed by </w:t>
-      </w:r>
-      <w:r>
-        <w:t>Taigman</w:t>
-      </w:r>
-      <w:r>
-        <w:t xml:space="preserve"> et al., (2014) can transform an image shown in </w:t>
-      </w:r>
-      <w:r>
-        <w:t>figure 2.6 (a) to an image shown in figure 2.6</w:t>
-      </w:r>
-      <w:r>
-        <w:t xml:space="preserve"> </w:t>
-      </w:r>
-      <w:r>
-        <w:t>(b)</w:t>
-      </w:r>
-      <w:r>
-        <w:t xml:space="preserve">. </w:t>
-      </w:r>
-      <w:r>
-        <w:t xml:space="preserve">Resulting images from facial alignment are then subjected to a deep convolution neural network architecture that is thoroughly documented by </w:t>
-      </w:r>
-      <w:r>
-        <w:t>Taigman</w:t>
-      </w:r>
-      <w:r>
-        <w:t xml:space="preserve"> et al., (2014). Vital to the discussion is the fact that the DeepFace architecture was tested on </w:t>
+        <w:t xml:space="preserve">discussion is the fact that the DeepFace architecture was tested on </w:t>
       </w:r>
       <w:r>
         <w:t>the Labelled Faces in the Wild dataset, and the YouTube Faces dataset. It follows that this architecture achieved an accuracy of 97.5% in the Labelled Faces in the Wild dataset and a 91.4% accuracy on the YouTube Faces dataset.</w:t>
@@ -10279,11 +10522,77 @@
     </w:p>
     <w:p>
       <w:pPr>
+        <w:pStyle w:val="Heading3"/>
+      </w:pPr>
+      <w:r>
+        <w:t>VGG</w:t>
+      </w:r>
+      <w:r>
+        <w:t>FACE-</w:t>
+      </w:r>
+      <w:r>
+        <w:t>16</w:t>
+      </w:r>
+    </w:p>
+    <w:p>
+      <w:pPr>
         <w:spacing w:line="480" w:lineRule="auto"/>
+        <w:ind w:firstLine="720"/>
         <w:jc w:val="both"/>
       </w:pPr>
       <w:r>
-        <w:t xml:space="preserve">            </w:t>
+        <w:t>VGG</w:t>
+      </w:r>
+      <w:r>
+        <w:t>FACE-</w:t>
+      </w:r>
+      <w:r>
+        <w:t xml:space="preserve">16 is a facial recognition that was </w:t>
+      </w:r>
+      <w:r>
+        <w:t>developed by Karen Simonyan and Andrew Zisserman from the University of Oxford</w:t>
+      </w:r>
+      <w:r>
+        <w:t xml:space="preserve"> (Koo et al., 2018)</w:t>
+      </w:r>
+      <w:r>
+        <w:t xml:space="preserve">. </w:t>
+      </w:r>
+      <w:r>
+        <w:t>It</w:t>
+      </w:r>
+      <w:r>
+        <w:t xml:space="preserve"> comprises </w:t>
+      </w:r>
+      <w:r>
+        <w:t>multiple</w:t>
+      </w:r>
+      <w:r>
+        <w:t xml:space="preserve"> sequential connected layers</w:t>
+      </w:r>
+      <w:r>
+        <w:t xml:space="preserve"> with each layer receiving output from the previous layer.</w:t>
+      </w:r>
+      <w:r>
+        <w:t xml:space="preserve"> </w:t>
+      </w:r>
+      <w:r>
+        <w:t xml:space="preserve"> Specifically, it is made up of 16 layers where the first thirteen layers are convolution layers while the last three layers are fully connected layers. </w:t>
+      </w:r>
+      <w:r>
+        <w:t xml:space="preserve">Critical to the discussion is the fact that the input image must have a dimension of 224 by 224 by 3. The sixteen layers used by this facial architecture can be divided into five major groups. Each of these groups contains convolution layers, a relu activation function, maxpooling, kernel filters, strides and padding. A thorough explanation of this facial recognition architecture has been published by Koo et al., (2018). </w:t>
+      </w:r>
+      <w:r>
+        <w:t xml:space="preserve">It is important to mention that like Google Facenet and DeepFace, VGGFACE-16 was also tested on famous datasets such as the </w:t>
+      </w:r>
+      <w:r>
+        <w:t>Labeled Faces in the Wild dataset</w:t>
+      </w:r>
+      <w:r>
+        <w:t xml:space="preserve">. Specifically, the model recorded an accuracy of </w:t>
+      </w:r>
+      <w:r>
+        <w:t>99.13% on the Labeled Faces in the Wild dataset.</w:t>
       </w:r>
     </w:p>
     <w:p>
@@ -27712,7 +28021,13 @@
         <w:rPr>
           <w:rFonts w:ascii="Times New Roman" w:hAnsi="Times New Roman" w:cs="Times New Roman"/>
         </w:rPr>
-        <w:t>Convolution neural networks rely on their architecture to make predictions from inputs. This architecture can be divided into feature extraction and model prediction. The feature extraction phase relies on techniques such as filtering, the stride, padding, and pooling</w:t>
+        <w:t>Convolution neural networks rely on their architecture to make predictions from inputs. This architecture can be divided into feature extraction and model prediction. The feature extraction phase relies on techniques such as filtering, the stride, padding, pooling</w:t>
+      </w:r>
+      <w:r>
+        <w:rPr>
+          <w:rFonts w:ascii="Times New Roman" w:hAnsi="Times New Roman" w:cs="Times New Roman"/>
+        </w:rPr>
+        <w:t xml:space="preserve"> and flattening</w:t>
       </w:r>
       <w:r>
         <w:rPr>
@@ -27720,25 +28035,674 @@
         </w:rPr>
         <w:t xml:space="preserve">. </w:t>
       </w:r>
+      <w:r>
+        <w:rPr>
+          <w:rFonts w:ascii="Times New Roman" w:hAnsi="Times New Roman" w:cs="Times New Roman"/>
+        </w:rPr>
+        <w:t xml:space="preserve">In order to explain how each of these techniques contributes to the architecture of the neural network we shall rely on the image shown in figure </w:t>
+      </w:r>
+      <w:r>
+        <w:rPr>
+          <w:rFonts w:ascii="Times New Roman" w:hAnsi="Times New Roman" w:cs="Times New Roman"/>
+        </w:rPr>
+        <w:t xml:space="preserve">3.4 </w:t>
+      </w:r>
+      <w:r>
+        <w:rPr>
+          <w:rFonts w:ascii="Times New Roman" w:hAnsi="Times New Roman" w:cs="Times New Roman"/>
+        </w:rPr>
+        <w:t>below.</w:t>
+      </w:r>
     </w:p>
     <w:p>
       <w:pPr>
         <w:spacing w:line="480" w:lineRule="auto"/>
-        <w:rPr>
-          <w:rFonts w:ascii="Times New Roman" w:hAnsi="Times New Roman" w:cs="Times New Roman"/>
-        </w:rPr>
-      </w:pPr>
+        <w:jc w:val="center"/>
+        <w:rPr>
+          <w:rFonts w:ascii="Times New Roman" w:hAnsi="Times New Roman" w:cs="Times New Roman"/>
+          <w:lang w:val="en-KE"/>
+        </w:rPr>
+      </w:pPr>
+      <w:r>
+        <w:rPr>
+          <w:rFonts w:ascii="Times New Roman" w:hAnsi="Times New Roman" w:cs="Times New Roman"/>
+          <w:lang w:val="en-KE"/>
+        </w:rPr>
+        <w:drawing>
+          <wp:inline distT="0" distB="0" distL="0" distR="0" wp14:anchorId="771D04F8" wp14:editId="656C318C">
+            <wp:extent cx="4257675" cy="2428875"/>
+            <wp:effectExtent l="0" t="0" r="9525" b="9525"/>
+            <wp:docPr id="839841726" name="Picture 11"/>
+            <wp:cNvGraphicFramePr>
+              <a:graphicFrameLocks xmlns:a="http://schemas.openxmlformats.org/drawingml/2006/main" noChangeAspect="1"/>
+            </wp:cNvGraphicFramePr>
+            <a:graphic xmlns:a="http://schemas.openxmlformats.org/drawingml/2006/main">
+              <a:graphicData uri="http://schemas.openxmlformats.org/drawingml/2006/picture">
+                <pic:pic xmlns:pic="http://schemas.openxmlformats.org/drawingml/2006/picture">
+                  <pic:nvPicPr>
+                    <pic:cNvPr id="0" name="Picture 13"/>
+                    <pic:cNvPicPr>
+                      <a:picLocks noChangeAspect="1" noChangeArrowheads="1"/>
+                    </pic:cNvPicPr>
+                  </pic:nvPicPr>
+                  <pic:blipFill>
+                    <a:blip r:embed="rId20">
+                      <a:extLst>
+                        <a:ext uri="{28A0092B-C50C-407E-A947-70E740481C1C}">
+                          <a14:useLocalDpi xmlns:a14="http://schemas.microsoft.com/office/drawing/2010/main" val="0"/>
+                        </a:ext>
+                      </a:extLst>
+                    </a:blip>
+                    <a:srcRect/>
+                    <a:stretch>
+                      <a:fillRect/>
+                    </a:stretch>
+                  </pic:blipFill>
+                  <pic:spPr bwMode="auto">
+                    <a:xfrm>
+                      <a:off x="0" y="0"/>
+                      <a:ext cx="4257675" cy="2428875"/>
+                    </a:xfrm>
+                    <a:prstGeom prst="rect">
+                      <a:avLst/>
+                    </a:prstGeom>
+                    <a:noFill/>
+                    <a:ln>
+                      <a:noFill/>
+                    </a:ln>
+                  </pic:spPr>
+                </pic:pic>
+              </a:graphicData>
+            </a:graphic>
+          </wp:inline>
+        </w:drawing>
+      </w:r>
+    </w:p>
+    <w:p>
+      <w:pPr>
+        <w:pStyle w:val="Caption"/>
+        <w:jc w:val="center"/>
+        <w:rPr>
+          <w:rFonts w:ascii="Times New Roman" w:hAnsi="Times New Roman" w:cs="Times New Roman"/>
+          <w:lang w:val="en-KE"/>
+        </w:rPr>
+      </w:pPr>
+      <w:r>
+        <w:t xml:space="preserve">Figure </w:t>
+      </w:r>
+      <w:r>
+        <w:fldChar w:fldCharType="begin"/>
+      </w:r>
+      <w:r>
+        <w:instrText xml:space="preserve"> STYLEREF 1 \s </w:instrText>
+      </w:r>
+      <w:r>
+        <w:fldChar w:fldCharType="separate"/>
+      </w:r>
+      <w:r>
+        <w:rPr>
+          <w:noProof/>
+        </w:rPr>
+        <w:t>0</w:t>
+      </w:r>
+      <w:r>
+        <w:fldChar w:fldCharType="end"/>
+      </w:r>
+      <w:r>
+        <w:t>.</w:t>
+      </w:r>
+      <w:r>
+        <w:fldChar w:fldCharType="begin"/>
+      </w:r>
+      <w:r>
+        <w:instrText xml:space="preserve"> SEQ Figure \* ARABIC \s 1 </w:instrText>
+      </w:r>
+      <w:r>
+        <w:fldChar w:fldCharType="separate"/>
+      </w:r>
+      <w:r>
+        <w:rPr>
+          <w:noProof/>
+        </w:rPr>
+        <w:t>4</w:t>
+      </w:r>
+      <w:r>
+        <w:fldChar w:fldCharType="end"/>
+      </w:r>
+      <w:r>
+        <w:t>: Sample Matrix and a Kernel</w:t>
+      </w:r>
+    </w:p>
+    <w:p>
+      <w:pPr>
+        <w:pStyle w:val="Heading3"/>
+      </w:pPr>
+      <w:r>
+        <w:t>Filtering in Convolution Neural Networks</w:t>
+      </w:r>
     </w:p>
     <w:p>
       <w:pPr>
         <w:spacing w:line="480" w:lineRule="auto"/>
-        <w:rPr>
-          <w:rFonts w:ascii="Times New Roman" w:hAnsi="Times New Roman" w:cs="Times New Roman"/>
-        </w:rPr>
-      </w:pPr>
-    </w:p>
-    <w:p>
-      <w:pPr>
+        <w:ind w:firstLine="720"/>
+        <w:rPr>
+          <w:rFonts w:ascii="Times New Roman" w:hAnsi="Times New Roman" w:cs="Times New Roman"/>
+        </w:rPr>
+      </w:pPr>
+      <w:r>
+        <w:rPr>
+          <w:rFonts w:ascii="Times New Roman" w:hAnsi="Times New Roman" w:cs="Times New Roman"/>
+        </w:rPr>
+        <w:t>In order to understand how filtering works, we need to consider figure 3.4</w:t>
+      </w:r>
+      <w:r>
+        <w:rPr>
+          <w:rFonts w:ascii="Times New Roman" w:hAnsi="Times New Roman" w:cs="Times New Roman"/>
+        </w:rPr>
+        <w:t>. The kernel slides over the sample matrix and takes the dot product between the kernel and a 3 by 3 matrix from row</w:t>
+      </w:r>
+      <w:r>
+        <w:rPr>
+          <w:rFonts w:ascii="Times New Roman" w:hAnsi="Times New Roman" w:cs="Times New Roman"/>
+        </w:rPr>
+        <w:t>s in the sample matrix. For example, the kernel slides from</w:t>
+      </w:r>
+      <w:r>
+        <w:rPr>
+          <w:rFonts w:ascii="Times New Roman" w:hAnsi="Times New Roman" w:cs="Times New Roman"/>
+        </w:rPr>
+        <w:t xml:space="preserve"> R1 </w:t>
+      </w:r>
+      <w:r>
+        <w:rPr>
+          <w:rFonts w:ascii="Times New Roman" w:hAnsi="Times New Roman" w:cs="Times New Roman"/>
+        </w:rPr>
+        <w:t>to</w:t>
+      </w:r>
+      <w:r>
+        <w:rPr>
+          <w:rFonts w:ascii="Times New Roman" w:hAnsi="Times New Roman" w:cs="Times New Roman"/>
+        </w:rPr>
+        <w:t xml:space="preserve"> row R3 and </w:t>
+      </w:r>
+      <w:r>
+        <w:rPr>
+          <w:rFonts w:ascii="Times New Roman" w:hAnsi="Times New Roman" w:cs="Times New Roman"/>
+        </w:rPr>
+        <w:t xml:space="preserve">from </w:t>
+      </w:r>
+      <w:r>
+        <w:rPr>
+          <w:rFonts w:ascii="Times New Roman" w:hAnsi="Times New Roman" w:cs="Times New Roman"/>
+        </w:rPr>
+        <w:t>column C1 to column C3</w:t>
+      </w:r>
+      <w:r>
+        <w:rPr>
+          <w:rFonts w:ascii="Times New Roman" w:hAnsi="Times New Roman" w:cs="Times New Roman"/>
+        </w:rPr>
+        <w:t xml:space="preserve"> and multiplies the resulting matrix with the kernel</w:t>
+      </w:r>
+      <w:r>
+        <w:rPr>
+          <w:rFonts w:ascii="Times New Roman" w:hAnsi="Times New Roman" w:cs="Times New Roman"/>
+        </w:rPr>
+        <w:t>. In this case, the result of the dot multiplication is 12. It then slides over and begin</w:t>
+      </w:r>
+      <w:r>
+        <w:rPr>
+          <w:rFonts w:ascii="Times New Roman" w:hAnsi="Times New Roman" w:cs="Times New Roman"/>
+        </w:rPr>
+        <w:t>ning</w:t>
+      </w:r>
+      <w:r>
+        <w:rPr>
+          <w:rFonts w:ascii="Times New Roman" w:hAnsi="Times New Roman" w:cs="Times New Roman"/>
+        </w:rPr>
+        <w:t xml:space="preserve"> form row R2 to row R4 and column</w:t>
+      </w:r>
+      <w:r>
+        <w:rPr>
+          <w:rFonts w:ascii="Times New Roman" w:hAnsi="Times New Roman" w:cs="Times New Roman"/>
+        </w:rPr>
+        <w:t xml:space="preserve"> C1 to column </w:t>
+      </w:r>
+      <w:r>
+        <w:rPr>
+          <w:rFonts w:ascii="Times New Roman" w:hAnsi="Times New Roman" w:cs="Times New Roman"/>
+        </w:rPr>
+        <w:t>C</w:t>
+      </w:r>
+      <w:r>
+        <w:rPr>
+          <w:rFonts w:ascii="Times New Roman" w:hAnsi="Times New Roman" w:cs="Times New Roman"/>
+        </w:rPr>
+        <w:t>3. The result of this</w:t>
+      </w:r>
+      <w:r>
+        <w:rPr>
+          <w:rFonts w:ascii="Times New Roman" w:hAnsi="Times New Roman" w:cs="Times New Roman"/>
+        </w:rPr>
+        <w:t xml:space="preserve"> dot</w:t>
+      </w:r>
+      <w:r>
+        <w:rPr>
+          <w:rFonts w:ascii="Times New Roman" w:hAnsi="Times New Roman" w:cs="Times New Roman"/>
+        </w:rPr>
+        <w:t xml:space="preserve"> multiplication is also 12. The last filter happens from row R3 to row R5 and column C1 to column c3. The result from this </w:t>
+      </w:r>
+      <w:r>
+        <w:rPr>
+          <w:rFonts w:ascii="Times New Roman" w:hAnsi="Times New Roman" w:cs="Times New Roman"/>
+        </w:rPr>
+        <w:t xml:space="preserve">dot </w:t>
+      </w:r>
+      <w:r>
+        <w:rPr>
+          <w:rFonts w:ascii="Times New Roman" w:hAnsi="Times New Roman" w:cs="Times New Roman"/>
+        </w:rPr>
+        <w:t xml:space="preserve">multiplication is 17. The </w:t>
+      </w:r>
+      <w:r>
+        <w:rPr>
+          <w:rFonts w:ascii="Times New Roman" w:hAnsi="Times New Roman" w:cs="Times New Roman"/>
+        </w:rPr>
+        <w:t xml:space="preserve">kernel </w:t>
+      </w:r>
+      <w:r>
+        <w:rPr>
+          <w:rFonts w:ascii="Times New Roman" w:hAnsi="Times New Roman" w:cs="Times New Roman"/>
+        </w:rPr>
+        <w:t xml:space="preserve">then moves one column downwards and </w:t>
+      </w:r>
+      <w:r>
+        <w:rPr>
+          <w:rFonts w:ascii="Times New Roman" w:hAnsi="Times New Roman" w:cs="Times New Roman"/>
+        </w:rPr>
+        <w:t xml:space="preserve">takes a 3 by 3 matrix from row R1 column C2 to row R3 </w:t>
+      </w:r>
+      <w:r>
+        <w:rPr>
+          <w:rFonts w:ascii="Times New Roman" w:hAnsi="Times New Roman" w:cs="Times New Roman"/>
+        </w:rPr>
+        <w:lastRenderedPageBreak/>
+        <w:t>column C4</w:t>
+      </w:r>
+      <w:r>
+        <w:rPr>
+          <w:rFonts w:ascii="Times New Roman" w:hAnsi="Times New Roman" w:cs="Times New Roman"/>
+        </w:rPr>
+        <w:t xml:space="preserve"> and multiplies </w:t>
+      </w:r>
+      <w:r>
+        <w:rPr>
+          <w:rFonts w:ascii="Times New Roman" w:hAnsi="Times New Roman" w:cs="Times New Roman"/>
+        </w:rPr>
+        <w:t xml:space="preserve">itself with </w:t>
+      </w:r>
+      <w:r>
+        <w:rPr>
+          <w:rFonts w:ascii="Times New Roman" w:hAnsi="Times New Roman" w:cs="Times New Roman"/>
+        </w:rPr>
+        <w:t>this matrix to give 10. Holding the same column</w:t>
+      </w:r>
+      <w:r>
+        <w:rPr>
+          <w:rFonts w:ascii="Times New Roman" w:hAnsi="Times New Roman" w:cs="Times New Roman"/>
+        </w:rPr>
+        <w:t xml:space="preserve">s, the kernel slides from row R2 to row R4 and multiplies the resulting matrix with itself to give </w:t>
+      </w:r>
+      <w:r>
+        <w:rPr>
+          <w:rFonts w:ascii="Times New Roman" w:hAnsi="Times New Roman" w:cs="Times New Roman"/>
+        </w:rPr>
+        <w:t xml:space="preserve">17.  It then slides from row </w:t>
+      </w:r>
+      <w:r>
+        <w:rPr>
+          <w:rFonts w:ascii="Times New Roman" w:hAnsi="Times New Roman" w:cs="Times New Roman"/>
+        </w:rPr>
+        <w:t>R</w:t>
+      </w:r>
+      <w:r>
+        <w:rPr>
+          <w:rFonts w:ascii="Times New Roman" w:hAnsi="Times New Roman" w:cs="Times New Roman"/>
+        </w:rPr>
+        <w:t xml:space="preserve">3 to </w:t>
+      </w:r>
+      <w:r>
+        <w:rPr>
+          <w:rFonts w:ascii="Times New Roman" w:hAnsi="Times New Roman" w:cs="Times New Roman"/>
+        </w:rPr>
+        <w:t>R</w:t>
+      </w:r>
+      <w:r>
+        <w:rPr>
+          <w:rFonts w:ascii="Times New Roman" w:hAnsi="Times New Roman" w:cs="Times New Roman"/>
+        </w:rPr>
+        <w:t>5 and multiplies the resulting matrix with itself to give</w:t>
+      </w:r>
+      <w:r>
+        <w:rPr>
+          <w:rFonts w:ascii="Times New Roman" w:hAnsi="Times New Roman" w:cs="Times New Roman"/>
+        </w:rPr>
+        <w:t xml:space="preserve"> 19. The procedure is through rows R1 to R5 and columns C3 </w:t>
+      </w:r>
+      <w:r>
+        <w:rPr>
+          <w:rFonts w:ascii="Times New Roman" w:hAnsi="Times New Roman" w:cs="Times New Roman"/>
+        </w:rPr>
+        <w:t>to C5 to give 9, 6 and 14 as the results. The results are combined into what is called the feature map and is shown in figure 3.5 below.</w:t>
+      </w:r>
+    </w:p>
+    <w:p>
+      <w:pPr>
+        <w:spacing w:line="480" w:lineRule="auto"/>
+        <w:jc w:val="center"/>
+        <w:rPr>
+          <w:rFonts w:ascii="Times New Roman" w:hAnsi="Times New Roman" w:cs="Times New Roman"/>
+          <w:lang w:val="en-KE"/>
+        </w:rPr>
+      </w:pPr>
+      <w:r>
+        <w:rPr>
+          <w:rFonts w:ascii="Times New Roman" w:hAnsi="Times New Roman" w:cs="Times New Roman"/>
+          <w:lang w:val="en-KE"/>
+        </w:rPr>
+        <w:drawing>
+          <wp:inline distT="0" distB="0" distL="0" distR="0" wp14:anchorId="38FFB8D2" wp14:editId="53129BAE">
+            <wp:extent cx="1314450" cy="1628775"/>
+            <wp:effectExtent l="0" t="0" r="0" b="9525"/>
+            <wp:docPr id="2037366705" name="Picture 13"/>
+            <wp:cNvGraphicFramePr>
+              <a:graphicFrameLocks xmlns:a="http://schemas.openxmlformats.org/drawingml/2006/main" noChangeAspect="1"/>
+            </wp:cNvGraphicFramePr>
+            <a:graphic xmlns:a="http://schemas.openxmlformats.org/drawingml/2006/main">
+              <a:graphicData uri="http://schemas.openxmlformats.org/drawingml/2006/picture">
+                <pic:pic xmlns:pic="http://schemas.openxmlformats.org/drawingml/2006/picture">
+                  <pic:nvPicPr>
+                    <pic:cNvPr id="0" name="Picture 20"/>
+                    <pic:cNvPicPr>
+                      <a:picLocks noChangeAspect="1" noChangeArrowheads="1"/>
+                    </pic:cNvPicPr>
+                  </pic:nvPicPr>
+                  <pic:blipFill>
+                    <a:blip r:embed="rId21">
+                      <a:extLst>
+                        <a:ext uri="{28A0092B-C50C-407E-A947-70E740481C1C}">
+                          <a14:useLocalDpi xmlns:a14="http://schemas.microsoft.com/office/drawing/2010/main" val="0"/>
+                        </a:ext>
+                      </a:extLst>
+                    </a:blip>
+                    <a:srcRect/>
+                    <a:stretch>
+                      <a:fillRect/>
+                    </a:stretch>
+                  </pic:blipFill>
+                  <pic:spPr bwMode="auto">
+                    <a:xfrm>
+                      <a:off x="0" y="0"/>
+                      <a:ext cx="1314450" cy="1628775"/>
+                    </a:xfrm>
+                    <a:prstGeom prst="rect">
+                      <a:avLst/>
+                    </a:prstGeom>
+                    <a:noFill/>
+                    <a:ln>
+                      <a:noFill/>
+                    </a:ln>
+                  </pic:spPr>
+                </pic:pic>
+              </a:graphicData>
+            </a:graphic>
+          </wp:inline>
+        </w:drawing>
+      </w:r>
+    </w:p>
+    <w:p>
+      <w:pPr>
+        <w:pStyle w:val="Caption"/>
+        <w:jc w:val="center"/>
+        <w:rPr>
+          <w:rFonts w:ascii="Times New Roman" w:hAnsi="Times New Roman" w:cs="Times New Roman"/>
+        </w:rPr>
+      </w:pPr>
+      <w:r>
+        <w:t xml:space="preserve">Figure </w:t>
+      </w:r>
+      <w:r>
+        <w:fldChar w:fldCharType="begin"/>
+      </w:r>
+      <w:r>
+        <w:instrText xml:space="preserve"> STYLEREF 1 \s </w:instrText>
+      </w:r>
+      <w:r>
+        <w:fldChar w:fldCharType="separate"/>
+      </w:r>
+      <w:r>
+        <w:rPr>
+          <w:noProof/>
+        </w:rPr>
+        <w:t>0</w:t>
+      </w:r>
+      <w:r>
+        <w:fldChar w:fldCharType="end"/>
+      </w:r>
+      <w:r>
+        <w:t>.</w:t>
+      </w:r>
+      <w:r>
+        <w:fldChar w:fldCharType="begin"/>
+      </w:r>
+      <w:r>
+        <w:instrText xml:space="preserve"> SEQ Figure \* ARABIC \s 1 </w:instrText>
+      </w:r>
+      <w:r>
+        <w:fldChar w:fldCharType="separate"/>
+      </w:r>
+      <w:r>
+        <w:rPr>
+          <w:noProof/>
+        </w:rPr>
+        <w:t>5</w:t>
+      </w:r>
+      <w:r>
+        <w:fldChar w:fldCharType="end"/>
+      </w:r>
+      <w:r>
+        <w:t>Feature Map</w:t>
+      </w:r>
+    </w:p>
+    <w:p>
+      <w:pPr>
+        <w:pStyle w:val="Heading3"/>
+      </w:pPr>
+      <w:r>
+        <w:t>Strides in Convolution Neural Network</w:t>
+      </w:r>
+    </w:p>
+    <w:p>
+      <w:pPr>
+        <w:pStyle w:val="BodyText"/>
+        <w:spacing w:line="480" w:lineRule="auto"/>
+        <w:ind w:firstLine="432"/>
+        <w:rPr>
+          <w:rFonts w:ascii="Times New Roman" w:hAnsi="Times New Roman" w:cs="Times New Roman"/>
+        </w:rPr>
+      </w:pPr>
+      <w:r>
+        <w:t xml:space="preserve">A stride in convolution neural networks could be defined as a step used by the filter(kernel) to slide over the input image. </w:t>
+      </w:r>
+      <w:r>
+        <w:t>A stride of 1 means that the filter moves one pixel at a time, while a stride of 2 means it moves two pixels at a time.</w:t>
+      </w:r>
+      <w:r>
+        <w:t xml:space="preserve"> Let us take figure 3.4 into consideration </w:t>
+      </w:r>
+      <w:r>
+        <w:t xml:space="preserve">(assuming that we have a stride of 1) </w:t>
+      </w:r>
+      <w:r>
+        <w:t xml:space="preserve">and use it to explain how strides are used in convolution neural networks. The filter will begin in the same position as the filtering process i.e. </w:t>
+      </w:r>
+      <w:r>
+        <w:rPr>
+          <w:rFonts w:ascii="Times New Roman" w:hAnsi="Times New Roman" w:cs="Times New Roman"/>
+        </w:rPr>
+        <w:t>from R1 to row R3 and from column C1 to column C3 and multiplies the resulting matrix with the kernel. In this case, the result of the dot multiplication is 12. It will then move one pixel to the right and begin filtering from row R3 to row R5 and column C1 to column c3. The result from this dot multiplication is 17. Moving downwards the stride will skip one pixel downwards and begin the filtering process from column C3 to column C5 to give 9 as the result. It will then skip one row and begin filtering from row R3 column C3 which will give 14 as the result. In short, the matrix and kernel in figure 3.4 and a stride of 1 will produce a feature map shown in figure 3.6 below.</w:t>
+      </w:r>
+    </w:p>
+    <w:p>
+      <w:pPr>
+        <w:pStyle w:val="BodyText"/>
+        <w:spacing w:after="0" w:line="480" w:lineRule="auto"/>
+        <w:jc w:val="center"/>
+        <w:rPr>
+          <w:rFonts w:ascii="Times New Roman" w:hAnsi="Times New Roman" w:cs="Times New Roman"/>
+          <w:lang w:val="en-KE"/>
+        </w:rPr>
+      </w:pPr>
+      <w:r>
+        <w:rPr>
+          <w:rFonts w:ascii="Times New Roman" w:hAnsi="Times New Roman" w:cs="Times New Roman"/>
+          <w:lang w:val="en-KE"/>
+        </w:rPr>
+        <w:lastRenderedPageBreak/>
+        <w:drawing>
+          <wp:inline distT="0" distB="0" distL="0" distR="0" wp14:anchorId="5C87E9C4" wp14:editId="09D771AC">
+            <wp:extent cx="971550" cy="1209675"/>
+            <wp:effectExtent l="0" t="0" r="0" b="9525"/>
+            <wp:docPr id="1940151642" name="Picture 17"/>
+            <wp:cNvGraphicFramePr>
+              <a:graphicFrameLocks xmlns:a="http://schemas.openxmlformats.org/drawingml/2006/main" noChangeAspect="1"/>
+            </wp:cNvGraphicFramePr>
+            <a:graphic xmlns:a="http://schemas.openxmlformats.org/drawingml/2006/main">
+              <a:graphicData uri="http://schemas.openxmlformats.org/drawingml/2006/picture">
+                <pic:pic xmlns:pic="http://schemas.openxmlformats.org/drawingml/2006/picture">
+                  <pic:nvPicPr>
+                    <pic:cNvPr id="0" name="Picture 37"/>
+                    <pic:cNvPicPr>
+                      <a:picLocks noChangeAspect="1" noChangeArrowheads="1"/>
+                    </pic:cNvPicPr>
+                  </pic:nvPicPr>
+                  <pic:blipFill>
+                    <a:blip r:embed="rId22">
+                      <a:extLst>
+                        <a:ext uri="{28A0092B-C50C-407E-A947-70E740481C1C}">
+                          <a14:useLocalDpi xmlns:a14="http://schemas.microsoft.com/office/drawing/2010/main" val="0"/>
+                        </a:ext>
+                      </a:extLst>
+                    </a:blip>
+                    <a:srcRect/>
+                    <a:stretch>
+                      <a:fillRect/>
+                    </a:stretch>
+                  </pic:blipFill>
+                  <pic:spPr bwMode="auto">
+                    <a:xfrm>
+                      <a:off x="0" y="0"/>
+                      <a:ext cx="971550" cy="1209675"/>
+                    </a:xfrm>
+                    <a:prstGeom prst="rect">
+                      <a:avLst/>
+                    </a:prstGeom>
+                    <a:noFill/>
+                    <a:ln>
+                      <a:noFill/>
+                    </a:ln>
+                  </pic:spPr>
+                </pic:pic>
+              </a:graphicData>
+            </a:graphic>
+          </wp:inline>
+        </w:drawing>
+      </w:r>
+    </w:p>
+    <w:p>
+      <w:pPr>
+        <w:pStyle w:val="Caption"/>
+        <w:spacing w:before="0"/>
+        <w:jc w:val="center"/>
+      </w:pPr>
+      <w:r>
+        <w:t xml:space="preserve">Figure </w:t>
+      </w:r>
+      <w:r>
+        <w:fldChar w:fldCharType="begin"/>
+      </w:r>
+      <w:r>
+        <w:instrText xml:space="preserve"> STYLEREF 1 \s </w:instrText>
+      </w:r>
+      <w:r>
+        <w:fldChar w:fldCharType="separate"/>
+      </w:r>
+      <w:r>
+        <w:rPr>
+          <w:noProof/>
+        </w:rPr>
+        <w:t>0</w:t>
+      </w:r>
+      <w:r>
+        <w:fldChar w:fldCharType="end"/>
+      </w:r>
+      <w:r>
+        <w:t>.</w:t>
+      </w:r>
+      <w:r>
+        <w:fldChar w:fldCharType="begin"/>
+      </w:r>
+      <w:r>
+        <w:instrText xml:space="preserve"> SEQ Figure \* ARABIC \s 1 </w:instrText>
+      </w:r>
+      <w:r>
+        <w:fldChar w:fldCharType="separate"/>
+      </w:r>
+      <w:r>
+        <w:rPr>
+          <w:noProof/>
+        </w:rPr>
+        <w:t>6</w:t>
+      </w:r>
+      <w:r>
+        <w:fldChar w:fldCharType="end"/>
+      </w:r>
+      <w:r>
+        <w:t xml:space="preserve"> Filtering with a Stride of 1</w:t>
+      </w:r>
+    </w:p>
+    <w:p>
+      <w:pPr>
+        <w:pStyle w:val="Heading3"/>
+      </w:pPr>
+      <w:r>
+        <w:t>Padding in Convolution Neural Networks</w:t>
+      </w:r>
+    </w:p>
+    <w:p>
+      <w:pPr>
+        <w:pStyle w:val="Caption"/>
+        <w:spacing w:before="0"/>
+        <w:rPr>
+          <w:rFonts w:ascii="Times New Roman" w:hAnsi="Times New Roman" w:cs="Times New Roman"/>
+          <w:i w:val="0"/>
+          <w:iCs w:val="0"/>
+          <w:lang w:val="en-KE"/>
+        </w:rPr>
+      </w:pPr>
+    </w:p>
+    <w:p>
+      <w:pPr>
+        <w:pStyle w:val="BodyText"/>
+        <w:spacing w:line="480" w:lineRule="auto"/>
+        <w:rPr>
+          <w:rFonts w:ascii="Times New Roman" w:hAnsi="Times New Roman" w:cs="Times New Roman"/>
+          <w:lang w:val="en-KE"/>
+        </w:rPr>
+      </w:pPr>
+    </w:p>
+    <w:p>
+      <w:pPr>
+        <w:pStyle w:val="BodyText"/>
         <w:spacing w:line="480" w:lineRule="auto"/>
         <w:rPr>
           <w:rFonts w:ascii="Times New Roman" w:hAnsi="Times New Roman" w:cs="Times New Roman"/>
@@ -28484,21 +29448,7 @@
         <w:rPr>
           <w:rFonts w:ascii="Times New Roman" w:hAnsi="Times New Roman" w:cs="Times New Roman"/>
         </w:rPr>
-        <w:t xml:space="preserve">Hinton, E. G., Osindero, O., and Teh, Y. (2006). A </w:t>
-      </w:r>
-      <w:proofErr w:type="gramStart"/>
-      <w:r>
-        <w:rPr>
-          <w:rFonts w:ascii="Times New Roman" w:hAnsi="Times New Roman" w:cs="Times New Roman"/>
-        </w:rPr>
-        <w:t>Fast Learning</w:t>
-      </w:r>
-      <w:proofErr w:type="gramEnd"/>
-      <w:r>
-        <w:rPr>
-          <w:rFonts w:ascii="Times New Roman" w:hAnsi="Times New Roman" w:cs="Times New Roman"/>
-        </w:rPr>
-        <w:t xml:space="preserve"> Algorithm for Deep Belief Nets. </w:t>
+        <w:t xml:space="preserve">Hinton, E. G., Osindero, O., and Teh, Y. (2006). A Fast Learning Algorithm for Deep Belief Nets. </w:t>
       </w:r>
     </w:p>
     <w:p>
@@ -28659,6 +29609,9 @@
       <w:pPr>
         <w:spacing w:line="480" w:lineRule="auto"/>
         <w:ind w:firstLine="709"/>
+        <w:rPr>
+          <w:rFonts w:ascii="Times New Roman" w:hAnsi="Times New Roman" w:cs="Times New Roman"/>
+        </w:rPr>
       </w:pPr>
       <w:r>
         <w:rPr>
@@ -28672,6 +29625,70 @@
           <w:rFonts w:ascii="Times New Roman" w:hAnsi="Times New Roman" w:cs="Times New Roman"/>
         </w:rPr>
         <w:t>, 6(14): 273-27.</w:t>
+      </w:r>
+    </w:p>
+    <w:p>
+      <w:pPr>
+        <w:spacing w:line="480" w:lineRule="auto"/>
+        <w:rPr>
+          <w:rFonts w:ascii="Times New Roman" w:hAnsi="Times New Roman" w:cs="Times New Roman"/>
+        </w:rPr>
+      </w:pPr>
+      <w:r>
+        <w:rPr>
+          <w:rFonts w:ascii="Times New Roman" w:hAnsi="Times New Roman" w:cs="Times New Roman"/>
+        </w:rPr>
+        <w:t xml:space="preserve">Koo, H. J., Cho, W. S., Baek, R. N., Kim, C. M., and Park, R. K. (2018). </w:t>
+      </w:r>
+      <w:r>
+        <w:rPr>
+          <w:rFonts w:ascii="Times New Roman" w:hAnsi="Times New Roman" w:cs="Times New Roman"/>
+        </w:rPr>
+        <w:t xml:space="preserve">CNN-Based Multimodal </w:t>
+      </w:r>
+    </w:p>
+    <w:p>
+      <w:pPr>
+        <w:spacing w:line="480" w:lineRule="auto"/>
+        <w:ind w:firstLine="720"/>
+      </w:pPr>
+      <w:r>
+        <w:rPr>
+          <w:rFonts w:ascii="Times New Roman" w:hAnsi="Times New Roman" w:cs="Times New Roman"/>
+        </w:rPr>
+        <w:t>Human Recognition in</w:t>
+      </w:r>
+      <w:r>
+        <w:rPr>
+          <w:rFonts w:ascii="Times New Roman" w:hAnsi="Times New Roman" w:cs="Times New Roman"/>
+        </w:rPr>
+        <w:t xml:space="preserve"> </w:t>
+      </w:r>
+      <w:r>
+        <w:rPr>
+          <w:rFonts w:ascii="Times New Roman" w:hAnsi="Times New Roman" w:cs="Times New Roman"/>
+        </w:rPr>
+        <w:t>Surveillance Environments</w:t>
+      </w:r>
+      <w:r>
+        <w:rPr>
+          <w:rFonts w:ascii="Times New Roman" w:hAnsi="Times New Roman" w:cs="Times New Roman"/>
+        </w:rPr>
+        <w:t xml:space="preserve">. </w:t>
+      </w:r>
+      <w:r>
+        <w:rPr>
+          <w:rFonts w:ascii="Times New Roman" w:hAnsi="Times New Roman" w:cs="Times New Roman"/>
+          <w:i/>
+          <w:iCs/>
+        </w:rPr>
+        <w:t>Sensors 18</w:t>
+      </w:r>
+      <w:r>
+        <w:rPr>
+          <w:rFonts w:ascii="Times New Roman" w:hAnsi="Times New Roman" w:cs="Times New Roman"/>
+        </w:rPr>
+        <w:t>(3040): 2-34</w:t>
       </w:r>
     </w:p>
     <w:p>
@@ -28688,6 +29705,7 @@
         <w:ind w:left="720"/>
       </w:pPr>
       <w:r>
+        <w:lastRenderedPageBreak/>
         <w:t xml:space="preserve">International Conference on Smart Engineering for Renewable Energy Technologies (n.p.). Rajapalayam, India. https://doi.org/10.1051/e3sconf/202338705001. </w:t>
       </w:r>
       <w:r>
@@ -28706,7 +29724,6 @@
         <w:rPr>
           <w:rFonts w:ascii="Times New Roman" w:hAnsi="Times New Roman" w:cs="Times New Roman"/>
         </w:rPr>
-        <w:lastRenderedPageBreak/>
         <w:t xml:space="preserve">Nguyen, A.D., Choi, S., Kim, W., Ahn, S., Kim, J., &amp; Lee, S. (2019). Distribution Padding in </w:t>
       </w:r>
       <w:r>
@@ -29058,6 +30075,7 @@
         <w:rPr>
           <w:rFonts w:ascii="Times New Roman" w:hAnsi="Times New Roman" w:cs="Times New Roman"/>
         </w:rPr>
+        <w:lastRenderedPageBreak/>
         <w:t xml:space="preserve">Identity Threats: Challenges and Opportunities. </w:t>
       </w:r>
       <w:r>
@@ -29100,7 +30118,6 @@
         <w:rPr>
           <w:i/>
         </w:rPr>
-        <w:lastRenderedPageBreak/>
         <w:t>Exponential Linear Unit</w:t>
       </w:r>
       <w:r>
@@ -29493,6 +30510,7 @@
         <w:rPr>
           <w:rFonts w:ascii="Times New Roman" w:hAnsi="Times New Roman" w:cs="Times New Roman"/>
         </w:rPr>
+        <w:lastRenderedPageBreak/>
         <w:t xml:space="preserve">Tang, H., Ortis, A., &amp; Battiato, S. (2019). The Impact of Padding on Image Classification by </w:t>
       </w:r>
       <w:r>
@@ -29513,7 +30531,6 @@
         <w:rPr>
           <w:rFonts w:ascii="Times New Roman" w:hAnsi="Times New Roman" w:cs="Times New Roman"/>
         </w:rPr>
-        <w:lastRenderedPageBreak/>
         <w:tab/>
         <w:t xml:space="preserve">Lanz, S. Messelodi, &amp; N. Sebe (Eds.), </w:t>
       </w:r>
@@ -29863,6 +30880,7 @@
         <w:rPr>
           <w:rFonts w:ascii="Times New Roman" w:hAnsi="Times New Roman" w:cs="Times New Roman"/>
         </w:rPr>
+        <w:lastRenderedPageBreak/>
         <w:t xml:space="preserve">Quantization Histogram Features. </w:t>
       </w:r>
       <w:r>
@@ -29906,7 +30924,6 @@
           <w:rFonts w:ascii="Times New Roman" w:hAnsi="Times New Roman" w:cs="Times New Roman"/>
           <w:i/>
         </w:rPr>
-        <w:lastRenderedPageBreak/>
         <w:tab/>
         <w:t>Transactions on Pattern Analysis and Machine Intelligence</w:t>
       </w:r>
@@ -36808,7 +37825,7 @@
       </w:pPr>
     </w:p>
     <w:sectPr>
-      <w:footerReference w:type="default" r:id="rId20"/>
+      <w:footerReference w:type="default" r:id="rId23"/>
       <w:pgSz w:w="11906" w:h="16838"/>
       <w:pgMar w:top="1134" w:right="1134" w:bottom="1693" w:left="1134" w:header="0" w:footer="1134" w:gutter="0"/>
       <w:pgNumType w:start="1"/>
@@ -38449,7 +39466,6 @@
   <w:style w:type="character" w:default="1" w:styleId="DefaultParagraphFont">
     <w:name w:val="Default Paragraph Font"/>
     <w:uiPriority w:val="1"/>
-    <w:semiHidden/>
     <w:unhideWhenUsed/>
   </w:style>
   <w:style w:type="table" w:default="1" w:styleId="TableNormal">

</xml_diff>